<commit_message>
Document incremental translation update workflow
</commit_message>
<xml_diff>
--- a/docs/guides/Delphi App Translation Studio Setup Wizard Guide.docx
+++ b/docs/guides/Delphi App Translation Studio Setup Wizard Guide.docx
@@ -191,7 +191,7 @@
         </w:rPr>
         <w:t>Version 1.0</w:t>
         <w:br/>
-        <w:t>Last changed: August 10, 2026</w:t>
+        <w:t>Last changed: August 11, 2026</w:t>
         <w:br/>
         <w:t>Windows • Delphi VCL and FireMonkey • Win32 and Win64</w:t>
       </w:r>
@@ -240,7 +240,7 @@
             </w:rPr>
             <w:fldChar w:fldCharType="separate"/>
           </w:r>
-          <w:hyperlink w:anchor="__RefHeading___Toc2410_2263633017" w:tooltip="1. Purpose and Expected Result">
+          <w:hyperlink w:anchor="__RefHeading___Toc4903_3806694461" w:tooltip="1. Purpose and Expected Result">
             <w:r>
               <w:rPr>
                 <w:rStyle w:val="IndexLink"/>
@@ -261,7 +261,7 @@
             </w:tabs>
             <w:rPr/>
           </w:pPr>
-          <w:hyperlink w:anchor="__RefHeading___Toc2412_2263633017" w:tooltip="2. Prepare Before Starting">
+          <w:hyperlink w:anchor="__RefHeading___Toc4905_3806694461" w:tooltip="2. Prepare Before Starting">
             <w:r>
               <w:rPr>
                 <w:rStyle w:val="IndexLink"/>
@@ -282,7 +282,7 @@
             </w:tabs>
             <w:rPr/>
           </w:pPr>
-          <w:hyperlink w:anchor="__RefHeading___Toc2414_2263633017" w:tooltip="3. Start and Navigate the Setup Wizard">
+          <w:hyperlink w:anchor="__RefHeading___Toc4907_3806694461" w:tooltip="3. Start and Navigate the Setup Wizard">
             <w:r>
               <w:rPr>
                 <w:rStyle w:val="IndexLink"/>
@@ -303,7 +303,7 @@
             </w:tabs>
             <w:rPr/>
           </w:pPr>
-          <w:hyperlink w:anchor="__RefHeading___Toc2416_2263633017" w:tooltip="4. Complete the Eight Wizard Steps">
+          <w:hyperlink w:anchor="__RefHeading___Toc4909_3806694461" w:tooltip="4. Complete the Eight Wizard Steps">
             <w:r>
               <w:rPr>
                 <w:rStyle w:val="IndexLink"/>
@@ -324,7 +324,7 @@
             </w:tabs>
             <w:rPr/>
           </w:pPr>
-          <w:hyperlink w:anchor="__RefHeading___Toc2418_2263633017" w:tooltip="4.1 Step 1 - Welcome">
+          <w:hyperlink w:anchor="__RefHeading___Toc4911_3806694461" w:tooltip="4.1 Step 1 - Welcome">
             <w:r>
               <w:rPr>
                 <w:rStyle w:val="IndexLink"/>
@@ -345,7 +345,7 @@
             </w:tabs>
             <w:rPr/>
           </w:pPr>
-          <w:hyperlink w:anchor="__RefHeading___Toc2420_2263633017" w:tooltip="4.2 Step 2 - Delphi Project">
+          <w:hyperlink w:anchor="__RefHeading___Toc4913_3806694461" w:tooltip="4.2 Step 2 - Delphi Project">
             <w:r>
               <w:rPr>
                 <w:rStyle w:val="IndexLink"/>
@@ -366,7 +366,7 @@
             </w:tabs>
             <w:rPr/>
           </w:pPr>
-          <w:hyperlink w:anchor="__RefHeading___Toc2422_2263633017" w:tooltip="4.3 Step 3 - Languages">
+          <w:hyperlink w:anchor="__RefHeading___Toc4915_3806694461" w:tooltip="4.3 Step 3 - Languages">
             <w:r>
               <w:rPr>
                 <w:rStyle w:val="IndexLink"/>
@@ -387,7 +387,7 @@
             </w:tabs>
             <w:rPr/>
           </w:pPr>
-          <w:hyperlink w:anchor="__RefHeading___Toc2424_2263633017" w:tooltip="4.4 Step 4 - Translation Service">
+          <w:hyperlink w:anchor="__RefHeading___Toc4917_3806694461" w:tooltip="4.4 Step 4 - Translation Service">
             <w:r>
               <w:rPr>
                 <w:rStyle w:val="IndexLink"/>
@@ -408,7 +408,7 @@
             </w:tabs>
             <w:rPr/>
           </w:pPr>
-          <w:hyperlink w:anchor="__RefHeading___Toc2426_2263633017" w:tooltip="4.5 Step 5 - Scan Project">
+          <w:hyperlink w:anchor="__RefHeading___Toc4919_3806694461" w:tooltip="4.5 Step 5 - Scan Project">
             <w:r>
               <w:rPr>
                 <w:rStyle w:val="IndexLink"/>
@@ -429,7 +429,7 @@
             </w:tabs>
             <w:rPr/>
           </w:pPr>
-          <w:hyperlink w:anchor="__RefHeading___Toc2428_2263633017" w:tooltip="4.6 Step 6 - Delphi Component">
+          <w:hyperlink w:anchor="__RefHeading___Toc4921_3806694461" w:tooltip="4.6 Step 6 - Delphi Component">
             <w:r>
               <w:rPr>
                 <w:rStyle w:val="IndexLink"/>
@@ -450,7 +450,7 @@
             </w:tabs>
             <w:rPr/>
           </w:pPr>
-          <w:hyperlink w:anchor="__RefHeading___Toc2430_2263633017" w:tooltip="4.7 Step 7 - Review and Authorize">
+          <w:hyperlink w:anchor="__RefHeading___Toc4923_3806694461" w:tooltip="4.7 Step 7 - Review and Authorize">
             <w:r>
               <w:rPr>
                 <w:rStyle w:val="IndexLink"/>
@@ -471,7 +471,7 @@
             </w:tabs>
             <w:rPr/>
           </w:pPr>
-          <w:hyperlink w:anchor="__RefHeading___Toc2432_2263633017" w:tooltip="4.8 Step 8 - Process and Finish">
+          <w:hyperlink w:anchor="__RefHeading___Toc4925_3806694461" w:tooltip="4.8 Step 8 - Process and Finish">
             <w:r>
               <w:rPr>
                 <w:rStyle w:val="IndexLink"/>
@@ -492,7 +492,7 @@
             </w:tabs>
             <w:rPr/>
           </w:pPr>
-          <w:hyperlink w:anchor="__RefHeading___Toc2434_2263633017" w:tooltip="5. Complete the Manual RAD Studio Step">
+          <w:hyperlink w:anchor="__RefHeading___Toc4927_3806694461" w:tooltip="5. Complete the Manual RAD Studio Step">
             <w:r>
               <w:rPr>
                 <w:rStyle w:val="IndexLink"/>
@@ -513,7 +513,7 @@
             </w:tabs>
             <w:rPr/>
           </w:pPr>
-          <w:hyperlink w:anchor="__RefHeading___Toc2436_2263633017" w:tooltip="5.1 Install the Design Package">
+          <w:hyperlink w:anchor="__RefHeading___Toc4929_3806694461" w:tooltip="5.1 Install the Design Package">
             <w:r>
               <w:rPr>
                 <w:rStyle w:val="IndexLink"/>
@@ -534,7 +534,7 @@
             </w:tabs>
             <w:rPr/>
           </w:pPr>
-          <w:hyperlink w:anchor="__RefHeading___Toc2438_2263633017" w:tooltip="5.2 Place and Configure the Components">
+          <w:hyperlink w:anchor="__RefHeading___Toc4931_3806694461" w:tooltip="5.2 Place and Configure the Components">
             <w:r>
               <w:rPr>
                 <w:rStyle w:val="IndexLink"/>
@@ -555,7 +555,7 @@
             </w:tabs>
             <w:rPr/>
           </w:pPr>
-          <w:hyperlink w:anchor="__RefHeading___Toc2440_2263633017" w:tooltip="5.3 Verify the Automatic Search Path">
+          <w:hyperlink w:anchor="__RefHeading___Toc4933_3806694461" w:tooltip="5.3 Verify the Automatic Search Path">
             <w:r>
               <w:rPr>
                 <w:rStyle w:val="IndexLink"/>
@@ -576,7 +576,7 @@
             </w:tabs>
             <w:rPr/>
           </w:pPr>
-          <w:hyperlink w:anchor="__RefHeading___Toc2442_2263633017" w:tooltip="6. Build and Deploy the Language Packs">
+          <w:hyperlink w:anchor="__RefHeading___Toc4935_3806694461" w:tooltip="6. Build and Deploy the Language Packs">
             <w:r>
               <w:rPr>
                 <w:rStyle w:val="IndexLink"/>
@@ -597,7 +597,7 @@
             </w:tabs>
             <w:rPr/>
           </w:pPr>
-          <w:hyperlink w:anchor="__RefHeading___Toc2444_2263633017" w:tooltip="7. Verify the Translated Application">
+          <w:hyperlink w:anchor="__RefHeading___Toc4937_3806694461" w:tooltip="7. Verify the Translated Application">
             <w:r>
               <w:rPr>
                 <w:rStyle w:val="IndexLink"/>
@@ -618,7 +618,7 @@
             </w:tabs>
             <w:rPr/>
           </w:pPr>
-          <w:hyperlink w:anchor="__RefHeading___Toc2446_2263633017" w:tooltip="8. Files Created by the Wizard">
+          <w:hyperlink w:anchor="__RefHeading___Toc4939_3806694461" w:tooltip="8. Files Created by the Wizard">
             <w:r>
               <w:rPr>
                 <w:rStyle w:val="IndexLink"/>
@@ -639,13 +639,13 @@
             </w:tabs>
             <w:rPr/>
           </w:pPr>
-          <w:hyperlink w:anchor="__RefHeading___Toc2448_2263633017" w:tooltip="9. Repeat, Resume, or Add Another Language">
+          <w:hyperlink w:anchor="__RefHeading___Toc4941_3806694461" w:tooltip="9. Update, Resume, or Add Another Language">
             <w:r>
               <w:rPr>
                 <w:rStyle w:val="IndexLink"/>
                 <w:webHidden/>
               </w:rPr>
-              <w:t>9. Repeat, Resume, or Add Another Language</w:t>
+              <w:t>9. Update, Resume, or Add Another Language</w:t>
               <w:tab/>
               <w:t>10</w:t>
             </w:r>
@@ -653,20 +653,41 @@
         </w:p>
         <w:p>
           <w:pPr>
-            <w:pStyle w:val="TOC1"/>
+            <w:pStyle w:val="TOC2"/>
             <w:tabs>
-              <w:tab w:val="clear" w:pos="9360"/>
+              <w:tab w:val="clear" w:pos="9077"/>
               <w:tab w:val="right" w:pos="9359" w:leader="dot"/>
             </w:tabs>
             <w:rPr/>
           </w:pPr>
-          <w:hyperlink w:anchor="__RefHeading___Toc2450_2263633017" w:tooltip="10. Troubleshooting">
+          <w:hyperlink w:anchor="__RefHeading___Toc4943_3806694461" w:tooltip="9.1 Update an Existing Translation After UI or Text Changes">
             <w:r>
               <w:rPr>
                 <w:rStyle w:val="IndexLink"/>
                 <w:webHidden/>
               </w:rPr>
-              <w:t>10. Troubleshooting</w:t>
+              <w:t>9.1 Update an Existing Translation After UI or Text Changes</w:t>
+              <w:tab/>
+              <w:t>10</w:t>
+            </w:r>
+          </w:hyperlink>
+        </w:p>
+        <w:p>
+          <w:pPr>
+            <w:pStyle w:val="TOC2"/>
+            <w:tabs>
+              <w:tab w:val="clear" w:pos="9077"/>
+              <w:tab w:val="right" w:pos="9359" w:leader="dot"/>
+            </w:tabs>
+            <w:rPr/>
+          </w:pPr>
+          <w:hyperlink w:anchor="__RefHeading___Toc4945_3806694461" w:tooltip="9.2 What the Wizard Repeats Automatically">
+            <w:r>
+              <w:rPr>
+                <w:rStyle w:val="IndexLink"/>
+                <w:webHidden/>
+              </w:rPr>
+              <w:t>9.2 What the Wizard Repeats Automatically</w:t>
               <w:tab/>
               <w:t>11</w:t>
             </w:r>
@@ -681,15 +702,36 @@
             </w:tabs>
             <w:rPr/>
           </w:pPr>
-          <w:hyperlink w:anchor="__RefHeading___Toc2452_2263633017" w:tooltip="11. Where to Learn More">
+          <w:hyperlink w:anchor="__RefHeading___Toc4947_3806694461" w:tooltip="10. Troubleshooting">
             <w:r>
               <w:rPr>
                 <w:rStyle w:val="IndexLink"/>
                 <w:webHidden/>
               </w:rPr>
+              <w:t>10. Troubleshooting</w:t>
+              <w:tab/>
+              <w:t>12</w:t>
+            </w:r>
+          </w:hyperlink>
+        </w:p>
+        <w:p>
+          <w:pPr>
+            <w:pStyle w:val="TOC1"/>
+            <w:tabs>
+              <w:tab w:val="clear" w:pos="9360"/>
+              <w:tab w:val="right" w:pos="9359" w:leader="dot"/>
+            </w:tabs>
+            <w:rPr/>
+          </w:pPr>
+          <w:hyperlink w:anchor="__RefHeading___Toc4949_3806694461" w:tooltip="11. Where to Learn More">
+            <w:r>
+              <w:rPr>
+                <w:rStyle w:val="IndexLink"/>
+                <w:webHidden/>
+              </w:rPr>
               <w:t>11. Where to Learn More</w:t>
               <w:tab/>
-              <w:t>12</w:t>
+              <w:t>13</w:t>
             </w:r>
           </w:hyperlink>
           <w:r>
@@ -725,7 +767,7 @@
         <w:pStyle w:val="Heading1"/>
         <w:rPr/>
       </w:pPr>
-      <w:bookmarkStart w:id="0" w:name="__RefHeading___Toc2410_2263633017"/>
+      <w:bookmarkStart w:id="0" w:name="__RefHeading___Toc4903_3806694461"/>
       <w:bookmarkEnd w:id="0"/>
       <w:r>
         <w:rPr/>
@@ -818,7 +860,7 @@
         <w:pStyle w:val="Heading1"/>
         <w:rPr/>
       </w:pPr>
-      <w:bookmarkStart w:id="1" w:name="__RefHeading___Toc2412_2263633017"/>
+      <w:bookmarkStart w:id="1" w:name="__RefHeading___Toc4905_3806694461"/>
       <w:bookmarkEnd w:id="1"/>
       <w:r>
         <w:rPr/>
@@ -1615,7 +1657,7 @@
         <w:pStyle w:val="ListNumber"/>
         <w:numPr>
           <w:ilvl w:val="0"/>
-          <w:numId w:val="22"/>
+          <w:numId w:val="23"/>
         </w:numPr>
         <w:rPr/>
       </w:pPr>
@@ -1671,7 +1713,7 @@
         <w:pStyle w:val="Heading1"/>
         <w:rPr/>
       </w:pPr>
-      <w:bookmarkStart w:id="2" w:name="__RefHeading___Toc2414_2263633017"/>
+      <w:bookmarkStart w:id="2" w:name="__RefHeading___Toc4907_3806694461"/>
       <w:bookmarkEnd w:id="2"/>
       <w:r>
         <w:rPr/>
@@ -1683,7 +1725,7 @@
         <w:pStyle w:val="ListNumber"/>
         <w:numPr>
           <w:ilvl w:val="0"/>
-          <w:numId w:val="23"/>
+          <w:numId w:val="24"/>
         </w:numPr>
         <w:rPr/>
       </w:pPr>
@@ -2325,7 +2367,7 @@
         <w:pStyle w:val="Heading1"/>
         <w:rPr/>
       </w:pPr>
-      <w:bookmarkStart w:id="3" w:name="__RefHeading___Toc2416_2263633017"/>
+      <w:bookmarkStart w:id="3" w:name="__RefHeading___Toc4909_3806694461"/>
       <w:bookmarkEnd w:id="3"/>
       <w:r>
         <w:rPr/>
@@ -2337,7 +2379,7 @@
         <w:pStyle w:val="Heading2"/>
         <w:rPr/>
       </w:pPr>
-      <w:bookmarkStart w:id="4" w:name="__RefHeading___Toc2418_2263633017"/>
+      <w:bookmarkStart w:id="4" w:name="__RefHeading___Toc4911_3806694461"/>
       <w:bookmarkEnd w:id="4"/>
       <w:r>
         <w:rPr/>
@@ -2359,7 +2401,7 @@
         <w:pStyle w:val="ListNumber"/>
         <w:numPr>
           <w:ilvl w:val="0"/>
-          <w:numId w:val="24"/>
+          <w:numId w:val="25"/>
         </w:numPr>
         <w:rPr/>
       </w:pPr>
@@ -2438,7 +2480,7 @@
         <w:pStyle w:val="Heading2"/>
         <w:rPr/>
       </w:pPr>
-      <w:bookmarkStart w:id="5" w:name="__RefHeading___Toc2420_2263633017"/>
+      <w:bookmarkStart w:id="5" w:name="__RefHeading___Toc4913_3806694461"/>
       <w:bookmarkEnd w:id="5"/>
       <w:r>
         <w:rPr/>
@@ -2460,7 +2502,7 @@
         <w:pStyle w:val="ListNumber"/>
         <w:numPr>
           <w:ilvl w:val="0"/>
-          <w:numId w:val="25"/>
+          <w:numId w:val="26"/>
         </w:numPr>
         <w:rPr/>
       </w:pPr>
@@ -2595,7 +2637,7 @@
         <w:pStyle w:val="Heading2"/>
         <w:rPr/>
       </w:pPr>
-      <w:bookmarkStart w:id="6" w:name="__RefHeading___Toc2422_2263633017"/>
+      <w:bookmarkStart w:id="6" w:name="__RefHeading___Toc4915_3806694461"/>
       <w:bookmarkEnd w:id="6"/>
       <w:r>
         <w:rPr/>
@@ -2617,7 +2659,7 @@
         <w:pStyle w:val="ListNumber"/>
         <w:numPr>
           <w:ilvl w:val="0"/>
-          <w:numId w:val="26"/>
+          <w:numId w:val="27"/>
         </w:numPr>
         <w:rPr/>
       </w:pPr>
@@ -2724,7 +2766,7 @@
         <w:pStyle w:val="Heading2"/>
         <w:rPr/>
       </w:pPr>
-      <w:bookmarkStart w:id="7" w:name="__RefHeading___Toc2424_2263633017"/>
+      <w:bookmarkStart w:id="7" w:name="__RefHeading___Toc4917_3806694461"/>
       <w:bookmarkEnd w:id="7"/>
       <w:r>
         <w:rPr/>
@@ -2746,7 +2788,7 @@
         <w:pStyle w:val="ListNumber"/>
         <w:numPr>
           <w:ilvl w:val="0"/>
-          <w:numId w:val="27"/>
+          <w:numId w:val="28"/>
         </w:numPr>
         <w:rPr/>
       </w:pPr>
@@ -2881,7 +2923,7 @@
         <w:pStyle w:val="Heading2"/>
         <w:rPr/>
       </w:pPr>
-      <w:bookmarkStart w:id="8" w:name="__RefHeading___Toc2426_2263633017"/>
+      <w:bookmarkStart w:id="8" w:name="__RefHeading___Toc4919_3806694461"/>
       <w:bookmarkEnd w:id="8"/>
       <w:r>
         <w:rPr/>
@@ -2913,7 +2955,7 @@
         <w:pStyle w:val="ListNumber"/>
         <w:numPr>
           <w:ilvl w:val="0"/>
-          <w:numId w:val="28"/>
+          <w:numId w:val="29"/>
         </w:numPr>
         <w:rPr/>
       </w:pPr>
@@ -3034,7 +3076,7 @@
         <w:pStyle w:val="Heading2"/>
         <w:rPr/>
       </w:pPr>
-      <w:bookmarkStart w:id="9" w:name="__RefHeading___Toc2428_2263633017"/>
+      <w:bookmarkStart w:id="9" w:name="__RefHeading___Toc4921_3806694461"/>
       <w:bookmarkEnd w:id="9"/>
       <w:r>
         <w:rPr/>
@@ -3056,7 +3098,7 @@
         <w:pStyle w:val="ListNumber"/>
         <w:numPr>
           <w:ilvl w:val="0"/>
-          <w:numId w:val="29"/>
+          <w:numId w:val="30"/>
         </w:numPr>
         <w:rPr/>
       </w:pPr>
@@ -3163,7 +3205,7 @@
         <w:pStyle w:val="Heading2"/>
         <w:rPr/>
       </w:pPr>
-      <w:bookmarkStart w:id="10" w:name="__RefHeading___Toc2430_2263633017"/>
+      <w:bookmarkStart w:id="10" w:name="__RefHeading___Toc4923_3806694461"/>
       <w:bookmarkEnd w:id="10"/>
       <w:r>
         <w:rPr/>
@@ -3185,7 +3227,7 @@
         <w:pStyle w:val="ListNumber"/>
         <w:numPr>
           <w:ilvl w:val="0"/>
-          <w:numId w:val="30"/>
+          <w:numId w:val="31"/>
         </w:numPr>
         <w:rPr/>
       </w:pPr>
@@ -3334,7 +3376,7 @@
         <w:pStyle w:val="Heading2"/>
         <w:rPr/>
       </w:pPr>
-      <w:bookmarkStart w:id="11" w:name="__RefHeading___Toc2432_2263633017"/>
+      <w:bookmarkStart w:id="11" w:name="__RefHeading___Toc4925_3806694461"/>
       <w:bookmarkEnd w:id="11"/>
       <w:r>
         <w:rPr/>
@@ -3366,7 +3408,7 @@
         <w:pStyle w:val="ListNumber"/>
         <w:numPr>
           <w:ilvl w:val="0"/>
-          <w:numId w:val="31"/>
+          <w:numId w:val="32"/>
         </w:numPr>
         <w:rPr/>
       </w:pPr>
@@ -3515,7 +3557,7 @@
         <w:pStyle w:val="Heading1"/>
         <w:rPr/>
       </w:pPr>
-      <w:bookmarkStart w:id="12" w:name="__RefHeading___Toc2434_2263633017"/>
+      <w:bookmarkStart w:id="12" w:name="__RefHeading___Toc4927_3806694461"/>
       <w:bookmarkEnd w:id="12"/>
       <w:r>
         <w:rPr/>
@@ -3537,7 +3579,7 @@
         <w:pStyle w:val="Heading2"/>
         <w:rPr/>
       </w:pPr>
-      <w:bookmarkStart w:id="13" w:name="__RefHeading___Toc2436_2263633017"/>
+      <w:bookmarkStart w:id="13" w:name="__RefHeading___Toc4929_3806694461"/>
       <w:bookmarkEnd w:id="13"/>
       <w:r>
         <w:rPr/>
@@ -3549,7 +3591,7 @@
         <w:pStyle w:val="ListNumber"/>
         <w:numPr>
           <w:ilvl w:val="0"/>
-          <w:numId w:val="32"/>
+          <w:numId w:val="33"/>
         </w:numPr>
         <w:rPr/>
       </w:pPr>
@@ -3684,7 +3726,7 @@
         <w:pStyle w:val="Heading2"/>
         <w:rPr/>
       </w:pPr>
-      <w:bookmarkStart w:id="14" w:name="__RefHeading___Toc2438_2263633017"/>
+      <w:bookmarkStart w:id="14" w:name="__RefHeading___Toc4931_3806694461"/>
       <w:bookmarkEnd w:id="14"/>
       <w:r>
         <w:rPr/>
@@ -3696,7 +3738,7 @@
         <w:pStyle w:val="ListNumber"/>
         <w:numPr>
           <w:ilvl w:val="0"/>
-          <w:numId w:val="33"/>
+          <w:numId w:val="34"/>
         </w:numPr>
         <w:rPr/>
       </w:pPr>
@@ -3794,7 +3836,7 @@
         <w:pStyle w:val="Heading2"/>
         <w:rPr/>
       </w:pPr>
-      <w:bookmarkStart w:id="15" w:name="__RefHeading___Toc2440_2263633017"/>
+      <w:bookmarkStart w:id="15" w:name="__RefHeading___Toc4933_3806694461"/>
       <w:bookmarkEnd w:id="15"/>
       <w:r>
         <w:rPr/>
@@ -3877,7 +3919,7 @@
         <w:pStyle w:val="Heading1"/>
         <w:rPr/>
       </w:pPr>
-      <w:bookmarkStart w:id="16" w:name="__RefHeading___Toc2442_2263633017"/>
+      <w:bookmarkStart w:id="16" w:name="__RefHeading___Toc4935_3806694461"/>
       <w:bookmarkEnd w:id="16"/>
       <w:r>
         <w:rPr/>
@@ -3899,7 +3941,7 @@
         <w:pStyle w:val="ListNumber"/>
         <w:numPr>
           <w:ilvl w:val="0"/>
-          <w:numId w:val="34"/>
+          <w:numId w:val="35"/>
         </w:numPr>
         <w:rPr/>
       </w:pPr>
@@ -4020,7 +4062,7 @@
         <w:pStyle w:val="Heading1"/>
         <w:rPr/>
       </w:pPr>
-      <w:bookmarkStart w:id="17" w:name="__RefHeading___Toc2444_2263633017"/>
+      <w:bookmarkStart w:id="17" w:name="__RefHeading___Toc4937_3806694461"/>
       <w:bookmarkEnd w:id="17"/>
       <w:r>
         <w:rPr/>
@@ -4032,7 +4074,7 @@
         <w:pStyle w:val="ListNumber"/>
         <w:numPr>
           <w:ilvl w:val="0"/>
-          <w:numId w:val="35"/>
+          <w:numId w:val="36"/>
         </w:numPr>
         <w:rPr/>
       </w:pPr>
@@ -4184,7 +4226,7 @@
             </w:r>
             <w:r>
               <w:rPr/>
-              <w:t>A correct translation can be longer than its English source. If text clips, adjust the target form's wrapping, AutoSize, margins, or control dimensions in Delphi. The language pack should not guess or rewrite the application's visual design.</w:t>
+              <w:t>A correct translation can be substantially longer than its English source—20 to 50 percent growth is common for short interface phrases, and individual terms can grow more. Test every translated form at the supported window sizes. If text clips, overlaps, or loses alignment, adjust wrapping, AutoSize, margins, layout containers, or control dimensions in the target Form Designer. The language pack deliberately changes text only; it must not guess at or rewrite the application's visual design.</w:t>
             </w:r>
           </w:p>
         </w:tc>
@@ -4195,7 +4237,7 @@
         <w:pStyle w:val="Heading1"/>
         <w:rPr/>
       </w:pPr>
-      <w:bookmarkStart w:id="18" w:name="__RefHeading___Toc2446_2263633017"/>
+      <w:bookmarkStart w:id="18" w:name="__RefHeading___Toc4939_3806694461"/>
       <w:bookmarkEnd w:id="18"/>
       <w:r>
         <w:rPr/>
@@ -5060,11 +5102,218 @@
         <w:pStyle w:val="Heading1"/>
         <w:rPr/>
       </w:pPr>
-      <w:bookmarkStart w:id="19" w:name="__RefHeading___Toc2448_2263633017"/>
+      <w:bookmarkStart w:id="19" w:name="__RefHeading___Toc4941_3806694461"/>
       <w:bookmarkEnd w:id="19"/>
       <w:r>
         <w:rPr/>
-        <w:t>9. Repeat, Resume, or Add Another Language</w:t>
+        <w:t>9. Update, Resume, or Add Another Language</w:t>
+      </w:r>
+    </w:p>
+    <w:p>
+      <w:pPr>
+        <w:pStyle w:val="Heading2"/>
+        <w:rPr/>
+      </w:pPr>
+      <w:bookmarkStart w:id="20" w:name="__RefHeading___Toc4943_3806694461"/>
+      <w:bookmarkEnd w:id="20"/>
+      <w:r>
+        <w:rPr/>
+        <w:t>9.1 Update an Existing Translation After UI or Text Changes</w:t>
+      </w:r>
+    </w:p>
+    <w:p>
+      <w:pPr>
+        <w:pStyle w:val="Normal"/>
+        <w:rPr/>
+      </w:pPr>
+      <w:r>
+        <w:rPr/>
+        <w:t>Changing an existing application is normal. New labels, revised captions, renamed controls, added forms, and changed resourcestrings must be saved and rescanned before they can enter the JSON catalog. The Wizard reuses the existing catalog and preserves matching work; it does not start the language over.</w:t>
+      </w:r>
+    </w:p>
+    <w:p>
+      <w:pPr>
+        <w:pStyle w:val="Normal"/>
+        <w:rPr/>
+      </w:pPr>
+      <w:r>
+        <w:rPr/>
+        <w:t>For the fewest provider calls and the clearest review, gather related interface changes into one practical batch. A single urgent correction can still be processed by itself.</w:t>
+      </w:r>
+    </w:p>
+    <w:p>
+      <w:pPr>
+        <w:pStyle w:val="ListNumber"/>
+        <w:numPr>
+          <w:ilvl w:val="0"/>
+          <w:numId w:val="37"/>
+        </w:numPr>
+        <w:rPr/>
+      </w:pPr>
+      <w:r>
+        <w:rPr/>
+        <w:t>Make the intended UI or source-text changes in Delphi, then choose File &gt; Save All. The scanner reads saved DFM/FMX and Pascal files, not unsaved Form Designer buffers.</w:t>
+      </w:r>
+    </w:p>
+    <w:p>
+      <w:pPr>
+        <w:pStyle w:val="ListNumber"/>
+        <w:numPr>
+          <w:ilvl w:val="0"/>
+          <w:numId w:val="7"/>
+        </w:numPr>
+        <w:rPr/>
+      </w:pPr>
+      <w:r>
+        <w:rPr/>
+        <w:t>Run the current Translation Studio and start the Setup Wizard. Select the same .dproj, source language, target language, and provider used for the existing catalog.</w:t>
+      </w:r>
+    </w:p>
+    <w:p>
+      <w:pPr>
+        <w:pStyle w:val="ListNumber"/>
+        <w:numPr>
+          <w:ilvl w:val="0"/>
+          <w:numId w:val="7"/>
+        </w:numPr>
+        <w:rPr/>
+      </w:pPr>
+      <w:r>
+        <w:rPr/>
+        <w:t>Run Scan Project again. Read the new, changed, unchanged, and obsolete counts. A renamed component receives a new stable key; its former key remains Obsolete for traceability.</w:t>
+      </w:r>
+    </w:p>
+    <w:p>
+      <w:pPr>
+        <w:pStyle w:val="ListNumber"/>
+        <w:numPr>
+          <w:ilvl w:val="0"/>
+          <w:numId w:val="7"/>
+        </w:numPr>
+        <w:rPr/>
+      </w:pPr>
+      <w:r>
+        <w:rPr/>
+        <w:t>Continue to final processing. Automatic translation sends only eligible new, changed, or otherwise unresolved entries. Matching Reviewed and Approved translations are preserved.</w:t>
+      </w:r>
+    </w:p>
+    <w:p>
+      <w:pPr>
+        <w:pStyle w:val="ListNumber"/>
+        <w:numPr>
+          <w:ilvl w:val="0"/>
+          <w:numId w:val="7"/>
+        </w:numPr>
+        <w:rPr/>
+      </w:pPr>
+      <w:r>
+        <w:rPr/>
+        <w:t>If any target DFM/FMX or Pascal file is saved after the scan, final processing stops instead of exporting stale results. Return to Scan Project and scan again.</w:t>
+      </w:r>
+    </w:p>
+    <w:p>
+      <w:pPr>
+        <w:pStyle w:val="ListNumber"/>
+        <w:numPr>
+          <w:ilvl w:val="0"/>
+          <w:numId w:val="7"/>
+        </w:numPr>
+        <w:rPr/>
+      </w:pPr>
+      <w:r>
+        <w:rPr/>
+        <w:t>The already installed design package, manager, selector, and configured search path normally remain in place. Review the Delphi Component step and acknowledge the existing setup; do not add duplicate components.</w:t>
+      </w:r>
+    </w:p>
+    <w:p>
+      <w:pPr>
+        <w:pStyle w:val="ListNumber"/>
+        <w:numPr>
+          <w:ilvl w:val="0"/>
+          <w:numId w:val="7"/>
+        </w:numPr>
+        <w:rPr/>
+      </w:pPr>
+      <w:r>
+        <w:rPr/>
+        <w:t>Let final processing validate the catalog, export fresh JSON, regenerate the kit, and deploy to known build outputs. Use Deploy to App Folder again for a portable or USB copy.</w:t>
+      </w:r>
+    </w:p>
+    <w:p>
+      <w:pPr>
+        <w:pStyle w:val="ListNumber"/>
+        <w:numPr>
+          <w:ilvl w:val="0"/>
+          <w:numId w:val="7"/>
+        </w:numPr>
+        <w:rPr/>
+      </w:pPr>
+      <w:r>
+        <w:rPr/>
+        <w:t>Rebuild the target because its UI/source changed. Test every affected form in the source and target languages, including text wrapping, alignment, control state, and language persistence.</w:t>
+      </w:r>
+    </w:p>
+    <w:tbl>
+      <w:tblPr>
+        <w:tblW w:w="9360" w:type="dxa"/>
+        <w:jc w:val="center"/>
+        <w:tblInd w:w="0" w:type="dxa"/>
+        <w:tblLayout w:type="fixed"/>
+        <w:tblCellMar>
+          <w:top w:w="80" w:type="dxa"/>
+          <w:start w:w="120" w:type="dxa"/>
+          <w:bottom w:w="80" w:type="dxa"/>
+          <w:end w:w="120" w:type="dxa"/>
+        </w:tblCellMar>
+        <w:tblLook w:val="04a0" w:firstRow="1" w:noVBand="1" w:lastRow="0" w:firstColumn="1" w:lastColumn="0" w:noHBand="0"/>
+      </w:tblPr>
+      <w:tblGrid>
+        <w:gridCol w:w="9360"/>
+      </w:tblGrid>
+      <w:tr>
+        <w:trPr/>
+        <w:tc>
+          <w:tcPr>
+            <w:tcW w:w="9360" w:type="dxa"/>
+            <w:tcBorders/>
+            <w:shd w:fill="EAF3FF" w:val="clear"/>
+            <w:vAlign w:val="center"/>
+          </w:tcPr>
+          <w:p>
+            <w:pPr>
+              <w:pStyle w:val="Callout"/>
+              <w:widowControl/>
+              <w:bidi w:val="0"/>
+              <w:spacing w:lineRule="auto" w:line="276" w:before="80" w:after="120"/>
+              <w:ind w:start="288" w:end="288"/>
+              <w:jc w:val="start"/>
+              <w:rPr/>
+            </w:pPr>
+            <w:r>
+              <w:rPr>
+                <w:b/>
+                <w:color w:val="234C80"/>
+              </w:rPr>
+              <w:t xml:space="preserve">Repeatable update sequence. </w:t>
+            </w:r>
+            <w:r>
+              <w:rPr/>
+              <w:t>Batch changes -&gt; Save All -&gt; Scan -&gt; Translate unresolved -&gt; Validate -&gt; Export -&gt; Deploy -&gt; Rebuild -&gt; Test.</w:t>
+            </w:r>
+          </w:p>
+        </w:tc>
+      </w:tr>
+    </w:tbl>
+    <w:p>
+      <w:pPr>
+        <w:pStyle w:val="Heading2"/>
+        <w:rPr/>
+      </w:pPr>
+      <w:bookmarkStart w:id="21" w:name="__RefHeading___Toc4945_3806694461"/>
+      <w:bookmarkEnd w:id="21"/>
+      <w:r>
+        <w:rPr/>
+        <w:t>9.2 What the Wizard Repeats Automatically</w:t>
       </w:r>
     </w:p>
     <w:p>
@@ -5159,11 +5408,26 @@
     </w:p>
     <w:p>
       <w:pPr>
+        <w:pStyle w:val="ListBullet"/>
+        <w:numPr>
+          <w:ilvl w:val="0"/>
+          <w:numId w:val="1"/>
+        </w:numPr>
+        <w:ind w:hanging="271" w:start="540"/>
+        <w:rPr/>
+      </w:pPr>
+      <w:r>
+        <w:rPr/>
+        <w:t>The Wizard can rescan, merge, translate unresolved entries, validate, export, regenerate the component kit, configure supported project metadata, and deploy packs. It cannot save an open Delphi editor buffer, decide whether a translation is linguistically ideal, or redesign controls for longer text.</w:t>
+      </w:r>
+    </w:p>
+    <w:p>
+      <w:pPr>
         <w:pStyle w:val="Heading1"/>
         <w:rPr/>
       </w:pPr>
-      <w:bookmarkStart w:id="20" w:name="__RefHeading___Toc2450_2263633017"/>
-      <w:bookmarkEnd w:id="20"/>
+      <w:bookmarkStart w:id="22" w:name="__RefHeading___Toc4947_3806694461"/>
+      <w:bookmarkEnd w:id="22"/>
       <w:r>
         <w:rPr/>
         <w:t>10. Troubleshooting</w:t>
@@ -6076,6 +6340,7 @@
             <w:tcW w:w="1799" w:type="dxa"/>
             <w:tcBorders>
               <w:top w:val="nil"/>
+              <w:bottom w:val="nil"/>
             </w:tcBorders>
             <w:vAlign w:val="center"/>
           </w:tcPr>
@@ -6112,6 +6377,7 @@
             <w:tcW w:w="3901" w:type="dxa"/>
             <w:tcBorders>
               <w:top w:val="nil"/>
+              <w:bottom w:val="nil"/>
             </w:tcBorders>
             <w:vAlign w:val="center"/>
           </w:tcPr>
@@ -6144,6 +6410,7 @@
             <w:tcW w:w="3660" w:type="dxa"/>
             <w:tcBorders>
               <w:top w:val="nil"/>
+              <w:bottom w:val="nil"/>
             </w:tcBorders>
             <w:vAlign w:val="center"/>
           </w:tcPr>
@@ -6172,14 +6439,341 @@
           </w:p>
         </w:tc>
       </w:tr>
+      <w:tr>
+        <w:trPr>
+          <w:cantSplit/>
+        </w:trPr>
+        <w:tc>
+          <w:tcPr>
+            <w:tcW w:w="1799" w:type="dxa"/>
+            <w:tcBorders>
+              <w:top w:val="nil"/>
+              <w:bottom w:val="nil"/>
+            </w:tcBorders>
+            <w:shd w:color="auto" w:fill="D3DFEE" w:themeFill="accent1" w:themeFillTint="3f" w:val="clear"/>
+            <w:vAlign w:val="center"/>
+          </w:tcPr>
+          <w:p>
+            <w:pPr>
+              <w:pStyle w:val="Normal"/>
+              <w:widowControl/>
+              <w:spacing w:before="0" w:after="120"/>
+              <w:jc w:val="start"/>
+              <w:rPr>
+                <w:rFonts w:eastAsia="ＭＳ 明朝" w:cs=""/>
+                <w:b/>
+                <w:bCs/>
+                <w:kern w:val="0"/>
+                <w:szCs w:val="22"/>
+                <w:lang w:val="en-US" w:eastAsia="en-US" w:bidi="ar-SA"/>
+              </w:rPr>
+            </w:pPr>
+            <w:r>
+              <w:rPr>
+                <w:rFonts w:eastAsia="ＭＳ 明朝" w:cs=""/>
+                <w:b/>
+                <w:bCs/>
+                <w:kern w:val="0"/>
+                <w:szCs w:val="22"/>
+                <w:lang w:val="en-US" w:eastAsia="en-US" w:bidi="ar-SA"/>
+              </w:rPr>
+              <w:t>A newly added label is missing from the scan</w:t>
+            </w:r>
+          </w:p>
+        </w:tc>
+        <w:tc>
+          <w:tcPr>
+            <w:tcW w:w="3901" w:type="dxa"/>
+            <w:tcBorders>
+              <w:top w:val="nil"/>
+              <w:bottom w:val="nil"/>
+            </w:tcBorders>
+            <w:shd w:color="auto" w:fill="D3DFEE" w:themeFill="accent1" w:themeFillTint="3f" w:val="clear"/>
+            <w:vAlign w:val="center"/>
+          </w:tcPr>
+          <w:p>
+            <w:pPr>
+              <w:pStyle w:val="Normal"/>
+              <w:widowControl/>
+              <w:spacing w:before="0" w:after="120"/>
+              <w:jc w:val="start"/>
+              <w:rPr>
+                <w:rFonts w:eastAsia="ＭＳ 明朝" w:cs=""/>
+                <w:kern w:val="0"/>
+                <w:szCs w:val="22"/>
+                <w:lang w:val="en-US" w:eastAsia="en-US" w:bidi="ar-SA"/>
+              </w:rPr>
+            </w:pPr>
+            <w:r>
+              <w:rPr>
+                <w:rFonts w:eastAsia="ＭＳ 明朝" w:cs=""/>
+                <w:kern w:val="0"/>
+                <w:szCs w:val="22"/>
+                <w:lang w:val="en-US" w:eastAsia="en-US" w:bidi="ar-SA"/>
+              </w:rPr>
+              <w:t>The form was not saved, the wrong project/catalog is open, or the new property is not an eligible text property.</w:t>
+            </w:r>
+          </w:p>
+        </w:tc>
+        <w:tc>
+          <w:tcPr>
+            <w:tcW w:w="3660" w:type="dxa"/>
+            <w:tcBorders>
+              <w:top w:val="nil"/>
+              <w:bottom w:val="nil"/>
+            </w:tcBorders>
+            <w:shd w:color="auto" w:fill="D3DFEE" w:themeFill="accent1" w:themeFillTint="3f" w:val="clear"/>
+            <w:vAlign w:val="center"/>
+          </w:tcPr>
+          <w:p>
+            <w:pPr>
+              <w:pStyle w:val="Normal"/>
+              <w:widowControl/>
+              <w:spacing w:before="0" w:after="120"/>
+              <w:jc w:val="start"/>
+              <w:rPr>
+                <w:rFonts w:eastAsia="ＭＳ 明朝" w:cs=""/>
+                <w:kern w:val="0"/>
+                <w:szCs w:val="22"/>
+                <w:lang w:val="en-US" w:eastAsia="en-US" w:bidi="ar-SA"/>
+              </w:rPr>
+            </w:pPr>
+            <w:r>
+              <w:rPr>
+                <w:rFonts w:eastAsia="ＭＳ 明朝" w:cs=""/>
+                <w:kern w:val="0"/>
+                <w:szCs w:val="22"/>
+                <w:lang w:val="en-US" w:eastAsia="en-US" w:bidi="ar-SA"/>
+              </w:rPr>
+              <w:t>Choose File &gt; Save All in Delphi, confirm the same .dproj and target language, then rescan and inspect the entry classification.</w:t>
+            </w:r>
+          </w:p>
+        </w:tc>
+      </w:tr>
+      <w:tr>
+        <w:trPr>
+          <w:cantSplit/>
+        </w:trPr>
+        <w:tc>
+          <w:tcPr>
+            <w:tcW w:w="1799" w:type="dxa"/>
+            <w:tcBorders>
+              <w:top w:val="nil"/>
+              <w:bottom w:val="nil"/>
+            </w:tcBorders>
+            <w:vAlign w:val="center"/>
+          </w:tcPr>
+          <w:p>
+            <w:pPr>
+              <w:pStyle w:val="Normal"/>
+              <w:widowControl/>
+              <w:spacing w:before="0" w:after="120"/>
+              <w:jc w:val="start"/>
+              <w:rPr>
+                <w:rFonts w:eastAsia="ＭＳ 明朝" w:cs=""/>
+                <w:b/>
+                <w:bCs/>
+                <w:kern w:val="0"/>
+                <w:szCs w:val="22"/>
+                <w:lang w:val="en-US" w:eastAsia="en-US" w:bidi="ar-SA"/>
+              </w:rPr>
+            </w:pPr>
+            <w:r>
+              <w:rPr>
+                <w:rFonts w:eastAsia="ＭＳ 明朝" w:cs=""/>
+                <w:b/>
+                <w:bCs/>
+                <w:kern w:val="0"/>
+                <w:szCs w:val="22"/>
+                <w:lang w:val="en-US" w:eastAsia="en-US" w:bidi="ar-SA"/>
+              </w:rPr>
+              <w:t>Final processing says source was saved after the scan</w:t>
+            </w:r>
+          </w:p>
+        </w:tc>
+        <w:tc>
+          <w:tcPr>
+            <w:tcW w:w="3901" w:type="dxa"/>
+            <w:tcBorders>
+              <w:top w:val="nil"/>
+              <w:bottom w:val="nil"/>
+            </w:tcBorders>
+            <w:vAlign w:val="center"/>
+          </w:tcPr>
+          <w:p>
+            <w:pPr>
+              <w:pStyle w:val="Normal"/>
+              <w:widowControl/>
+              <w:spacing w:before="0" w:after="120"/>
+              <w:jc w:val="start"/>
+              <w:rPr>
+                <w:rFonts w:eastAsia="ＭＳ 明朝" w:cs=""/>
+                <w:kern w:val="0"/>
+                <w:szCs w:val="22"/>
+                <w:lang w:val="en-US" w:eastAsia="en-US" w:bidi="ar-SA"/>
+              </w:rPr>
+            </w:pPr>
+            <w:r>
+              <w:rPr>
+                <w:rFonts w:eastAsia="ＭＳ 明朝" w:cs=""/>
+                <w:kern w:val="0"/>
+                <w:szCs w:val="22"/>
+                <w:lang w:val="en-US" w:eastAsia="en-US" w:bidi="ar-SA"/>
+              </w:rPr>
+              <w:t>The scan snapshot is stale and exporting it could omit a recent UI or source-text change.</w:t>
+            </w:r>
+          </w:p>
+        </w:tc>
+        <w:tc>
+          <w:tcPr>
+            <w:tcW w:w="3660" w:type="dxa"/>
+            <w:tcBorders>
+              <w:top w:val="nil"/>
+              <w:bottom w:val="nil"/>
+            </w:tcBorders>
+            <w:vAlign w:val="center"/>
+          </w:tcPr>
+          <w:p>
+            <w:pPr>
+              <w:pStyle w:val="Normal"/>
+              <w:widowControl/>
+              <w:spacing w:before="0" w:after="120"/>
+              <w:jc w:val="start"/>
+              <w:rPr>
+                <w:rFonts w:eastAsia="ＭＳ 明朝" w:cs=""/>
+                <w:kern w:val="0"/>
+                <w:szCs w:val="22"/>
+                <w:lang w:val="en-US" w:eastAsia="en-US" w:bidi="ar-SA"/>
+              </w:rPr>
+            </w:pPr>
+            <w:r>
+              <w:rPr>
+                <w:rFonts w:eastAsia="ＭＳ 明朝" w:cs=""/>
+                <w:kern w:val="0"/>
+                <w:szCs w:val="22"/>
+                <w:lang w:val="en-US" w:eastAsia="en-US" w:bidi="ar-SA"/>
+              </w:rPr>
+              <w:t>Choose Save All in Delphi, return to Scan Project, scan again, and then continue. Do not bypass this safeguard.</w:t>
+            </w:r>
+          </w:p>
+        </w:tc>
+      </w:tr>
+      <w:tr>
+        <w:trPr>
+          <w:cantSplit/>
+        </w:trPr>
+        <w:tc>
+          <w:tcPr>
+            <w:tcW w:w="1799" w:type="dxa"/>
+            <w:tcBorders>
+              <w:top w:val="nil"/>
+            </w:tcBorders>
+            <w:shd w:color="auto" w:fill="D3DFEE" w:themeFill="accent1" w:themeFillTint="3f" w:val="clear"/>
+            <w:vAlign w:val="center"/>
+          </w:tcPr>
+          <w:p>
+            <w:pPr>
+              <w:pStyle w:val="Normal"/>
+              <w:widowControl/>
+              <w:spacing w:before="0" w:after="120"/>
+              <w:jc w:val="start"/>
+              <w:rPr>
+                <w:rFonts w:eastAsia="ＭＳ 明朝" w:cs=""/>
+                <w:b/>
+                <w:bCs/>
+                <w:kern w:val="0"/>
+                <w:szCs w:val="22"/>
+                <w:lang w:val="en-US" w:eastAsia="en-US" w:bidi="ar-SA"/>
+              </w:rPr>
+            </w:pPr>
+            <w:r>
+              <w:rPr>
+                <w:rFonts w:eastAsia="ＭＳ 明朝" w:cs=""/>
+                <w:b/>
+                <w:bCs/>
+                <w:kern w:val="0"/>
+                <w:szCs w:val="22"/>
+                <w:lang w:val="en-US" w:eastAsia="en-US" w:bidi="ar-SA"/>
+              </w:rPr>
+              <w:t>Translated text clips or overlaps</w:t>
+            </w:r>
+          </w:p>
+        </w:tc>
+        <w:tc>
+          <w:tcPr>
+            <w:tcW w:w="3901" w:type="dxa"/>
+            <w:tcBorders>
+              <w:top w:val="nil"/>
+            </w:tcBorders>
+            <w:shd w:color="auto" w:fill="D3DFEE" w:themeFill="accent1" w:themeFillTint="3f" w:val="clear"/>
+            <w:vAlign w:val="center"/>
+          </w:tcPr>
+          <w:p>
+            <w:pPr>
+              <w:pStyle w:val="Normal"/>
+              <w:widowControl/>
+              <w:spacing w:before="0" w:after="120"/>
+              <w:jc w:val="start"/>
+              <w:rPr>
+                <w:rFonts w:eastAsia="ＭＳ 明朝" w:cs=""/>
+                <w:kern w:val="0"/>
+                <w:szCs w:val="22"/>
+                <w:lang w:val="en-US" w:eastAsia="en-US" w:bidi="ar-SA"/>
+              </w:rPr>
+            </w:pPr>
+            <w:r>
+              <w:rPr>
+                <w:rFonts w:eastAsia="ＭＳ 明朝" w:cs=""/>
+                <w:kern w:val="0"/>
+                <w:szCs w:val="22"/>
+                <w:lang w:val="en-US" w:eastAsia="en-US" w:bidi="ar-SA"/>
+              </w:rPr>
+              <w:t>The target layout was sized only for the shorter source language.</w:t>
+            </w:r>
+          </w:p>
+        </w:tc>
+        <w:tc>
+          <w:tcPr>
+            <w:tcW w:w="3660" w:type="dxa"/>
+            <w:tcBorders>
+              <w:top w:val="nil"/>
+            </w:tcBorders>
+            <w:shd w:color="auto" w:fill="D3DFEE" w:themeFill="accent1" w:themeFillTint="3f" w:val="clear"/>
+            <w:vAlign w:val="center"/>
+          </w:tcPr>
+          <w:p>
+            <w:pPr>
+              <w:pStyle w:val="Normal"/>
+              <w:widowControl/>
+              <w:spacing w:before="0" w:after="120"/>
+              <w:jc w:val="start"/>
+              <w:rPr>
+                <w:rFonts w:eastAsia="ＭＳ 明朝" w:cs=""/>
+                <w:kern w:val="0"/>
+                <w:szCs w:val="22"/>
+                <w:lang w:val="en-US" w:eastAsia="en-US" w:bidi="ar-SA"/>
+              </w:rPr>
+            </w:pPr>
+            <w:r>
+              <w:rPr>
+                <w:rFonts w:eastAsia="ＭＳ 明朝" w:cs=""/>
+                <w:kern w:val="0"/>
+                <w:szCs w:val="22"/>
+                <w:lang w:val="en-US" w:eastAsia="en-US" w:bidi="ar-SA"/>
+              </w:rPr>
+              <w:t>In the Delphi Form Designer, enable appropriate wrapping/AutoSize and adjust layout containers, margins, or control dimensions; then rebuild and visually retest every supported language.</w:t>
+            </w:r>
+          </w:p>
+        </w:tc>
+      </w:tr>
     </w:tbl>
     <w:p>
       <w:pPr>
         <w:pStyle w:val="Heading1"/>
         <w:rPr/>
       </w:pPr>
-      <w:bookmarkStart w:id="21" w:name="__RefHeading___Toc2452_2263633017"/>
-      <w:bookmarkEnd w:id="21"/>
+      <w:bookmarkStart w:id="23" w:name="__RefHeading___Toc4949_3806694461"/>
+      <w:bookmarkEnd w:id="23"/>
       <w:r>
         <w:rPr/>
         <w:t>11. Where to Learn More</w:t>
@@ -6448,7 +7042,7 @@
     </w:r>
     <w:r>
       <w:rPr/>
-      <w:t>12</w:t>
+      <w:t>13</w:t>
     </w:r>
     <w:r>
       <w:rPr/>
@@ -6488,7 +7082,7 @@
     </w:r>
     <w:r>
       <w:rPr/>
-      <w:t>12</w:t>
+      <w:t>13</w:t>
     </w:r>
     <w:r>
       <w:rPr/>
@@ -8881,6 +9475,117 @@
   <w:abstractNum w:abstractNumId="21">
     <w:lvl w:ilvl="0">
       <w:start w:val="1"/>
+      <w:numFmt w:val="decimal"/>
+      <w:lvlText w:val="%1."/>
+      <w:lvlJc w:val="start"/>
+      <w:pPr>
+        <w:tabs>
+          <w:tab w:val="num" w:pos="360"/>
+        </w:tabs>
+        <w:ind w:start="360" w:hanging="360"/>
+      </w:pPr>
+      <w:rPr/>
+    </w:lvl>
+    <w:lvl w:ilvl="1">
+      <w:start w:val="1"/>
+      <w:numFmt w:val="decimal"/>
+      <w:lvlText w:val="%2."/>
+      <w:lvlJc w:val="start"/>
+      <w:pPr>
+        <w:tabs>
+          <w:tab w:val="num" w:pos="1080"/>
+        </w:tabs>
+        <w:ind w:start="1080" w:hanging="360"/>
+      </w:pPr>
+    </w:lvl>
+    <w:lvl w:ilvl="2">
+      <w:start w:val="1"/>
+      <w:numFmt w:val="decimal"/>
+      <w:lvlText w:val="%3."/>
+      <w:lvlJc w:val="start"/>
+      <w:pPr>
+        <w:tabs>
+          <w:tab w:val="num" w:pos="1440"/>
+        </w:tabs>
+        <w:ind w:start="1440" w:hanging="360"/>
+      </w:pPr>
+    </w:lvl>
+    <w:lvl w:ilvl="3">
+      <w:start w:val="1"/>
+      <w:numFmt w:val="decimal"/>
+      <w:lvlText w:val="%4."/>
+      <w:lvlJc w:val="start"/>
+      <w:pPr>
+        <w:tabs>
+          <w:tab w:val="num" w:pos="1800"/>
+        </w:tabs>
+        <w:ind w:start="1800" w:hanging="360"/>
+      </w:pPr>
+    </w:lvl>
+    <w:lvl w:ilvl="4">
+      <w:start w:val="1"/>
+      <w:numFmt w:val="decimal"/>
+      <w:lvlText w:val="%5."/>
+      <w:lvlJc w:val="start"/>
+      <w:pPr>
+        <w:tabs>
+          <w:tab w:val="num" w:pos="2160"/>
+        </w:tabs>
+        <w:ind w:start="2160" w:hanging="360"/>
+      </w:pPr>
+    </w:lvl>
+    <w:lvl w:ilvl="5">
+      <w:start w:val="1"/>
+      <w:numFmt w:val="decimal"/>
+      <w:lvlText w:val="%6."/>
+      <w:lvlJc w:val="start"/>
+      <w:pPr>
+        <w:tabs>
+          <w:tab w:val="num" w:pos="2520"/>
+        </w:tabs>
+        <w:ind w:start="2520" w:hanging="360"/>
+      </w:pPr>
+    </w:lvl>
+    <w:lvl w:ilvl="6">
+      <w:start w:val="1"/>
+      <w:numFmt w:val="decimal"/>
+      <w:lvlText w:val="%7."/>
+      <w:lvlJc w:val="start"/>
+      <w:pPr>
+        <w:tabs>
+          <w:tab w:val="num" w:pos="2880"/>
+        </w:tabs>
+        <w:ind w:start="2880" w:hanging="360"/>
+      </w:pPr>
+    </w:lvl>
+    <w:lvl w:ilvl="7">
+      <w:start w:val="1"/>
+      <w:numFmt w:val="decimal"/>
+      <w:lvlText w:val="%8."/>
+      <w:lvlJc w:val="start"/>
+      <w:pPr>
+        <w:tabs>
+          <w:tab w:val="num" w:pos="3240"/>
+        </w:tabs>
+        <w:ind w:start="3240" w:hanging="360"/>
+      </w:pPr>
+    </w:lvl>
+    <w:lvl w:ilvl="8">
+      <w:start w:val="1"/>
+      <w:numFmt w:val="decimal"/>
+      <w:lvlText w:val="%9."/>
+      <w:lvlJc w:val="start"/>
+      <w:pPr>
+        <w:tabs>
+          <w:tab w:val="num" w:pos="3600"/>
+        </w:tabs>
+        <w:ind w:start="3600" w:hanging="360"/>
+      </w:pPr>
+    </w:lvl>
+  </w:abstractNum>
+  <w:abstractNum w:abstractNumId="22">
+    <w:lvl w:ilvl="0">
+      <w:start w:val="1"/>
       <w:numFmt w:val="none"/>
       <w:suff w:val="nothing"/>
       <w:lvlText w:val=""/>
@@ -9061,10 +9766,7 @@
     <w:abstractNumId w:val="21"/>
   </w:num>
   <w:num w:numId="22">
-    <w:abstractNumId w:val="7"/>
-    <w:lvlOverride w:ilvl="0">
-      <w:startOverride w:val="1"/>
-    </w:lvlOverride>
+    <w:abstractNumId w:val="22"/>
   </w:num>
   <w:num w:numId="23">
     <w:abstractNumId w:val="7"/>
@@ -9139,6 +9841,18 @@
     </w:lvlOverride>
   </w:num>
   <w:num w:numId="35">
+    <w:abstractNumId w:val="7"/>
+    <w:lvlOverride w:ilvl="0">
+      <w:startOverride w:val="1"/>
+    </w:lvlOverride>
+  </w:num>
+  <w:num w:numId="36">
+    <w:abstractNumId w:val="7"/>
+    <w:lvlOverride w:ilvl="0">
+      <w:startOverride w:val="1"/>
+    </w:lvlOverride>
+  </w:num>
+  <w:num w:numId="37">
     <w:abstractNumId w:val="7"/>
     <w:lvlOverride w:ilvl="0">
       <w:startOverride w:val="1"/>

</xml_diff>

<commit_message>
Automate wizard language pack destinations
</commit_message>
<xml_diff>
--- a/docs/guides/Delphi App Translation Studio Setup Wizard Guide.docx
+++ b/docs/guides/Delphi App Translation Studio Setup Wizard Guide.docx
@@ -203,7 +203,7 @@
           <w:color w:val="163A63"/>
           <w:sz w:val="18"/>
         </w:rPr>
-        <w:t>4. Complete the Eight Wizard Steps</w:t>
+        <w:t>4. Complete the Nine Wizard Steps</w:t>
       </w:r>
       <w:r>
         <w:rPr>
@@ -211,7 +211,7 @@
           <w:color w:val="5D7693"/>
           <w:sz w:val="18"/>
         </w:rPr>
-        <w:t xml:space="preserve"> ...................................... 3</w:t>
+        <w:t xml:space="preserve"> ....................................... 3</w:t>
       </w:r>
       <w:r>
         <w:br/>
@@ -230,7 +230,7 @@
           <w:color w:val="5D7693"/>
           <w:sz w:val="18"/>
         </w:rPr>
-        <w:t xml:space="preserve"> .................................. 7</w:t>
+        <w:t xml:space="preserve"> .................................. 8</w:t>
       </w:r>
       <w:r>
         <w:br/>
@@ -249,7 +249,7 @@
           <w:color w:val="5D7693"/>
           <w:sz w:val="18"/>
         </w:rPr>
-        <w:t xml:space="preserve"> .................................. 8</w:t>
+        <w:t xml:space="preserve"> .................................. 9</w:t>
       </w:r>
       <w:r>
         <w:br/>
@@ -268,7 +268,7 @@
           <w:color w:val="5D7693"/>
           <w:sz w:val="18"/>
         </w:rPr>
-        <w:t xml:space="preserve"> .................................... 9</w:t>
+        <w:t xml:space="preserve"> .................................... 10</w:t>
       </w:r>
       <w:r>
         <w:br/>
@@ -287,7 +287,7 @@
           <w:color w:val="5D7693"/>
           <w:sz w:val="18"/>
         </w:rPr>
-        <w:t xml:space="preserve"> .......................................... 9</w:t>
+        <w:t xml:space="preserve"> .......................................... 10</w:t>
       </w:r>
       <w:r>
         <w:br/>
@@ -306,7 +306,7 @@
           <w:color w:val="5D7693"/>
           <w:sz w:val="18"/>
         </w:rPr>
-        <w:t xml:space="preserve"> .............................. 10</w:t>
+        <w:t xml:space="preserve"> .............................. 11</w:t>
       </w:r>
       <w:r>
         <w:br/>
@@ -325,7 +325,7 @@
           <w:color w:val="5D7693"/>
           <w:sz w:val="18"/>
         </w:rPr>
-        <w:t xml:space="preserve"> ..................................................... 12</w:t>
+        <w:t xml:space="preserve"> ..................................................... 13</w:t>
       </w:r>
       <w:r>
         <w:br/>
@@ -344,7 +344,7 @@
           <w:color w:val="5D7693"/>
           <w:sz w:val="18"/>
         </w:rPr>
-        <w:t xml:space="preserve"> ................................................. 13</w:t>
+        <w:t xml:space="preserve"> ................................................. 14</w:t>
       </w:r>
       <w:r>
         <w:fldChar w:fldCharType="end"/>
@@ -1091,7 +1091,7 @@
         <w:pStyle w:val="Heading1"/>
       </w:pPr>
       <w:r>
-        <w:t>4. Complete the Eight Wizard Steps</w:t>
+        <w:t>4. Complete the Nine Wizard Steps</w:t>
       </w:r>
     </w:p>
     <w:p>
@@ -1305,7 +1305,122 @@
         <w:pStyle w:val="Heading2"/>
       </w:pPr>
       <w:r>
-        <w:t>4.3 Step 3 - Languages</w:t>
+        <w:t>4.3 Step 3 - Deployment Destinations</w:t>
+      </w:r>
+    </w:p>
+    <w:p>
+      <w:r>
+        <w:t>The Wizard detects normal Win32 and Win64 build-output folders automatically. This page is for additional installed, portable, network, or USB folders that contain—or will contain—the application executable. Entries are staged until authorized final processing, so Cancel still leaves the project and Studio-owned deployment settings unchanged.</w:t>
+      </w:r>
+    </w:p>
+    <w:p>
+      <w:pPr>
+        <w:pStyle w:val="ListNumber"/>
+        <w:numPr>
+          <w:ilvl w:val="0"/>
+          <w:numId w:val="14"/>
+        </w:numPr>
+      </w:pPr>
+      <w:r>
+        <w:t>Leave the list empty when the application will run only from normal Delphi build-output folders.</w:t>
+      </w:r>
+    </w:p>
+    <w:p>
+      <w:pPr>
+        <w:pStyle w:val="ListNumber"/>
+        <w:numPr>
+          <w:ilvl w:val="0"/>
+          <w:numId w:val="14"/>
+        </w:numPr>
+      </w:pPr>
+      <w:r>
+        <w:t>For a separate application copy, select Add Application Folder and choose the full folder, including its drive letter. Select the folder containing the executable, not the Localization or Languages subfolder.</w:t>
+      </w:r>
+    </w:p>
+    <w:p>
+      <w:pPr>
+        <w:pStyle w:val="ListNumber"/>
+        <w:numPr>
+          <w:ilvl w:val="0"/>
+          <w:numId w:val="14"/>
+        </w:numPr>
+      </w:pPr>
+      <w:r>
+        <w:t>Repeat Add Application Folder for every installed, portable, network, or USB destination that should receive language packs automatically.</w:t>
+      </w:r>
+    </w:p>
+    <w:p>
+      <w:pPr>
+        <w:pStyle w:val="ListNumber"/>
+        <w:numPr>
+          <w:ilvl w:val="0"/>
+          <w:numId w:val="14"/>
+        </w:numPr>
+      </w:pPr>
+      <w:r>
+        <w:t>Use Remove Selected to remove an obsolete or incorrect destination before final processing.</w:t>
+      </w:r>
+    </w:p>
+    <w:p>
+      <w:pPr>
+        <w:pStyle w:val="ListNumber"/>
+        <w:numPr>
+          <w:ilvl w:val="0"/>
+          <w:numId w:val="14"/>
+        </w:numPr>
+      </w:pPr>
+      <w:r>
+        <w:t>Read the summary, then select Next.</w:t>
+      </w:r>
+    </w:p>
+    <w:tbl>
+      <w:tblPr>
+        <w:jc w:val="center"/>
+        <w:tblLook w:firstColumn="1" w:firstRow="1" w:lastColumn="0" w:lastRow="0" w:noHBand="0" w:noVBand="1" w:val="04A0"/>
+        <w:tblW w:w="9360" w:type="dxa"/>
+        <w:tblInd w:w="120" w:type="dxa"/>
+        <w:tblLayout w:type="fixed"/>
+        <w:tblCellMar>
+          <w:top w:w="80" w:type="dxa"/>
+          <w:bottom w:w="80" w:type="dxa"/>
+          <w:start w:w="120" w:type="dxa"/>
+          <w:end w:w="120" w:type="dxa"/>
+        </w:tblCellMar>
+      </w:tblPr>
+      <w:tblGrid>
+        <w:gridCol w:w="9360"/>
+      </w:tblGrid>
+      <w:tr>
+        <w:tc>
+          <w:tcPr>
+            <w:tcW w:type="dxa" w:w="9360"/>
+            <w:shd w:fill="EAF3FF"/>
+            <w:vAlign w:val="center"/>
+          </w:tcPr>
+          <w:p>
+            <w:pPr>
+              <w:pStyle w:val="Callout"/>
+            </w:pPr>
+            <w:r>
+              <w:rPr>
+                <w:b/>
+                <w:color w:val="234C80"/>
+              </w:rPr>
+              <w:t xml:space="preserve">Expected result. </w:t>
+            </w:r>
+            <w:r>
+              <w:t>Final processing deploys immediately to every configured destination that is currently available. The choices are saved as Studio-owned JSON and included in the component kit. Future Delphi builds retry them automatically; an unplugged or unavailable drive is skipped with a warning and does not fail the build.</w:t>
+            </w:r>
+          </w:p>
+        </w:tc>
+      </w:tr>
+    </w:tbl>
+    <w:p>
+      <w:pPr>
+        <w:pStyle w:val="Heading2"/>
+      </w:pPr>
+      <w:r>
+        <w:t>4.4 Step 4 - Languages</w:t>
       </w:r>
     </w:p>
     <w:p>
@@ -1318,7 +1433,7 @@
         <w:pStyle w:val="ListNumber"/>
         <w:numPr>
           <w:ilvl w:val="0"/>
-          <w:numId w:val="14"/>
+          <w:numId w:val="15"/>
         </w:numPr>
       </w:pPr>
       <w:r>
@@ -1330,7 +1445,7 @@
         <w:pStyle w:val="ListNumber"/>
         <w:numPr>
           <w:ilvl w:val="0"/>
-          <w:numId w:val="14"/>
+          <w:numId w:val="15"/>
         </w:numPr>
       </w:pPr>
       <w:r>
@@ -1342,7 +1457,7 @@
         <w:pStyle w:val="ListNumber"/>
         <w:numPr>
           <w:ilvl w:val="0"/>
-          <w:numId w:val="14"/>
+          <w:numId w:val="15"/>
         </w:numPr>
       </w:pPr>
       <w:r>
@@ -1354,7 +1469,7 @@
         <w:pStyle w:val="ListNumber"/>
         <w:numPr>
           <w:ilvl w:val="0"/>
-          <w:numId w:val="14"/>
+          <w:numId w:val="15"/>
         </w:numPr>
       </w:pPr>
       <w:r>
@@ -1408,7 +1523,7 @@
         <w:pStyle w:val="Heading2"/>
       </w:pPr>
       <w:r>
-        <w:t>4.4 Step 4 - Translation Service</w:t>
+        <w:t>4.5 Step 5 - Translation Service</w:t>
       </w:r>
     </w:p>
     <w:p>
@@ -1421,7 +1536,7 @@
         <w:pStyle w:val="ListNumber"/>
         <w:numPr>
           <w:ilvl w:val="0"/>
-          <w:numId w:val="15"/>
+          <w:numId w:val="16"/>
         </w:numPr>
       </w:pPr>
       <w:r>
@@ -1433,7 +1548,7 @@
         <w:pStyle w:val="ListNumber"/>
         <w:numPr>
           <w:ilvl w:val="0"/>
-          <w:numId w:val="15"/>
+          <w:numId w:val="16"/>
         </w:numPr>
       </w:pPr>
       <w:r>
@@ -1445,7 +1560,7 @@
         <w:pStyle w:val="ListNumber"/>
         <w:numPr>
           <w:ilvl w:val="0"/>
-          <w:numId w:val="15"/>
+          <w:numId w:val="16"/>
         </w:numPr>
       </w:pPr>
       <w:r>
@@ -1457,7 +1572,7 @@
         <w:pStyle w:val="ListNumber"/>
         <w:numPr>
           <w:ilvl w:val="0"/>
-          <w:numId w:val="15"/>
+          <w:numId w:val="16"/>
         </w:numPr>
       </w:pPr>
       <w:r>
@@ -1469,7 +1584,7 @@
         <w:pStyle w:val="ListNumber"/>
         <w:numPr>
           <w:ilvl w:val="0"/>
-          <w:numId w:val="15"/>
+          <w:numId w:val="16"/>
         </w:numPr>
       </w:pPr>
       <w:r>
@@ -1481,7 +1596,7 @@
         <w:pStyle w:val="ListNumber"/>
         <w:numPr>
           <w:ilvl w:val="0"/>
-          <w:numId w:val="15"/>
+          <w:numId w:val="16"/>
         </w:numPr>
       </w:pPr>
       <w:r>
@@ -1535,7 +1650,7 @@
         <w:pStyle w:val="Heading2"/>
       </w:pPr>
       <w:r>
-        <w:t>4.5 Step 5 - Scan Project</w:t>
+        <w:t>4.6 Step 6 - Scan Project</w:t>
       </w:r>
     </w:p>
     <w:p>
@@ -1553,7 +1668,7 @@
         <w:pStyle w:val="ListNumber"/>
         <w:numPr>
           <w:ilvl w:val="0"/>
-          <w:numId w:val="16"/>
+          <w:numId w:val="17"/>
         </w:numPr>
       </w:pPr>
       <w:r>
@@ -1565,7 +1680,7 @@
         <w:pStyle w:val="ListNumber"/>
         <w:numPr>
           <w:ilvl w:val="0"/>
-          <w:numId w:val="16"/>
+          <w:numId w:val="17"/>
         </w:numPr>
       </w:pPr>
       <w:r>
@@ -1577,7 +1692,7 @@
         <w:pStyle w:val="ListNumber"/>
         <w:numPr>
           <w:ilvl w:val="0"/>
-          <w:numId w:val="16"/>
+          <w:numId w:val="17"/>
         </w:numPr>
       </w:pPr>
       <w:r>
@@ -1589,7 +1704,7 @@
         <w:pStyle w:val="ListNumber"/>
         <w:numPr>
           <w:ilvl w:val="0"/>
-          <w:numId w:val="16"/>
+          <w:numId w:val="17"/>
         </w:numPr>
       </w:pPr>
       <w:r>
@@ -1601,7 +1716,7 @@
         <w:pStyle w:val="ListNumber"/>
         <w:numPr>
           <w:ilvl w:val="0"/>
-          <w:numId w:val="16"/>
+          <w:numId w:val="17"/>
         </w:numPr>
       </w:pPr>
       <w:r>
@@ -1655,7 +1770,7 @@
         <w:pStyle w:val="Heading2"/>
       </w:pPr>
       <w:r>
-        <w:t>4.6 Step 6 - Delphi Component</w:t>
+        <w:t>4.7 Step 7 - Delphi Component</w:t>
       </w:r>
     </w:p>
     <w:p>
@@ -1668,11 +1783,11 @@
         <w:pStyle w:val="ListNumber"/>
         <w:numPr>
           <w:ilvl w:val="0"/>
-          <w:numId w:val="17"/>
+          <w:numId w:val="18"/>
         </w:numPr>
       </w:pPr>
       <w:r>
-        <w:t>Read all eight instructions shown on the page.</w:t>
+        <w:t>Read every project-specific instruction shown on the page.</w:t>
       </w:r>
     </w:p>
     <w:p>
@@ -1680,7 +1795,7 @@
         <w:pStyle w:val="ListNumber"/>
         <w:numPr>
           <w:ilvl w:val="0"/>
-          <w:numId w:val="17"/>
+          <w:numId w:val="18"/>
         </w:numPr>
       </w:pPr>
       <w:r>
@@ -1692,7 +1807,7 @@
         <w:pStyle w:val="ListNumber"/>
         <w:numPr>
           <w:ilvl w:val="0"/>
-          <w:numId w:val="17"/>
+          <w:numId w:val="18"/>
         </w:numPr>
       </w:pPr>
       <w:r>
@@ -1704,7 +1819,7 @@
         <w:pStyle w:val="ListNumber"/>
         <w:numPr>
           <w:ilvl w:val="0"/>
-          <w:numId w:val="17"/>
+          <w:numId w:val="18"/>
         </w:numPr>
       </w:pPr>
       <w:r>
@@ -1758,7 +1873,7 @@
         <w:pStyle w:val="Heading2"/>
       </w:pPr>
       <w:r>
-        <w:t>4.7 Step 7 - Review and Authorize</w:t>
+        <w:t>4.8 Step 8 - Review and Authorize</w:t>
       </w:r>
     </w:p>
     <w:p>
@@ -1771,7 +1886,7 @@
         <w:pStyle w:val="ListNumber"/>
         <w:numPr>
           <w:ilvl w:val="0"/>
-          <w:numId w:val="18"/>
+          <w:numId w:val="19"/>
         </w:numPr>
       </w:pPr>
       <w:r>
@@ -1783,7 +1898,7 @@
         <w:pStyle w:val="ListNumber"/>
         <w:numPr>
           <w:ilvl w:val="0"/>
-          <w:numId w:val="18"/>
+          <w:numId w:val="19"/>
         </w:numPr>
       </w:pPr>
       <w:r>
@@ -1795,7 +1910,7 @@
         <w:pStyle w:val="ListNumber"/>
         <w:numPr>
           <w:ilvl w:val="0"/>
-          <w:numId w:val="18"/>
+          <w:numId w:val="19"/>
         </w:numPr>
       </w:pPr>
       <w:r>
@@ -1807,7 +1922,7 @@
         <w:pStyle w:val="ListNumber"/>
         <w:numPr>
           <w:ilvl w:val="0"/>
-          <w:numId w:val="18"/>
+          <w:numId w:val="19"/>
         </w:numPr>
       </w:pPr>
       <w:r>
@@ -1819,7 +1934,7 @@
         <w:pStyle w:val="ListNumber"/>
         <w:numPr>
           <w:ilvl w:val="0"/>
-          <w:numId w:val="18"/>
+          <w:numId w:val="19"/>
         </w:numPr>
       </w:pPr>
       <w:r>
@@ -1831,7 +1946,7 @@
         <w:pStyle w:val="ListNumber"/>
         <w:numPr>
           <w:ilvl w:val="0"/>
-          <w:numId w:val="18"/>
+          <w:numId w:val="19"/>
         </w:numPr>
       </w:pPr>
       <w:r>
@@ -1843,7 +1958,7 @@
         <w:pStyle w:val="ListNumber"/>
         <w:numPr>
           <w:ilvl w:val="0"/>
-          <w:numId w:val="18"/>
+          <w:numId w:val="19"/>
         </w:numPr>
       </w:pPr>
       <w:r>
@@ -1897,12 +2012,12 @@
         <w:pStyle w:val="Heading2"/>
       </w:pPr>
       <w:r>
-        <w:t>4.8 Step 8 - Process and Finish</w:t>
+        <w:t>4.9 Step 9 - Process and Finish</w:t>
       </w:r>
     </w:p>
     <w:p>
       <w:r>
-        <w:t>Final processing runs in a protected single pass: required ZIP backup, automatic translation of eligible unresolved entries, initial catalog save, automatic Localization Review, application of saved terminology/layout decisions, final validation, runtime-pack export, component-kit generation, deployment to existing output folders, backed-up transactional DPROJ configuration, and completion-report creation.</w:t>
+        <w:t>Final processing runs in a protected single pass: required ZIP backup, automatic translation of eligible unresolved entries, initial catalog save, automatic Localization Review, application of saved terminology/layout decisions, final validation, runtime-pack export, component-kit generation, deployment to existing output folders and every available configured application destination, backed-up transactional DPROJ configuration, and completion-report creation.</w:t>
       </w:r>
     </w:p>
     <w:p>
@@ -1915,7 +2030,7 @@
         <w:pStyle w:val="ListNumber"/>
         <w:numPr>
           <w:ilvl w:val="0"/>
-          <w:numId w:val="19"/>
+          <w:numId w:val="20"/>
         </w:numPr>
       </w:pPr>
       <w:r>
@@ -1927,7 +2042,7 @@
         <w:pStyle w:val="ListNumber"/>
         <w:numPr>
           <w:ilvl w:val="0"/>
-          <w:numId w:val="19"/>
+          <w:numId w:val="20"/>
         </w:numPr>
       </w:pPr>
       <w:r>
@@ -1939,11 +2054,11 @@
         <w:pStyle w:val="ListNumber"/>
         <w:numPr>
           <w:ilvl w:val="0"/>
-          <w:numId w:val="19"/>
+          <w:numId w:val="20"/>
         </w:numPr>
       </w:pPr>
       <w:r>
-        <w:t>Read the explanation above Fallback Commands. Normally, no command must be copied. Deploy Build Outputs refreshes existing build folders; the displayed commands are a troubleshooting fallback.</w:t>
+        <w:t>Read the repeat/troubleshooting explanation. Normally, neither deployment button must be clicked: final processing has already deployed detected outputs and configured application destinations.</w:t>
       </w:r>
     </w:p>
     <w:p>
@@ -1951,7 +2066,7 @@
         <w:pStyle w:val="ListNumber"/>
         <w:numPr>
           <w:ilvl w:val="0"/>
-          <w:numId w:val="19"/>
+          <w:numId w:val="20"/>
         </w:numPr>
       </w:pPr>
       <w:r>
@@ -1963,11 +2078,11 @@
         <w:pStyle w:val="ListNumber"/>
         <w:numPr>
           <w:ilvl w:val="0"/>
-          <w:numId w:val="19"/>
+          <w:numId w:val="20"/>
         </w:numPr>
       </w:pPr>
       <w:r>
-        <w:t>Use Deploy Build Outputs to refresh detected build folders. For a portable, USB, or custom installation, choose Deploy to App Folder and select the folder containing the exact application EXE. The Wizard verifies the EXE before copying anything.</w:t>
+        <w:t>Use Redeploy Build Outputs only to repeat deployment after an unusual manual change. Use Deploy New App Folder only for a new or temporary folder that was not entered on Step 3. The Wizard verifies the EXE before copying anything.</w:t>
       </w:r>
     </w:p>
     <w:p>
@@ -1975,7 +2090,7 @@
         <w:pStyle w:val="ListNumber"/>
         <w:numPr>
           <w:ilvl w:val="0"/>
-          <w:numId w:val="19"/>
+          <w:numId w:val="20"/>
         </w:numPr>
       </w:pPr>
       <w:r>
@@ -1987,7 +2102,7 @@
         <w:pStyle w:val="ListNumber"/>
         <w:numPr>
           <w:ilvl w:val="0"/>
-          <w:numId w:val="19"/>
+          <w:numId w:val="20"/>
         </w:numPr>
       </w:pPr>
       <w:r>
@@ -2062,7 +2177,7 @@
         <w:pStyle w:val="ListNumber"/>
         <w:numPr>
           <w:ilvl w:val="0"/>
-          <w:numId w:val="20"/>
+          <w:numId w:val="21"/>
         </w:numPr>
       </w:pPr>
       <w:r>
@@ -2074,7 +2189,7 @@
         <w:pStyle w:val="ListNumber"/>
         <w:numPr>
           <w:ilvl w:val="0"/>
-          <w:numId w:val="20"/>
+          <w:numId w:val="21"/>
         </w:numPr>
       </w:pPr>
       <w:r>
@@ -2086,7 +2201,7 @@
         <w:pStyle w:val="ListNumber"/>
         <w:numPr>
           <w:ilvl w:val="0"/>
-          <w:numId w:val="20"/>
+          <w:numId w:val="21"/>
         </w:numPr>
       </w:pPr>
       <w:r>
@@ -2098,7 +2213,7 @@
         <w:pStyle w:val="ListNumber"/>
         <w:numPr>
           <w:ilvl w:val="0"/>
-          <w:numId w:val="20"/>
+          <w:numId w:val="21"/>
         </w:numPr>
       </w:pPr>
       <w:r>
@@ -2110,7 +2225,7 @@
         <w:pStyle w:val="ListNumber"/>
         <w:numPr>
           <w:ilvl w:val="0"/>
-          <w:numId w:val="20"/>
+          <w:numId w:val="21"/>
         </w:numPr>
       </w:pPr>
       <w:r>
@@ -2122,7 +2237,7 @@
         <w:pStyle w:val="ListNumber"/>
         <w:numPr>
           <w:ilvl w:val="0"/>
-          <w:numId w:val="20"/>
+          <w:numId w:val="21"/>
         </w:numPr>
       </w:pPr>
       <w:r>
@@ -2184,7 +2299,7 @@
         <w:pStyle w:val="ListNumber"/>
         <w:numPr>
           <w:ilvl w:val="0"/>
-          <w:numId w:val="21"/>
+          <w:numId w:val="22"/>
         </w:numPr>
       </w:pPr>
       <w:r>
@@ -2196,7 +2311,7 @@
         <w:pStyle w:val="ListNumber"/>
         <w:numPr>
           <w:ilvl w:val="0"/>
-          <w:numId w:val="21"/>
+          <w:numId w:val="22"/>
         </w:numPr>
       </w:pPr>
       <w:r>
@@ -2208,7 +2323,7 @@
         <w:pStyle w:val="ListNumber"/>
         <w:numPr>
           <w:ilvl w:val="0"/>
-          <w:numId w:val="21"/>
+          <w:numId w:val="22"/>
         </w:numPr>
       </w:pPr>
       <w:r>
@@ -2220,7 +2335,7 @@
         <w:pStyle w:val="ListNumber"/>
         <w:numPr>
           <w:ilvl w:val="0"/>
-          <w:numId w:val="21"/>
+          <w:numId w:val="22"/>
         </w:numPr>
       </w:pPr>
       <w:r>
@@ -2232,7 +2347,7 @@
         <w:pStyle w:val="ListNumber"/>
         <w:numPr>
           <w:ilvl w:val="0"/>
-          <w:numId w:val="21"/>
+          <w:numId w:val="22"/>
         </w:numPr>
       </w:pPr>
       <w:r>
@@ -2244,7 +2359,7 @@
         <w:pStyle w:val="ListNumber"/>
         <w:numPr>
           <w:ilvl w:val="0"/>
-          <w:numId w:val="21"/>
+          <w:numId w:val="22"/>
         </w:numPr>
       </w:pPr>
       <w:r>
@@ -2256,7 +2371,7 @@
         <w:pStyle w:val="ListNumber"/>
         <w:numPr>
           <w:ilvl w:val="0"/>
-          <w:numId w:val="21"/>
+          <w:numId w:val="22"/>
         </w:numPr>
       </w:pPr>
       <w:r>
@@ -2341,7 +2456,7 @@
         <w:pStyle w:val="ListNumber"/>
         <w:numPr>
           <w:ilvl w:val="0"/>
-          <w:numId w:val="22"/>
+          <w:numId w:val="23"/>
         </w:numPr>
       </w:pPr>
       <w:r>
@@ -2353,7 +2468,7 @@
         <w:pStyle w:val="ListNumber"/>
         <w:numPr>
           <w:ilvl w:val="0"/>
-          <w:numId w:val="22"/>
+          <w:numId w:val="23"/>
         </w:numPr>
       </w:pPr>
       <w:r>
@@ -2365,7 +2480,7 @@
         <w:pStyle w:val="ListNumber"/>
         <w:numPr>
           <w:ilvl w:val="0"/>
-          <w:numId w:val="22"/>
+          <w:numId w:val="23"/>
         </w:numPr>
       </w:pPr>
       <w:r>
@@ -2377,11 +2492,11 @@
         <w:pStyle w:val="ListNumber"/>
         <w:numPr>
           <w:ilvl w:val="0"/>
-          <w:numId w:val="22"/>
+          <w:numId w:val="23"/>
         </w:numPr>
       </w:pPr>
       <w:r>
-        <w:t>If an already-built output needs refreshing, select Deploy Build Outputs. Copy Fallback Commands remains available for troubleshooting.</w:t>
+        <w:t>If an already-built output needs refreshing, select Redeploy Build Outputs. Copy Fallback Commands remains available for troubleshooting.</w:t>
       </w:r>
     </w:p>
     <w:p>
@@ -2389,11 +2504,11 @@
         <w:pStyle w:val="ListNumber"/>
         <w:numPr>
           <w:ilvl w:val="0"/>
-          <w:numId w:val="22"/>
+          <w:numId w:val="23"/>
         </w:numPr>
       </w:pPr>
       <w:r>
-        <w:t>For a portable or USB copy, select Deploy to App Folder and choose the folder containing &lt;ProjectName&gt;.exe. The LanguagesFolder component property remains the relative value Localization\Languages, while the physical destination includes the drive, for example F:\Localization\Languages.</w:t>
+        <w:t>For a portable or USB copy, enter its full application folder on Step 3 so final processing and future builds deploy it automatically. Deploy New App Folder remains available for a new or temporary destination. The LanguagesFolder component property remains the relative value Localization\Languages, while the physical destination includes the drive.</w:t>
       </w:r>
     </w:p>
     <w:tbl>
@@ -2451,7 +2566,7 @@
         <w:pStyle w:val="ListNumber"/>
         <w:numPr>
           <w:ilvl w:val="0"/>
-          <w:numId w:val="23"/>
+          <w:numId w:val="24"/>
         </w:numPr>
       </w:pPr>
       <w:r>
@@ -2463,7 +2578,7 @@
         <w:pStyle w:val="ListNumber"/>
         <w:numPr>
           <w:ilvl w:val="0"/>
-          <w:numId w:val="23"/>
+          <w:numId w:val="24"/>
         </w:numPr>
       </w:pPr>
       <w:r>
@@ -2475,7 +2590,7 @@
         <w:pStyle w:val="ListNumber"/>
         <w:numPr>
           <w:ilvl w:val="0"/>
-          <w:numId w:val="23"/>
+          <w:numId w:val="24"/>
         </w:numPr>
       </w:pPr>
       <w:r>
@@ -2487,7 +2602,7 @@
         <w:pStyle w:val="ListNumber"/>
         <w:numPr>
           <w:ilvl w:val="0"/>
-          <w:numId w:val="23"/>
+          <w:numId w:val="24"/>
         </w:numPr>
       </w:pPr>
       <w:r>
@@ -2499,7 +2614,7 @@
         <w:pStyle w:val="ListNumber"/>
         <w:numPr>
           <w:ilvl w:val="0"/>
-          <w:numId w:val="23"/>
+          <w:numId w:val="24"/>
         </w:numPr>
       </w:pPr>
       <w:r>
@@ -2511,7 +2626,7 @@
         <w:pStyle w:val="ListNumber"/>
         <w:numPr>
           <w:ilvl w:val="0"/>
-          <w:numId w:val="23"/>
+          <w:numId w:val="24"/>
         </w:numPr>
       </w:pPr>
       <w:r>
@@ -2523,7 +2638,7 @@
         <w:pStyle w:val="ListNumber"/>
         <w:numPr>
           <w:ilvl w:val="0"/>
-          <w:numId w:val="23"/>
+          <w:numId w:val="24"/>
         </w:numPr>
       </w:pPr>
       <w:r>
@@ -2535,7 +2650,7 @@
         <w:pStyle w:val="ListNumber"/>
         <w:numPr>
           <w:ilvl w:val="0"/>
-          <w:numId w:val="23"/>
+          <w:numId w:val="24"/>
         </w:numPr>
       </w:pPr>
       <w:r>
@@ -2948,7 +3063,7 @@
         <w:pStyle w:val="ListNumber"/>
         <w:numPr>
           <w:ilvl w:val="0"/>
-          <w:numId w:val="24"/>
+          <w:numId w:val="25"/>
         </w:numPr>
       </w:pPr>
       <w:r>
@@ -2960,7 +3075,7 @@
         <w:pStyle w:val="ListNumber"/>
         <w:numPr>
           <w:ilvl w:val="0"/>
-          <w:numId w:val="24"/>
+          <w:numId w:val="25"/>
         </w:numPr>
       </w:pPr>
       <w:r>
@@ -2972,7 +3087,7 @@
         <w:pStyle w:val="ListNumber"/>
         <w:numPr>
           <w:ilvl w:val="0"/>
-          <w:numId w:val="24"/>
+          <w:numId w:val="25"/>
         </w:numPr>
       </w:pPr>
       <w:r>
@@ -2984,7 +3099,7 @@
         <w:pStyle w:val="ListNumber"/>
         <w:numPr>
           <w:ilvl w:val="0"/>
-          <w:numId w:val="24"/>
+          <w:numId w:val="25"/>
         </w:numPr>
       </w:pPr>
       <w:r>
@@ -2996,7 +3111,7 @@
         <w:pStyle w:val="ListNumber"/>
         <w:numPr>
           <w:ilvl w:val="0"/>
-          <w:numId w:val="24"/>
+          <w:numId w:val="25"/>
         </w:numPr>
       </w:pPr>
       <w:r>
@@ -3008,7 +3123,7 @@
         <w:pStyle w:val="ListNumber"/>
         <w:numPr>
           <w:ilvl w:val="0"/>
-          <w:numId w:val="24"/>
+          <w:numId w:val="25"/>
         </w:numPr>
       </w:pPr>
       <w:r>
@@ -3020,11 +3135,11 @@
         <w:pStyle w:val="ListNumber"/>
         <w:numPr>
           <w:ilvl w:val="0"/>
-          <w:numId w:val="24"/>
+          <w:numId w:val="25"/>
         </w:numPr>
       </w:pPr>
       <w:r>
-        <w:t>Let final processing validate the catalog, export fresh JSON, regenerate the kit, and deploy to known build outputs. Use Deploy to App Folder again for a portable or USB copy.</w:t>
+        <w:t>Let final processing validate the catalog, export fresh JSON, regenerate the kit, and deploy to known build outputs and every available configured application destination.</w:t>
       </w:r>
     </w:p>
     <w:p>
@@ -3032,7 +3147,7 @@
         <w:pStyle w:val="ListNumber"/>
         <w:numPr>
           <w:ilvl w:val="0"/>
-          <w:numId w:val="24"/>
+          <w:numId w:val="25"/>
         </w:numPr>
       </w:pPr>
       <w:r>
@@ -3435,7 +3550,7 @@
           </w:tcPr>
           <w:p>
             <w:r>
-              <w:t>The marked DPROJ settings are missing, the kit moved, or the post-build command failed.</w:t>
+              <w:t>The marked DPROJ settings are missing, the kit moved, the destination was unavailable, or the post-build command failed.</w:t>
             </w:r>
           </w:p>
         </w:tc>
@@ -3446,7 +3561,7 @@
           </w:tcPr>
           <w:p>
             <w:r>
-              <w:t>Inspect the build output, verify the kit path, and use Deploy Build Outputs, Deploy to App Folder, or the documented manual fallback.</w:t>
+              <w:t>Inspect the build output and configured destination, verify the kit path, then use Redeploy Build Outputs, Deploy New App Folder, or the documented manual fallback.</w:t>
             </w:r>
           </w:p>
         </w:tc>
@@ -4109,6 +4224,12 @@
     </w:lvlOverride>
   </w:num>
   <w:num w:numId="24">
+    <w:abstractNumId w:val="7"/>
+    <w:lvlOverride w:ilvl="0">
+      <w:startOverride w:val="1"/>
+    </w:lvlOverride>
+  </w:num>
+  <w:num w:numId="25">
     <w:abstractNumId w:val="7"/>
     <w:lvlOverride w:ilvl="0">
       <w:startOverride w:val="1"/>

</xml_diff>

<commit_message>
Move component setup before wizard scan
</commit_message>
<xml_diff>
--- a/docs/guides/Delphi App Translation Studio Setup Wizard Guide.docx
+++ b/docs/guides/Delphi App Translation Studio Setup Wizard Guide.docx
@@ -165,7 +165,7 @@
           <w:color w:val="163A63"/>
           <w:sz w:val="18"/>
         </w:rPr>
-        <w:t>2. Prepare Before Starting</w:t>
+        <w:t>2. Complete the RAD Studio Preparation Before Starting</w:t>
       </w:r>
       <w:r>
         <w:rPr>
@@ -173,7 +173,7 @@
           <w:color w:val="5D7693"/>
           <w:sz w:val="18"/>
         </w:rPr>
-        <w:t xml:space="preserve"> .............................................. 1</w:t>
+        <w:t xml:space="preserve"> .................. 1</w:t>
       </w:r>
       <w:r>
         <w:br/>
@@ -192,7 +192,7 @@
           <w:color w:val="5D7693"/>
           <w:sz w:val="18"/>
         </w:rPr>
-        <w:t xml:space="preserve"> .................................. 2</w:t>
+        <w:t xml:space="preserve"> .................................. 3</w:t>
       </w:r>
       <w:r>
         <w:br/>
@@ -211,7 +211,7 @@
           <w:color w:val="5D7693"/>
           <w:sz w:val="18"/>
         </w:rPr>
-        <w:t xml:space="preserve"> ....................................... 3</w:t>
+        <w:t xml:space="preserve"> ....................................... 4</w:t>
       </w:r>
       <w:r>
         <w:br/>
@@ -222,7 +222,7 @@
           <w:color w:val="163A63"/>
           <w:sz w:val="18"/>
         </w:rPr>
-        <w:t>5. Complete the Manual RAD Studio Step</w:t>
+        <w:t>5. Verify the RAD Studio Component Setup</w:t>
       </w:r>
       <w:r>
         <w:rPr>
@@ -230,7 +230,7 @@
           <w:color w:val="5D7693"/>
           <w:sz w:val="18"/>
         </w:rPr>
-        <w:t xml:space="preserve"> .................................. 8</w:t>
+        <w:t xml:space="preserve"> ................................ 9</w:t>
       </w:r>
       <w:r>
         <w:br/>
@@ -249,7 +249,7 @@
           <w:color w:val="5D7693"/>
           <w:sz w:val="18"/>
         </w:rPr>
-        <w:t xml:space="preserve"> .................................. 9</w:t>
+        <w:t xml:space="preserve"> .................................. 10</w:t>
       </w:r>
       <w:r>
         <w:br/>
@@ -287,7 +287,7 @@
           <w:color w:val="5D7693"/>
           <w:sz w:val="18"/>
         </w:rPr>
-        <w:t xml:space="preserve"> .......................................... 10</w:t>
+        <w:t xml:space="preserve"> .......................................... 11</w:t>
       </w:r>
       <w:r>
         <w:br/>
@@ -306,7 +306,7 @@
           <w:color w:val="5D7693"/>
           <w:sz w:val="18"/>
         </w:rPr>
-        <w:t xml:space="preserve"> .............................. 11</w:t>
+        <w:t xml:space="preserve"> .............................. 12</w:t>
       </w:r>
       <w:r>
         <w:br/>
@@ -344,7 +344,7 @@
           <w:color w:val="5D7693"/>
           <w:sz w:val="18"/>
         </w:rPr>
-        <w:t xml:space="preserve"> ................................................. 14</w:t>
+        <w:t xml:space="preserve"> ................................................. 15</w:t>
       </w:r>
       <w:r>
         <w:fldChar w:fldCharType="end"/>
@@ -383,7 +383,7 @@
     </w:p>
     <w:p>
       <w:r>
-        <w:t>The Wizard cannot perform Delphi's design-time work on the developer's behalf. RAD Studio must install the design package through its normal Install Packages dialog, and the developer must place and configure the language manager and visible selector on the target application's primary form. These visible IDE changes are deliberate safeguards.</w:t>
+        <w:t>Before opening the Wizard, RAD Studio must install the design package through its normal Install Packages dialog. The developer then places and configures the language manager and visible selector, adds any supporting labels or other localization UI, and saves those changes. The Wizard consequently scans the completed interface once instead of requiring a scan, a component-related UI change, and a second scan.</w:t>
       </w:r>
     </w:p>
     <w:tbl>
@@ -404,6 +404,9 @@
         <w:gridCol w:w="9360"/>
       </w:tblGrid>
       <w:tr>
+        <w:trPr>
+          <w:cantSplit/>
+        </w:trPr>
         <w:tc>
           <w:tcPr>
             <w:tcW w:type="dxa" w:w="9360"/>
@@ -433,7 +436,7 @@
         <w:pStyle w:val="Heading1"/>
       </w:pPr>
       <w:r>
-        <w:t>2. Prepare Before Starting</w:t>
+        <w:t>2. Complete the RAD Studio Preparation Before Starting</w:t>
       </w:r>
     </w:p>
     <w:tbl>
@@ -691,7 +694,7 @@
           </w:tcPr>
           <w:p>
             <w:r>
-              <w:t>RAD Studio performs the approved design-package and component-placement steps.</w:t>
+              <w:t>Install the matching design package and finish the component-related UI before opening the Wizard.</w:t>
             </w:r>
           </w:p>
         </w:tc>
@@ -768,21 +771,281 @@
         </w:numPr>
       </w:pPr>
       <w:r>
-        <w:t>Open the test copy in RAD Studio, build it, run it briefly, then close RAD Studio or close the project before starting the Wizard.</w:t>
+        <w:t>Open the untouched test copy in RAD Studio, build it, and run it briefly to confirm that it is healthy before localization changes begin.</w:t>
       </w:r>
     </w:p>
     <w:p>
       <w:pPr>
+        <w:pStyle w:val="Heading2"/>
+      </w:pPr>
+      <w:r>
+        <w:t>2.1 Install the Localization Components</w:t>
+      </w:r>
+    </w:p>
+    <w:p>
+      <w:r>
+        <w:t>Complete this normally one-time RAD Studio installation before opening the Wizard. If DAT Localization is already visible in the Tool Palette for the target framework, do not reinstall it; continue with Section 2.2.</w:t>
+      </w:r>
+    </w:p>
+    <w:p>
+      <w:pPr>
         <w:pStyle w:val="ListNumber"/>
         <w:numPr>
           <w:ilvl w:val="0"/>
-          <w:numId w:val="10"/>
+          <w:numId w:val="11"/>
+        </w:numPr>
+      </w:pPr>
+      <w:r>
+        <w:t>Close the target project while changing installed packages.</w:t>
+      </w:r>
+    </w:p>
+    <w:p>
+      <w:pPr>
+        <w:pStyle w:val="ListNumber"/>
+        <w:numPr>
+          <w:ilvl w:val="0"/>
+          <w:numId w:val="11"/>
+        </w:numPr>
+      </w:pPr>
+      <w:r>
+        <w:t>In RAD Studio choose Component &gt; Install Packages. Do not choose Component &gt; Install Component.</w:t>
+      </w:r>
+    </w:p>
+    <w:p>
+      <w:pPr>
+        <w:pStyle w:val="ListNumber"/>
+        <w:numPr>
+          <w:ilvl w:val="0"/>
+          <w:numId w:val="11"/>
+        </w:numPr>
+      </w:pPr>
+      <w:r>
+        <w:t>Select Add. From the Translation Studio installation, open bin\packages\Win32\Release and select DATLanguageManagerFMXDesign.bpl for a FireMonkey project or DATLanguageManagerVCLDesign.bpl for a VCL project.</w:t>
+      </w:r>
+    </w:p>
+    <w:p>
+      <w:pPr>
+        <w:pStyle w:val="ListNumber"/>
+        <w:numPr>
+          <w:ilvl w:val="0"/>
+          <w:numId w:val="11"/>
+        </w:numPr>
+      </w:pPr>
+      <w:r>
+        <w:t>Confirm that the matching DAT Language Manager design-time package is listed and checked, then select OK.</w:t>
+      </w:r>
+    </w:p>
+    <w:p>
+      <w:pPr>
+        <w:pStyle w:val="ListNumber"/>
+        <w:numPr>
+          <w:ilvl w:val="0"/>
+          <w:numId w:val="11"/>
+        </w:numPr>
+      </w:pPr>
+      <w:r>
+        <w:t>Open a matching FMX or VCL form and confirm that DAT Localization appears in the Tool Palette with the language manager and language combo-box components.</w:t>
+      </w:r>
+    </w:p>
+    <w:tbl>
+      <w:tblPr>
+        <w:jc w:val="center"/>
+        <w:tblLook w:firstColumn="1" w:firstRow="1" w:lastColumn="0" w:lastRow="0" w:noHBand="0" w:noVBand="1" w:val="04A0"/>
+        <w:tblW w:w="9360" w:type="dxa"/>
+        <w:tblInd w:w="120" w:type="dxa"/>
+        <w:tblLayout w:type="fixed"/>
+        <w:tblCellMar>
+          <w:top w:w="80" w:type="dxa"/>
+          <w:bottom w:w="80" w:type="dxa"/>
+          <w:start w:w="120" w:type="dxa"/>
+          <w:end w:w="120" w:type="dxa"/>
+        </w:tblCellMar>
+      </w:tblPr>
+      <w:tblGrid>
+        <w:gridCol w:w="9360"/>
+      </w:tblGrid>
+      <w:tr>
+        <w:trPr>
+          <w:cantSplit/>
+        </w:trPr>
+        <w:tc>
+          <w:tcPr>
+            <w:tcW w:type="dxa" w:w="9360"/>
+            <w:shd w:fill="EAF3FF"/>
+            <w:vAlign w:val="center"/>
+          </w:tcPr>
+          <w:p>
+            <w:pPr>
+              <w:pStyle w:val="Callout"/>
+            </w:pPr>
+            <w:r>
+              <w:rPr>
+                <w:b/>
+                <w:color w:val="234C80"/>
+              </w:rPr>
+              <w:t xml:space="preserve">Install the compiled design package. </w:t>
+            </w:r>
+            <w:r>
+              <w:t>Install the stable Win32 Release design-time BPL. Do not select a .dpk source file, do not copy BPLs into Delphi folders, and do not install a package from a generated per-project kit.</w:t>
+            </w:r>
+          </w:p>
+        </w:tc>
+      </w:tr>
+    </w:tbl>
+    <w:p>
+      <w:pPr>
+        <w:pStyle w:val="Heading2"/>
+      </w:pPr>
+      <w:r>
+        <w:t>2.2 Complete and Save the Localization UI</w:t>
+      </w:r>
+    </w:p>
+    <w:p>
+      <w:r>
+        <w:t>Finish every interface change caused by adding language selection before the Wizard performs its scan. Text added here, including a Language: label, is then included in the first scan and does not require an immediate rescan.</w:t>
+      </w:r>
+    </w:p>
+    <w:p>
+      <w:pPr>
+        <w:pStyle w:val="ListNumber"/>
+        <w:numPr>
+          <w:ilvl w:val="0"/>
+          <w:numId w:val="12"/>
+        </w:numPr>
+      </w:pPr>
+      <w:r>
+        <w:t>Open the target test project and its primary form in the Form Designer.</w:t>
+      </w:r>
+    </w:p>
+    <w:p>
+      <w:pPr>
+        <w:pStyle w:val="ListNumber"/>
+        <w:numPr>
+          <w:ilvl w:val="0"/>
+          <w:numId w:val="12"/>
+        </w:numPr>
+      </w:pPr>
+      <w:r>
+        <w:t>Place one TDATFMXLanguageManager for an FMX project or one TDATVCLLanguageManager for a VCL project. One manager supervises the application; do not place one on every form.</w:t>
+      </w:r>
+    </w:p>
+    <w:p>
+      <w:pPr>
+        <w:pStyle w:val="ListNumber"/>
+        <w:numPr>
+          <w:ilvl w:val="0"/>
+          <w:numId w:val="12"/>
+        </w:numPr>
+      </w:pPr>
+      <w:r>
+        <w:t>Place the matching TDAT language combo box. In Object Inspector, set its LanguageManager property to the manager component; do not leave this property blank.</w:t>
+      </w:r>
+    </w:p>
+    <w:p>
+      <w:pPr>
+        <w:pStyle w:val="ListNumber"/>
+        <w:numPr>
+          <w:ilvl w:val="0"/>
+          <w:numId w:val="12"/>
+        </w:numPr>
+      </w:pPr>
+      <w:r>
+        <w:t>Set ApplicationId to the project filename without .dproj. For example, MyApplication.dproj uses MyApplication. Leave LanguagesFolder as Localization\Languages and set SourceLanguage to the application's source locale, such as en-US.</w:t>
+      </w:r>
+    </w:p>
+    <w:p>
+      <w:pPr>
+        <w:pStyle w:val="ListNumber"/>
+        <w:numPr>
+          <w:ilvl w:val="0"/>
+          <w:numId w:val="12"/>
+        </w:numPr>
+      </w:pPr>
+      <w:r>
+        <w:t>Add any visible supporting interface, such as a Language: label or a designer-authored language menu. Complete its wording, placement, size, font, color, alignment, and related layout changes now.</w:t>
+      </w:r>
+    </w:p>
+    <w:p>
+      <w:pPr>
+        <w:pStyle w:val="ListNumber"/>
+        <w:numPr>
+          <w:ilvl w:val="0"/>
+          <w:numId w:val="12"/>
+        </w:numPr>
+      </w:pPr>
+      <w:r>
+        <w:t>Choose File &gt; Save All. The Wizard reads saved DFM/FMX and Pascal files; it cannot scan an unsaved Form Designer buffer.</w:t>
+      </w:r>
+    </w:p>
+    <w:p>
+      <w:pPr>
+        <w:pStyle w:val="ListNumber"/>
+        <w:numPr>
+          <w:ilvl w:val="0"/>
+          <w:numId w:val="12"/>
+        </w:numPr>
+      </w:pPr>
+      <w:r>
+        <w:t>Close the target project before opening the Translation Studio. Do not worry if the newly added component units cannot compile yet: final Wizard processing configures the generated ComponentSource Search Path before the localized build.</w:t>
+      </w:r>
+    </w:p>
+    <w:p>
+      <w:pPr>
+        <w:pStyle w:val="ListNumber"/>
+        <w:numPr>
+          <w:ilvl w:val="0"/>
+          <w:numId w:val="12"/>
         </w:numPr>
       </w:pPr>
       <w:r>
         <w:t>Have the provider API key available. Do not paste it into source code, JSON files, email, screenshots, or issue reports.</w:t>
       </w:r>
     </w:p>
+    <w:tbl>
+      <w:tblPr>
+        <w:jc w:val="center"/>
+        <w:tblLook w:firstColumn="1" w:firstRow="1" w:lastColumn="0" w:lastRow="0" w:noHBand="0" w:noVBand="1" w:val="04A0"/>
+        <w:tblW w:w="9360" w:type="dxa"/>
+        <w:tblInd w:w="120" w:type="dxa"/>
+        <w:tblLayout w:type="fixed"/>
+        <w:tblCellMar>
+          <w:top w:w="80" w:type="dxa"/>
+          <w:bottom w:w="80" w:type="dxa"/>
+          <w:start w:w="120" w:type="dxa"/>
+          <w:end w:w="120" w:type="dxa"/>
+        </w:tblCellMar>
+      </w:tblPr>
+      <w:tblGrid>
+        <w:gridCol w:w="9360"/>
+      </w:tblGrid>
+      <w:tr>
+        <w:trPr>
+          <w:cantSplit/>
+        </w:trPr>
+        <w:tc>
+          <w:tcPr>
+            <w:tcW w:type="dxa" w:w="9360"/>
+            <w:shd w:fill="EAF3FF"/>
+            <w:vAlign w:val="center"/>
+          </w:tcPr>
+          <w:p>
+            <w:pPr>
+              <w:pStyle w:val="Callout"/>
+            </w:pPr>
+            <w:r>
+              <w:rPr>
+                <w:b/>
+                <w:color w:val="234C80"/>
+              </w:rPr>
+              <w:t xml:space="preserve">Why these steps come first. </w:t>
+            </w:r>
+            <w:r>
+              <w:t>The first Wizard scan now sees the manager, selector, Language: label, and every related saved UI change. Ordinarily, only one scan is needed for initial setup. Any later source-text or Form Designer change must still be saved and rescanned before export.</w:t>
+            </w:r>
+          </w:p>
+        </w:tc>
+      </w:tr>
+    </w:tbl>
     <w:p>
       <w:pPr>
         <w:pStyle w:val="Heading1"/>
@@ -796,7 +1059,7 @@
         <w:pStyle w:val="ListNumber"/>
         <w:numPr>
           <w:ilvl w:val="0"/>
-          <w:numId w:val="11"/>
+          <w:numId w:val="13"/>
         </w:numPr>
       </w:pPr>
       <w:r>
@@ -808,7 +1071,7 @@
         <w:pStyle w:val="ListNumber"/>
         <w:numPr>
           <w:ilvl w:val="0"/>
-          <w:numId w:val="11"/>
+          <w:numId w:val="13"/>
         </w:numPr>
       </w:pPr>
       <w:r>
@@ -820,7 +1083,7 @@
         <w:pStyle w:val="ListNumber"/>
         <w:numPr>
           <w:ilvl w:val="0"/>
-          <w:numId w:val="11"/>
+          <w:numId w:val="13"/>
         </w:numPr>
       </w:pPr>
       <w:r>
@@ -1062,6 +1325,9 @@
         <w:gridCol w:w="9360"/>
       </w:tblGrid>
       <w:tr>
+        <w:trPr>
+          <w:cantSplit/>
+        </w:trPr>
         <w:tc>
           <w:tcPr>
             <w:tcW w:type="dxa" w:w="9360"/>
@@ -1112,7 +1378,7 @@
         <w:pStyle w:val="ListNumber"/>
         <w:numPr>
           <w:ilvl w:val="0"/>
-          <w:numId w:val="12"/>
+          <w:numId w:val="14"/>
         </w:numPr>
       </w:pPr>
       <w:r>
@@ -1124,7 +1390,7 @@
         <w:pStyle w:val="ListNumber"/>
         <w:numPr>
           <w:ilvl w:val="0"/>
-          <w:numId w:val="12"/>
+          <w:numId w:val="14"/>
         </w:numPr>
       </w:pPr>
       <w:r>
@@ -1149,6 +1415,9 @@
         <w:gridCol w:w="9360"/>
       </w:tblGrid>
       <w:tr>
+        <w:trPr>
+          <w:cantSplit/>
+        </w:trPr>
         <w:tc>
           <w:tcPr>
             <w:tcW w:type="dxa" w:w="9360"/>
@@ -1191,7 +1460,7 @@
         <w:pStyle w:val="ListNumber"/>
         <w:numPr>
           <w:ilvl w:val="0"/>
-          <w:numId w:val="13"/>
+          <w:numId w:val="15"/>
         </w:numPr>
       </w:pPr>
       <w:r>
@@ -1203,7 +1472,7 @@
         <w:pStyle w:val="ListNumber"/>
         <w:numPr>
           <w:ilvl w:val="0"/>
-          <w:numId w:val="13"/>
+          <w:numId w:val="15"/>
         </w:numPr>
       </w:pPr>
       <w:r>
@@ -1215,7 +1484,7 @@
         <w:pStyle w:val="ListNumber"/>
         <w:numPr>
           <w:ilvl w:val="0"/>
-          <w:numId w:val="13"/>
+          <w:numId w:val="15"/>
         </w:numPr>
       </w:pPr>
       <w:r>
@@ -1227,7 +1496,7 @@
         <w:pStyle w:val="ListNumber"/>
         <w:numPr>
           <w:ilvl w:val="0"/>
-          <w:numId w:val="13"/>
+          <w:numId w:val="15"/>
         </w:numPr>
       </w:pPr>
       <w:r>
@@ -1239,7 +1508,7 @@
         <w:pStyle w:val="ListNumber"/>
         <w:numPr>
           <w:ilvl w:val="0"/>
-          <w:numId w:val="13"/>
+          <w:numId w:val="15"/>
         </w:numPr>
       </w:pPr>
       <w:r>
@@ -1251,7 +1520,7 @@
         <w:pStyle w:val="ListNumber"/>
         <w:numPr>
           <w:ilvl w:val="0"/>
-          <w:numId w:val="13"/>
+          <w:numId w:val="15"/>
         </w:numPr>
       </w:pPr>
       <w:r>
@@ -1276,6 +1545,9 @@
         <w:gridCol w:w="9360"/>
       </w:tblGrid>
       <w:tr>
+        <w:trPr>
+          <w:cantSplit/>
+        </w:trPr>
         <w:tc>
           <w:tcPr>
             <w:tcW w:type="dxa" w:w="9360"/>
@@ -1318,7 +1590,7 @@
         <w:pStyle w:val="ListNumber"/>
         <w:numPr>
           <w:ilvl w:val="0"/>
-          <w:numId w:val="14"/>
+          <w:numId w:val="16"/>
         </w:numPr>
       </w:pPr>
       <w:r>
@@ -1330,7 +1602,7 @@
         <w:pStyle w:val="ListNumber"/>
         <w:numPr>
           <w:ilvl w:val="0"/>
-          <w:numId w:val="14"/>
+          <w:numId w:val="16"/>
         </w:numPr>
       </w:pPr>
       <w:r>
@@ -1342,7 +1614,7 @@
         <w:pStyle w:val="ListNumber"/>
         <w:numPr>
           <w:ilvl w:val="0"/>
-          <w:numId w:val="14"/>
+          <w:numId w:val="16"/>
         </w:numPr>
       </w:pPr>
       <w:r>
@@ -1354,7 +1626,7 @@
         <w:pStyle w:val="ListNumber"/>
         <w:numPr>
           <w:ilvl w:val="0"/>
-          <w:numId w:val="14"/>
+          <w:numId w:val="16"/>
         </w:numPr>
       </w:pPr>
       <w:r>
@@ -1366,7 +1638,7 @@
         <w:pStyle w:val="ListNumber"/>
         <w:numPr>
           <w:ilvl w:val="0"/>
-          <w:numId w:val="14"/>
+          <w:numId w:val="16"/>
         </w:numPr>
       </w:pPr>
       <w:r>
@@ -1391,6 +1663,9 @@
         <w:gridCol w:w="9360"/>
       </w:tblGrid>
       <w:tr>
+        <w:trPr>
+          <w:cantSplit/>
+        </w:trPr>
         <w:tc>
           <w:tcPr>
             <w:tcW w:type="dxa" w:w="9360"/>
@@ -1433,7 +1708,7 @@
         <w:pStyle w:val="ListNumber"/>
         <w:numPr>
           <w:ilvl w:val="0"/>
-          <w:numId w:val="15"/>
+          <w:numId w:val="17"/>
         </w:numPr>
       </w:pPr>
       <w:r>
@@ -1445,7 +1720,7 @@
         <w:pStyle w:val="ListNumber"/>
         <w:numPr>
           <w:ilvl w:val="0"/>
-          <w:numId w:val="15"/>
+          <w:numId w:val="17"/>
         </w:numPr>
       </w:pPr>
       <w:r>
@@ -1457,7 +1732,7 @@
         <w:pStyle w:val="ListNumber"/>
         <w:numPr>
           <w:ilvl w:val="0"/>
-          <w:numId w:val="15"/>
+          <w:numId w:val="17"/>
         </w:numPr>
       </w:pPr>
       <w:r>
@@ -1469,7 +1744,7 @@
         <w:pStyle w:val="ListNumber"/>
         <w:numPr>
           <w:ilvl w:val="0"/>
-          <w:numId w:val="15"/>
+          <w:numId w:val="17"/>
         </w:numPr>
       </w:pPr>
       <w:r>
@@ -1494,6 +1769,9 @@
         <w:gridCol w:w="9360"/>
       </w:tblGrid>
       <w:tr>
+        <w:trPr>
+          <w:cantSplit/>
+        </w:trPr>
         <w:tc>
           <w:tcPr>
             <w:tcW w:type="dxa" w:w="9360"/>
@@ -1536,7 +1814,7 @@
         <w:pStyle w:val="ListNumber"/>
         <w:numPr>
           <w:ilvl w:val="0"/>
-          <w:numId w:val="16"/>
+          <w:numId w:val="18"/>
         </w:numPr>
       </w:pPr>
       <w:r>
@@ -1548,7 +1826,7 @@
         <w:pStyle w:val="ListNumber"/>
         <w:numPr>
           <w:ilvl w:val="0"/>
-          <w:numId w:val="16"/>
+          <w:numId w:val="18"/>
         </w:numPr>
       </w:pPr>
       <w:r>
@@ -1560,7 +1838,7 @@
         <w:pStyle w:val="ListNumber"/>
         <w:numPr>
           <w:ilvl w:val="0"/>
-          <w:numId w:val="16"/>
+          <w:numId w:val="18"/>
         </w:numPr>
       </w:pPr>
       <w:r>
@@ -1572,7 +1850,7 @@
         <w:pStyle w:val="ListNumber"/>
         <w:numPr>
           <w:ilvl w:val="0"/>
-          <w:numId w:val="16"/>
+          <w:numId w:val="18"/>
         </w:numPr>
       </w:pPr>
       <w:r>
@@ -1584,7 +1862,7 @@
         <w:pStyle w:val="ListNumber"/>
         <w:numPr>
           <w:ilvl w:val="0"/>
-          <w:numId w:val="16"/>
+          <w:numId w:val="18"/>
         </w:numPr>
       </w:pPr>
       <w:r>
@@ -1596,7 +1874,7 @@
         <w:pStyle w:val="ListNumber"/>
         <w:numPr>
           <w:ilvl w:val="0"/>
-          <w:numId w:val="16"/>
+          <w:numId w:val="18"/>
         </w:numPr>
       </w:pPr>
       <w:r>
@@ -1621,6 +1899,9 @@
         <w:gridCol w:w="9360"/>
       </w:tblGrid>
       <w:tr>
+        <w:trPr>
+          <w:cantSplit/>
+        </w:trPr>
         <w:tc>
           <w:tcPr>
             <w:tcW w:type="dxa" w:w="9360"/>
@@ -1668,7 +1949,7 @@
         <w:pStyle w:val="ListNumber"/>
         <w:numPr>
           <w:ilvl w:val="0"/>
-          <w:numId w:val="17"/>
+          <w:numId w:val="19"/>
         </w:numPr>
       </w:pPr>
       <w:r>
@@ -1680,7 +1961,7 @@
         <w:pStyle w:val="ListNumber"/>
         <w:numPr>
           <w:ilvl w:val="0"/>
-          <w:numId w:val="17"/>
+          <w:numId w:val="19"/>
         </w:numPr>
       </w:pPr>
       <w:r>
@@ -1692,7 +1973,7 @@
         <w:pStyle w:val="ListNumber"/>
         <w:numPr>
           <w:ilvl w:val="0"/>
-          <w:numId w:val="17"/>
+          <w:numId w:val="19"/>
         </w:numPr>
       </w:pPr>
       <w:r>
@@ -1704,7 +1985,7 @@
         <w:pStyle w:val="ListNumber"/>
         <w:numPr>
           <w:ilvl w:val="0"/>
-          <w:numId w:val="17"/>
+          <w:numId w:val="19"/>
         </w:numPr>
       </w:pPr>
       <w:r>
@@ -1716,7 +1997,7 @@
         <w:pStyle w:val="ListNumber"/>
         <w:numPr>
           <w:ilvl w:val="0"/>
-          <w:numId w:val="17"/>
+          <w:numId w:val="19"/>
         </w:numPr>
       </w:pPr>
       <w:r>
@@ -1741,6 +2022,9 @@
         <w:gridCol w:w="9360"/>
       </w:tblGrid>
       <w:tr>
+        <w:trPr>
+          <w:cantSplit/>
+        </w:trPr>
         <w:tc>
           <w:tcPr>
             <w:tcW w:type="dxa" w:w="9360"/>
@@ -1775,7 +2059,7 @@
     </w:p>
     <w:p>
       <w:r>
-        <w:t>This page explains the remaining manual RAD Studio phase that cannot safely be performed by the Wizard. The design-time BPL makes the manager and selector available on the DAT Localization Tool Palette page. Installing it is normally a one-time operation for the current RAD Studio installation; placing and arranging components remains designer-owned work.</w:t>
+        <w:t>This page restates the component requirements completed before the Wizard was opened and provides the exact project-specific values for verification. No additional component or label should normally be required now.</w:t>
       </w:r>
     </w:p>
     <w:p>
@@ -1783,11 +2067,11 @@
         <w:pStyle w:val="ListNumber"/>
         <w:numPr>
           <w:ilvl w:val="0"/>
-          <w:numId w:val="18"/>
+          <w:numId w:val="20"/>
         </w:numPr>
       </w:pPr>
       <w:r>
-        <w:t>Read every project-specific instruction shown on the page.</w:t>
+        <w:t>Read every project-specific instruction shown on the page and compare it with the component setup already saved in RAD Studio.</w:t>
       </w:r>
     </w:p>
     <w:p>
@@ -1795,11 +2079,11 @@
         <w:pStyle w:val="ListNumber"/>
         <w:numPr>
           <w:ilvl w:val="0"/>
-          <w:numId w:val="18"/>
+          <w:numId w:val="20"/>
         </w:numPr>
       </w:pPr>
       <w:r>
-        <w:t>Optionally select Show Design BPL now to confirm that the exact verified VCL or FMX Win32 Release design package exists. File Explorer selects the file; the Wizard does not install it.</w:t>
+        <w:t>Confirm that the displayed ApplicationId matches the value assigned to the manager. The project filename without .dproj is the controlling value.</w:t>
       </w:r>
     </w:p>
     <w:p>
@@ -1807,11 +2091,11 @@
         <w:pStyle w:val="ListNumber"/>
         <w:numPr>
           <w:ilvl w:val="0"/>
-          <w:numId w:val="18"/>
+          <w:numId w:val="20"/>
         </w:numPr>
       </w:pPr>
       <w:r>
-        <w:t>Select I understand this manual RAD Studio step.</w:t>
+        <w:t>Use Show Design BPL only if the DAT Localization components were not installed during Section 2.1 or the package location must be verified. File Explorer selects the package; the Wizard does not install it.</w:t>
       </w:r>
     </w:p>
     <w:p>
@@ -1819,7 +2103,19 @@
         <w:pStyle w:val="ListNumber"/>
         <w:numPr>
           <w:ilvl w:val="0"/>
-          <w:numId w:val="18"/>
+          <w:numId w:val="20"/>
+        </w:numPr>
+      </w:pPr>
+      <w:r>
+        <w:t>Select I understand this manual RAD Studio step to confirm that the pre-Wizard component setup has been completed and will be verified after final processing.</w:t>
+      </w:r>
+    </w:p>
+    <w:p>
+      <w:pPr>
+        <w:pStyle w:val="ListNumber"/>
+        <w:numPr>
+          <w:ilvl w:val="0"/>
+          <w:numId w:val="20"/>
         </w:numPr>
       </w:pPr>
       <w:r>
@@ -1844,6 +2140,9 @@
         <w:gridCol w:w="9360"/>
       </w:tblGrid>
       <w:tr>
+        <w:trPr>
+          <w:cantSplit/>
+        </w:trPr>
         <w:tc>
           <w:tcPr>
             <w:tcW w:type="dxa" w:w="9360"/>
@@ -1862,7 +2161,7 @@
               <w:t xml:space="preserve">Expected result. </w:t>
             </w:r>
             <w:r>
-              <w:t>The Wizard records that the manual step is understood; no BPL registry entry and no target-form component has been created yet.</w:t>
+              <w:t>The Wizard records the acknowledgement. It does not modify the package registry or the target form; those designer-owned changes were already completed and saved before the scan.</w:t>
             </w:r>
           </w:p>
         </w:tc>
@@ -1886,7 +2185,7 @@
         <w:pStyle w:val="ListNumber"/>
         <w:numPr>
           <w:ilvl w:val="0"/>
-          <w:numId w:val="19"/>
+          <w:numId w:val="21"/>
         </w:numPr>
       </w:pPr>
       <w:r>
@@ -1898,7 +2197,7 @@
         <w:pStyle w:val="ListNumber"/>
         <w:numPr>
           <w:ilvl w:val="0"/>
-          <w:numId w:val="19"/>
+          <w:numId w:val="21"/>
         </w:numPr>
       </w:pPr>
       <w:r>
@@ -1910,7 +2209,7 @@
         <w:pStyle w:val="ListNumber"/>
         <w:numPr>
           <w:ilvl w:val="0"/>
-          <w:numId w:val="19"/>
+          <w:numId w:val="21"/>
         </w:numPr>
       </w:pPr>
       <w:r>
@@ -1922,7 +2221,7 @@
         <w:pStyle w:val="ListNumber"/>
         <w:numPr>
           <w:ilvl w:val="0"/>
-          <w:numId w:val="19"/>
+          <w:numId w:val="21"/>
         </w:numPr>
       </w:pPr>
       <w:r>
@@ -1934,7 +2233,7 @@
         <w:pStyle w:val="ListNumber"/>
         <w:numPr>
           <w:ilvl w:val="0"/>
-          <w:numId w:val="19"/>
+          <w:numId w:val="21"/>
         </w:numPr>
       </w:pPr>
       <w:r>
@@ -1946,7 +2245,7 @@
         <w:pStyle w:val="ListNumber"/>
         <w:numPr>
           <w:ilvl w:val="0"/>
-          <w:numId w:val="19"/>
+          <w:numId w:val="21"/>
         </w:numPr>
       </w:pPr>
       <w:r>
@@ -1958,7 +2257,7 @@
         <w:pStyle w:val="ListNumber"/>
         <w:numPr>
           <w:ilvl w:val="0"/>
-          <w:numId w:val="19"/>
+          <w:numId w:val="21"/>
         </w:numPr>
       </w:pPr>
       <w:r>
@@ -1983,6 +2282,9 @@
         <w:gridCol w:w="9360"/>
       </w:tblGrid>
       <w:tr>
+        <w:trPr>
+          <w:cantSplit/>
+        </w:trPr>
         <w:tc>
           <w:tcPr>
             <w:tcW w:type="dxa" w:w="9360"/>
@@ -2030,7 +2332,7 @@
         <w:pStyle w:val="ListNumber"/>
         <w:numPr>
           <w:ilvl w:val="0"/>
-          <w:numId w:val="20"/>
+          <w:numId w:val="22"/>
         </w:numPr>
       </w:pPr>
       <w:r>
@@ -2042,7 +2344,7 @@
         <w:pStyle w:val="ListNumber"/>
         <w:numPr>
           <w:ilvl w:val="0"/>
-          <w:numId w:val="20"/>
+          <w:numId w:val="22"/>
         </w:numPr>
       </w:pPr>
       <w:r>
@@ -2054,7 +2356,7 @@
         <w:pStyle w:val="ListNumber"/>
         <w:numPr>
           <w:ilvl w:val="0"/>
-          <w:numId w:val="20"/>
+          <w:numId w:val="22"/>
         </w:numPr>
       </w:pPr>
       <w:r>
@@ -2066,7 +2368,7 @@
         <w:pStyle w:val="ListNumber"/>
         <w:numPr>
           <w:ilvl w:val="0"/>
-          <w:numId w:val="20"/>
+          <w:numId w:val="22"/>
         </w:numPr>
       </w:pPr>
       <w:r>
@@ -2078,7 +2380,7 @@
         <w:pStyle w:val="ListNumber"/>
         <w:numPr>
           <w:ilvl w:val="0"/>
-          <w:numId w:val="20"/>
+          <w:numId w:val="22"/>
         </w:numPr>
       </w:pPr>
       <w:r>
@@ -2090,7 +2392,7 @@
         <w:pStyle w:val="ListNumber"/>
         <w:numPr>
           <w:ilvl w:val="0"/>
-          <w:numId w:val="20"/>
+          <w:numId w:val="22"/>
         </w:numPr>
       </w:pPr>
       <w:r>
@@ -2102,11 +2404,11 @@
         <w:pStyle w:val="ListNumber"/>
         <w:numPr>
           <w:ilvl w:val="0"/>
-          <w:numId w:val="20"/>
+          <w:numId w:val="22"/>
         </w:numPr>
       </w:pPr>
       <w:r>
-        <w:t>Select Finish after reviewing the completion results. The Wizard closes and returns to the Studio; continue with the manual RAD Studio steps in Chapter 5.</w:t>
+        <w:t>Select Finish after reviewing the completion results. The Wizard closes and returns to the Studio; continue with the verification steps in Chapter 5.</w:t>
       </w:r>
     </w:p>
     <w:tbl>
@@ -2127,6 +2429,9 @@
         <w:gridCol w:w="9360"/>
       </w:tblGrid>
       <w:tr>
+        <w:trPr>
+          <w:cantSplit/>
+        </w:trPr>
         <w:tc>
           <w:tcPr>
             <w:tcW w:type="dxa" w:w="9360"/>
@@ -2156,12 +2461,12 @@
         <w:pStyle w:val="Heading1"/>
       </w:pPr>
       <w:r>
-        <w:t>5. Complete the Manual RAD Studio Step</w:t>
+        <w:t>5. Verify the RAD Studio Component Setup</w:t>
       </w:r>
     </w:p>
     <w:p>
       <w:r>
-        <w:t>The Wizard creates files but deliberately does not alter RAD Studio's package registry or place components on forms. Complete these steps after final processing. If DAT Localization is already visible in the Tool Palette, do not reinstall the package; proceed to component placement.</w:t>
+        <w:t>The package and component-related UI were completed before the Wizard so the first scan included all visible text. After final processing, reopen the target project and verify the saved component properties and the Search Path added by the Wizard. Do not place duplicate components.</w:t>
       </w:r>
     </w:p>
     <w:p>
@@ -2169,7 +2474,7 @@
         <w:pStyle w:val="Heading2"/>
       </w:pPr>
       <w:r>
-        <w:t>5.1 Install the Design Package</w:t>
+        <w:t>5.1 Verify the Design Package</w:t>
       </w:r>
     </w:p>
     <w:p>
@@ -2177,11 +2482,11 @@
         <w:pStyle w:val="ListNumber"/>
         <w:numPr>
           <w:ilvl w:val="0"/>
-          <w:numId w:val="21"/>
+          <w:numId w:val="23"/>
         </w:numPr>
       </w:pPr>
       <w:r>
-        <w:t>Start RAD Studio without opening the target form. If the target project opens automatically, close the project before changing installed packages.</w:t>
+        <w:t>Start RAD Studio and confirm that the matching DAT Language Manager design-time package remains enabled under Component &gt; Install Packages.</w:t>
       </w:r>
     </w:p>
     <w:p>
@@ -2189,11 +2494,11 @@
         <w:pStyle w:val="ListNumber"/>
         <w:numPr>
           <w:ilvl w:val="0"/>
-          <w:numId w:val="21"/>
+          <w:numId w:val="23"/>
         </w:numPr>
       </w:pPr>
       <w:r>
-        <w:t>In the Wizard select Show Design BPL, or browse to the exact path recorded in the completion report.</w:t>
+        <w:t>Open the target project and its primary form. Confirm that DAT Localization remains visible in the Tool Palette and that Delphi loads the saved form without a missing-class error.</w:t>
       </w:r>
     </w:p>
     <w:p>
@@ -2201,47 +2506,11 @@
         <w:pStyle w:val="ListNumber"/>
         <w:numPr>
           <w:ilvl w:val="0"/>
-          <w:numId w:val="21"/>
+          <w:numId w:val="23"/>
         </w:numPr>
       </w:pPr>
       <w:r>
-        <w:t>In RAD Studio choose Component &gt; Install Packages.</w:t>
-      </w:r>
-    </w:p>
-    <w:p>
-      <w:pPr>
-        <w:pStyle w:val="ListNumber"/>
-        <w:numPr>
-          <w:ilvl w:val="0"/>
-          <w:numId w:val="21"/>
-        </w:numPr>
-      </w:pPr>
-      <w:r>
-        <w:t>Select Add, choose DATLanguageManagerFMXDesign.bpl for an FMX target or DATLanguageManagerVCLDesign.bpl for a VCL target, and select Open.</w:t>
-      </w:r>
-    </w:p>
-    <w:p>
-      <w:pPr>
-        <w:pStyle w:val="ListNumber"/>
-        <w:numPr>
-          <w:ilvl w:val="0"/>
-          <w:numId w:val="21"/>
-        </w:numPr>
-      </w:pPr>
-      <w:r>
-        <w:t>Confirm that the DAT Language Manager design-time package appears in the package list and is checked, then select OK.</w:t>
-      </w:r>
-    </w:p>
-    <w:p>
-      <w:pPr>
-        <w:pStyle w:val="ListNumber"/>
-        <w:numPr>
-          <w:ilvl w:val="0"/>
-          <w:numId w:val="21"/>
-        </w:numPr>
-      </w:pPr>
-      <w:r>
-        <w:t>Open any matching VCL or FMX form and confirm that the DAT Localization Tool Palette page contains the language manager and language combo-box components.</w:t>
+        <w:t>If the package is unexpectedly absent, close the project and repeat Section 2.1 using the stable Win32 Release design BPL. Do not ignore a missing component class while opening the form.</w:t>
       </w:r>
     </w:p>
     <w:tbl>
@@ -2262,6 +2531,9 @@
         <w:gridCol w:w="9360"/>
       </w:tblGrid>
       <w:tr>
+        <w:trPr>
+          <w:cantSplit/>
+        </w:trPr>
         <w:tc>
           <w:tcPr>
             <w:tcW w:type="dxa" w:w="9360"/>
@@ -2277,10 +2549,10 @@
                 <w:b/>
                 <w:color w:val="234C80"/>
               </w:rPr>
-              <w:t xml:space="preserve">Use the correct Delphi command. </w:t>
+              <w:t xml:space="preserve">No reinstall is normally needed. </w:t>
             </w:r>
             <w:r>
-              <w:t>Do not use Component &gt; Install Component, do not select a .dpk, and do not install a BPL from a generated per-project kit. Install the stable Win32 Release design BPL selected by the Wizard.</w:t>
+              <w:t>A successfully installed DAT package remains registered for the current RAD Studio installation. Repeat package installation only when it is missing or disabled.</w:t>
             </w:r>
           </w:p>
         </w:tc>
@@ -2291,7 +2563,7 @@
         <w:pStyle w:val="Heading2"/>
       </w:pPr>
       <w:r>
-        <w:t>5.2 Place and Configure the Components</w:t>
+        <w:t>5.2 Verify the Saved Components</w:t>
       </w:r>
     </w:p>
     <w:p>
@@ -2299,11 +2571,11 @@
         <w:pStyle w:val="ListNumber"/>
         <w:numPr>
           <w:ilvl w:val="0"/>
-          <w:numId w:val="22"/>
+          <w:numId w:val="24"/>
         </w:numPr>
       </w:pPr>
       <w:r>
-        <w:t>Open the target test project and its primary form in the Form Designer.</w:t>
+        <w:t>Confirm that the primary form contains exactly one DAT language manager and the intended visible selector.</w:t>
       </w:r>
     </w:p>
     <w:p>
@@ -2311,11 +2583,11 @@
         <w:pStyle w:val="ListNumber"/>
         <w:numPr>
           <w:ilvl w:val="0"/>
-          <w:numId w:val="22"/>
+          <w:numId w:val="24"/>
         </w:numPr>
       </w:pPr>
       <w:r>
-        <w:t>Place one TDATFMXLanguageManager for an FMX project or one TDATVCLLanguageManager for a VCL project. One manager supervises the application; it is not placed on all forms.</w:t>
+        <w:t>Confirm that ApplicationId exactly matches the Wizard's detected value, LanguagesFolder is Localization\Languages unless intentionally customized, and SourceLanguage matches the authored source locale.</w:t>
       </w:r>
     </w:p>
     <w:p>
@@ -2323,11 +2595,11 @@
         <w:pStyle w:val="ListNumber"/>
         <w:numPr>
           <w:ilvl w:val="0"/>
-          <w:numId w:val="22"/>
+          <w:numId w:val="24"/>
         </w:numPr>
       </w:pPr>
       <w:r>
-        <w:t>Set ApplicationId to the exact value shown in Detected Application ID. For example, MyApplication.dproj produces MyApplication regardless of the containing folder name.</w:t>
+        <w:t>Confirm that the selector's LanguageManager property references the manager and that every supporting label, menu item, or other language-selection UI is present and correctly positioned.</w:t>
       </w:r>
     </w:p>
     <w:p>
@@ -2335,11 +2607,11 @@
         <w:pStyle w:val="ListNumber"/>
         <w:numPr>
           <w:ilvl w:val="0"/>
-          <w:numId w:val="22"/>
+          <w:numId w:val="24"/>
         </w:numPr>
       </w:pPr>
       <w:r>
-        <w:t>Leave LanguagesFolder as Localization\Languages unless the application has an intentional custom deployment layout.</w:t>
+        <w:t>If any visible text or Form Designer layout must be changed now, choose File &gt; Save All and run the Wizard scan again before relying on the runtime pack. A post-scan UI change cannot be added safely to the existing export without rescanning.</w:t>
       </w:r>
     </w:p>
     <w:p>
@@ -2347,35 +2619,11 @@
         <w:pStyle w:val="ListNumber"/>
         <w:numPr>
           <w:ilvl w:val="0"/>
-          <w:numId w:val="22"/>
+          <w:numId w:val="24"/>
         </w:numPr>
       </w:pPr>
       <w:r>
-        <w:t>Set SourceLanguage to en-US when English (United States) is the source.</w:t>
-      </w:r>
-    </w:p>
-    <w:p>
-      <w:pPr>
-        <w:pStyle w:val="ListNumber"/>
-        <w:numPr>
-          <w:ilvl w:val="0"/>
-          <w:numId w:val="22"/>
-        </w:numPr>
-      </w:pPr>
-      <w:r>
-        <w:t>Place the matching TDAT language combo box. In Object Inspector, set its LanguageManager property to the manager component; do not leave this property blank. Position it where users can select a language. A connected Language menu may replace the combo box, but a visible language choice is required.</w:t>
-      </w:r>
-    </w:p>
-    <w:p>
-      <w:pPr>
-        <w:pStyle w:val="ListNumber"/>
-        <w:numPr>
-          <w:ilvl w:val="0"/>
-          <w:numId w:val="22"/>
-        </w:numPr>
-      </w:pPr>
-      <w:r>
-        <w:t>Save the form and project. Delphi makes the normal visible form-resource, Pascal-field, and uses-clause changes. The Wizard has already configured the DPROJ Search Path and post-build deployment.</w:t>
+        <w:t>If verification requires no UI or source-text change, continue directly to Search Path verification and the localized build.</w:t>
       </w:r>
     </w:p>
     <w:p>
@@ -2414,6 +2662,9 @@
         <w:gridCol w:w="9360"/>
       </w:tblGrid>
       <w:tr>
+        <w:trPr>
+          <w:cantSplit/>
+        </w:trPr>
         <w:tc>
           <w:tcPr>
             <w:tcW w:type="dxa" w:w="9360"/>
@@ -2456,7 +2707,7 @@
         <w:pStyle w:val="ListNumber"/>
         <w:numPr>
           <w:ilvl w:val="0"/>
-          <w:numId w:val="23"/>
+          <w:numId w:val="25"/>
         </w:numPr>
       </w:pPr>
       <w:r>
@@ -2468,7 +2719,7 @@
         <w:pStyle w:val="ListNumber"/>
         <w:numPr>
           <w:ilvl w:val="0"/>
-          <w:numId w:val="23"/>
+          <w:numId w:val="25"/>
         </w:numPr>
       </w:pPr>
       <w:r>
@@ -2480,7 +2731,7 @@
         <w:pStyle w:val="ListNumber"/>
         <w:numPr>
           <w:ilvl w:val="0"/>
-          <w:numId w:val="23"/>
+          <w:numId w:val="25"/>
         </w:numPr>
       </w:pPr>
       <w:r>
@@ -2492,7 +2743,7 @@
         <w:pStyle w:val="ListNumber"/>
         <w:numPr>
           <w:ilvl w:val="0"/>
-          <w:numId w:val="23"/>
+          <w:numId w:val="25"/>
         </w:numPr>
       </w:pPr>
       <w:r>
@@ -2504,7 +2755,7 @@
         <w:pStyle w:val="ListNumber"/>
         <w:numPr>
           <w:ilvl w:val="0"/>
-          <w:numId w:val="23"/>
+          <w:numId w:val="25"/>
         </w:numPr>
       </w:pPr>
       <w:r>
@@ -2529,6 +2780,9 @@
         <w:gridCol w:w="9360"/>
       </w:tblGrid>
       <w:tr>
+        <w:trPr>
+          <w:cantSplit/>
+        </w:trPr>
         <w:tc>
           <w:tcPr>
             <w:tcW w:type="dxa" w:w="9360"/>
@@ -2566,7 +2820,7 @@
         <w:pStyle w:val="ListNumber"/>
         <w:numPr>
           <w:ilvl w:val="0"/>
-          <w:numId w:val="24"/>
+          <w:numId w:val="26"/>
         </w:numPr>
       </w:pPr>
       <w:r>
@@ -2578,7 +2832,7 @@
         <w:pStyle w:val="ListNumber"/>
         <w:numPr>
           <w:ilvl w:val="0"/>
-          <w:numId w:val="24"/>
+          <w:numId w:val="26"/>
         </w:numPr>
       </w:pPr>
       <w:r>
@@ -2590,7 +2844,7 @@
         <w:pStyle w:val="ListNumber"/>
         <w:numPr>
           <w:ilvl w:val="0"/>
-          <w:numId w:val="24"/>
+          <w:numId w:val="26"/>
         </w:numPr>
       </w:pPr>
       <w:r>
@@ -2602,7 +2856,7 @@
         <w:pStyle w:val="ListNumber"/>
         <w:numPr>
           <w:ilvl w:val="0"/>
-          <w:numId w:val="24"/>
+          <w:numId w:val="26"/>
         </w:numPr>
       </w:pPr>
       <w:r>
@@ -2614,7 +2868,7 @@
         <w:pStyle w:val="ListNumber"/>
         <w:numPr>
           <w:ilvl w:val="0"/>
-          <w:numId w:val="24"/>
+          <w:numId w:val="26"/>
         </w:numPr>
       </w:pPr>
       <w:r>
@@ -2626,7 +2880,7 @@
         <w:pStyle w:val="ListNumber"/>
         <w:numPr>
           <w:ilvl w:val="0"/>
-          <w:numId w:val="24"/>
+          <w:numId w:val="26"/>
         </w:numPr>
       </w:pPr>
       <w:r>
@@ -2638,7 +2892,7 @@
         <w:pStyle w:val="ListNumber"/>
         <w:numPr>
           <w:ilvl w:val="0"/>
-          <w:numId w:val="24"/>
+          <w:numId w:val="26"/>
         </w:numPr>
       </w:pPr>
       <w:r>
@@ -2650,7 +2904,7 @@
         <w:pStyle w:val="ListNumber"/>
         <w:numPr>
           <w:ilvl w:val="0"/>
-          <w:numId w:val="24"/>
+          <w:numId w:val="26"/>
         </w:numPr>
       </w:pPr>
       <w:r>
@@ -2675,6 +2929,9 @@
         <w:gridCol w:w="9360"/>
       </w:tblGrid>
       <w:tr>
+        <w:trPr>
+          <w:cantSplit/>
+        </w:trPr>
         <w:tc>
           <w:tcPr>
             <w:tcW w:type="dxa" w:w="9360"/>
@@ -3063,7 +3320,7 @@
         <w:pStyle w:val="ListNumber"/>
         <w:numPr>
           <w:ilvl w:val="0"/>
-          <w:numId w:val="25"/>
+          <w:numId w:val="27"/>
         </w:numPr>
       </w:pPr>
       <w:r>
@@ -3075,7 +3332,7 @@
         <w:pStyle w:val="ListNumber"/>
         <w:numPr>
           <w:ilvl w:val="0"/>
-          <w:numId w:val="25"/>
+          <w:numId w:val="27"/>
         </w:numPr>
       </w:pPr>
       <w:r>
@@ -3087,7 +3344,7 @@
         <w:pStyle w:val="ListNumber"/>
         <w:numPr>
           <w:ilvl w:val="0"/>
-          <w:numId w:val="25"/>
+          <w:numId w:val="27"/>
         </w:numPr>
       </w:pPr>
       <w:r>
@@ -3099,7 +3356,7 @@
         <w:pStyle w:val="ListNumber"/>
         <w:numPr>
           <w:ilvl w:val="0"/>
-          <w:numId w:val="25"/>
+          <w:numId w:val="27"/>
         </w:numPr>
       </w:pPr>
       <w:r>
@@ -3111,7 +3368,7 @@
         <w:pStyle w:val="ListNumber"/>
         <w:numPr>
           <w:ilvl w:val="0"/>
-          <w:numId w:val="25"/>
+          <w:numId w:val="27"/>
         </w:numPr>
       </w:pPr>
       <w:r>
@@ -3123,7 +3380,7 @@
         <w:pStyle w:val="ListNumber"/>
         <w:numPr>
           <w:ilvl w:val="0"/>
-          <w:numId w:val="25"/>
+          <w:numId w:val="27"/>
         </w:numPr>
       </w:pPr>
       <w:r>
@@ -3135,7 +3392,7 @@
         <w:pStyle w:val="ListNumber"/>
         <w:numPr>
           <w:ilvl w:val="0"/>
-          <w:numId w:val="25"/>
+          <w:numId w:val="27"/>
         </w:numPr>
       </w:pPr>
       <w:r>
@@ -3147,7 +3404,7 @@
         <w:pStyle w:val="ListNumber"/>
         <w:numPr>
           <w:ilvl w:val="0"/>
-          <w:numId w:val="25"/>
+          <w:numId w:val="27"/>
         </w:numPr>
       </w:pPr>
       <w:r>
@@ -3172,6 +3429,9 @@
         <w:gridCol w:w="9360"/>
       </w:tblGrid>
       <w:tr>
+        <w:trPr>
+          <w:cantSplit/>
+        </w:trPr>
         <w:tc>
           <w:tcPr>
             <w:tcW w:type="dxa" w:w="9360"/>
@@ -4235,6 +4495,18 @@
       <w:startOverride w:val="1"/>
     </w:lvlOverride>
   </w:num>
+  <w:num w:numId="26">
+    <w:abstractNumId w:val="7"/>
+    <w:lvlOverride w:ilvl="0">
+      <w:startOverride w:val="1"/>
+    </w:lvlOverride>
+  </w:num>
+  <w:num w:numId="27">
+    <w:abstractNumId w:val="7"/>
+    <w:lvlOverride w:ilvl="0">
+      <w:startOverride w:val="1"/>
+    </w:lvlOverride>
+  </w:num>
 </w:numbering>
 </file>
 

</xml_diff>

<commit_message>
Add landing screen and wizard build choices
</commit_message>
<xml_diff>
--- a/docs/guides/Delphi App Translation Studio Setup Wizard Guide.docx
+++ b/docs/guides/Delphi App Translation Studio Setup Wizard Guide.docx
@@ -378,7 +378,7 @@
     </w:p>
     <w:p>
       <w:r>
-        <w:t>At completion, the developer has a saved development catalog, compact JSON runtime language packs, a component integration kit, a required safety backup, and automatic build deployment. Pascal, DFM, FMX, and DPR files remain untouched. The Wizard adds one clearly marked, backed-up block to the DPROJ for the ComponentSource Search Path and post-build language-pack deployment.</w:t>
+        <w:t>At completion, the developer has a saved development catalog, compact JSON runtime language packs, a component integration kit, a required safety backup, and automatic build deployment. Pascal, DFM, FMX, and DPR files remain untouched. The Wizard adds one clearly marked, backed-up block to the DPROJ for the ComponentSource Search Path and post-build language-pack deployment. The Finish page also offers an optional build-and-deploy action so the selected Win32/Win64 Debug/Release outputs can be produced without leaving the Wizard.</w:t>
       </w:r>
     </w:p>
     <w:p>
@@ -1075,7 +1075,7 @@
         </w:numPr>
       </w:pPr>
       <w:r>
-        <w:t>On the Project page, select Start Setup Wizard. The separate Open Project button begins the advanced manual workflow and is not required for this guide.</w:t>
+        <w:t>On the landing screen, select Run Setup Wizard. The separate Open Maintenance Studio path begins the advanced manual workflow and is not required for this guide.</w:t>
       </w:r>
     </w:p>
     <w:p>
@@ -2408,6 +2408,30 @@
         </w:numPr>
       </w:pPr>
       <w:r>
+        <w:t>In the Build the application now? card, optionally select Build now, choose Win32 only, Win64 only, or Win32 and Win64, choose Debug only, Release only, or Debug and Release, and select Build and Deploy Selected Targets. The progress message reports each target and deployment result. Leave Build now clear if you want to finish without compiling.</w:t>
+      </w:r>
+    </w:p>
+    <w:p>
+      <w:pPr>
+        <w:pStyle w:val="ListNumber"/>
+        <w:numPr>
+          <w:ilvl w:val="0"/>
+          <w:numId w:val="22"/>
+        </w:numPr>
+      </w:pPr>
+      <w:r>
+        <w:t>If a selected build fails, correct the Delphi project or environment, run the Wizard again, and repeat the build choice. A failed build does not invalidate the already-created catalog, pack, backup, or kit.</w:t>
+      </w:r>
+    </w:p>
+    <w:p>
+      <w:pPr>
+        <w:pStyle w:val="ListNumber"/>
+        <w:numPr>
+          <w:ilvl w:val="0"/>
+          <w:numId w:val="22"/>
+        </w:numPr>
+      </w:pPr>
+      <w:r>
         <w:t>Select Finish after reviewing the completion results. The Wizard closes and returns to the Studio; continue with the verification steps in Chapter 5.</w:t>
       </w:r>
     </w:p>
@@ -2699,7 +2723,7 @@
     </w:p>
     <w:p>
       <w:r>
-        <w:t>The JSON packs must be beside each executable under Localization\Languages. The Wizard configures a post-build event that uses Delphi's active DCC_ExeOutput value, so Debug, Release, Win32, Win64, and intentional custom output paths are handled by the build that produced the executable.</w:t>
+        <w:t>The JSON packs must be beside each executable under Localization\Languages. The Wizard configures a post-build event that uses Delphi's active DCC_ExeOutput value, so Debug, Release, Win32, Win64, and intentional custom output paths are handled by the build that produced the executable. If the Finish-page build action was used, this deployment has already occurred for each successful selected target.</w:t>
       </w:r>
     </w:p>
     <w:p>

</xml_diff>

<commit_message>
Return canceled wizard to landing screen
</commit_message>
<xml_diff>
--- a/docs/guides/Delphi App Translation Studio Setup Wizard Guide.docx
+++ b/docs/guides/Delphi App Translation Studio Setup Wizard Guide.docx
@@ -1247,7 +1247,7 @@
           </w:tcPr>
           <w:p>
             <w:r>
-              <w:t>Closes the Wizard before final processing. The target project remains unchanged; a deliberately saved provider credential may remain in Windows Credential Manager.</w:t>
+              <w:t>Closes the Wizard before final processing and returns to the Studio landing screen. The target project remains unchanged; a deliberately saved provider credential may remain in Windows Credential Manager.</w:t>
             </w:r>
           </w:p>
         </w:tc>
@@ -1346,7 +1346,7 @@
               <w:t xml:space="preserve">Cancel boundary. </w:t>
             </w:r>
             <w:r>
-              <w:t>Cancel is safe through the Review and Authorize page, before Begin Final Processing is selected. During final processing the Wizard cannot be closed. If a failure occurs after the controlled DPROJ update, the transaction restores the prior project configuration automatically. Pascal and form source are not rewritten.</w:t>
+              <w:t>Cancel is safe through the Review and Authorize page, before Begin Final Processing is selected. Cancel returns to the landing screen, where the developer may start the Wizard again or select Maintenance Studio. During final processing the Wizard cannot be closed. If a failure occurs after the controlled DPROJ update, the transaction restores the prior project configuration automatically. Pascal and form source are not rewritten.</w:t>
             </w:r>
           </w:p>
         </w:tc>

</xml_diff>

<commit_message>
docs: refresh wizard guide and remove personal screenshots
</commit_message>
<xml_diff>
--- a/docs/guides/Delphi App Translation Studio Setup Wizard Guide.docx
+++ b/docs/guides/Delphi App Translation Studio Setup Wizard Guide.docx
@@ -112,7 +112,7 @@
         </w:rPr>
         <w:t>Version 1.0</w:t>
         <w:br/>
-        <w:t>Last changed: August 30, 2026</w:t>
+        <w:t>Last changed: August 31, 2026</w:t>
         <w:br/>
         <w:t>Windows • Delphi VCL and FireMonkey • Win32 and Win64</w:t>
       </w:r>
@@ -276,7 +276,7 @@
                 <w:color w:val="5D7693"/>
                 <w:sz w:val="18"/>
               </w:rPr>
-              <w:t>3</w:t>
+              <w:t>4</w:t>
             </w:r>
           </w:p>
         </w:tc>
@@ -358,7 +358,7 @@
                 <w:color w:val="5D7693"/>
                 <w:sz w:val="18"/>
               </w:rPr>
-              <w:t>6</w:t>
+              <w:t>7</w:t>
             </w:r>
           </w:p>
         </w:tc>
@@ -399,7 +399,7 @@
                 <w:color w:val="5D7693"/>
                 <w:sz w:val="18"/>
               </w:rPr>
-              <w:t>8</w:t>
+              <w:t>9</w:t>
             </w:r>
           </w:p>
         </w:tc>
@@ -421,47 +421,6 @@
                 <w:sz w:val="18"/>
               </w:rPr>
               <w:t>7. Step 4 - Languages</w:t>
-            </w:r>
-          </w:p>
-        </w:tc>
-        <w:tc>
-          <w:tcPr>
-            <w:tcW w:type="dxa" w:w="1160"/>
-          </w:tcPr>
-          <w:p>
-            <w:pPr>
-              <w:spacing w:after="20"/>
-              <w:jc w:val="right"/>
-            </w:pPr>
-            <w:r>
-              <w:rPr>
-                <w:rFonts w:ascii="Aptos" w:hAnsi="Aptos"/>
-                <w:b/>
-                <w:color w:val="5D7693"/>
-                <w:sz w:val="18"/>
-              </w:rPr>
-              <w:t>10</w:t>
-            </w:r>
-          </w:p>
-        </w:tc>
-      </w:tr>
-      <w:tr>
-        <w:tc>
-          <w:tcPr>
-            <w:tcW w:type="dxa" w:w="8200"/>
-          </w:tcPr>
-          <w:p>
-            <w:pPr>
-              <w:keepLines/>
-              <w:spacing w:after="20"/>
-            </w:pPr>
-            <w:r>
-              <w:rPr>
-                <w:rFonts w:ascii="Aptos" w:hAnsi="Aptos"/>
-                <w:color w:val="234C80"/>
-                <w:sz w:val="18"/>
-              </w:rPr>
-              <w:t>8. Step 5 - Translation Service</w:t>
             </w:r>
           </w:p>
         </w:tc>
@@ -502,7 +461,7 @@
                 <w:color w:val="234C80"/>
                 <w:sz w:val="18"/>
               </w:rPr>
-              <w:t>9. Step 6 - Scan Project</w:t>
+              <w:t>8. Step 5 - Translation Service</w:t>
             </w:r>
           </w:p>
         </w:tc>
@@ -522,7 +481,48 @@
                 <w:color w:val="5D7693"/>
                 <w:sz w:val="18"/>
               </w:rPr>
-              <w:t>13</w:t>
+              <w:t>12</w:t>
+            </w:r>
+          </w:p>
+        </w:tc>
+      </w:tr>
+      <w:tr>
+        <w:tc>
+          <w:tcPr>
+            <w:tcW w:type="dxa" w:w="8200"/>
+          </w:tcPr>
+          <w:p>
+            <w:pPr>
+              <w:keepLines/>
+              <w:spacing w:after="20"/>
+            </w:pPr>
+            <w:r>
+              <w:rPr>
+                <w:rFonts w:ascii="Aptos" w:hAnsi="Aptos"/>
+                <w:color w:val="234C80"/>
+                <w:sz w:val="18"/>
+              </w:rPr>
+              <w:t>9. Step 6 - Scan Project</w:t>
+            </w:r>
+          </w:p>
+        </w:tc>
+        <w:tc>
+          <w:tcPr>
+            <w:tcW w:type="dxa" w:w="1160"/>
+          </w:tcPr>
+          <w:p>
+            <w:pPr>
+              <w:spacing w:after="20"/>
+              <w:jc w:val="right"/>
+            </w:pPr>
+            <w:r>
+              <w:rPr>
+                <w:rFonts w:ascii="Aptos" w:hAnsi="Aptos"/>
+                <w:b/>
+                <w:color w:val="5D7693"/>
+                <w:sz w:val="18"/>
+              </w:rPr>
+              <w:t>14</w:t>
             </w:r>
           </w:p>
         </w:tc>
@@ -544,47 +544,6 @@
                 <w:sz w:val="18"/>
               </w:rPr>
               <w:t>10. Step 7 - Review and Authorize</w:t>
-            </w:r>
-          </w:p>
-        </w:tc>
-        <w:tc>
-          <w:tcPr>
-            <w:tcW w:type="dxa" w:w="1160"/>
-          </w:tcPr>
-          <w:p>
-            <w:pPr>
-              <w:spacing w:after="20"/>
-              <w:jc w:val="right"/>
-            </w:pPr>
-            <w:r>
-              <w:rPr>
-                <w:rFonts w:ascii="Aptos" w:hAnsi="Aptos"/>
-                <w:b/>
-                <w:color w:val="5D7693"/>
-                <w:sz w:val="18"/>
-              </w:rPr>
-              <w:t>15</w:t>
-            </w:r>
-          </w:p>
-        </w:tc>
-      </w:tr>
-      <w:tr>
-        <w:tc>
-          <w:tcPr>
-            <w:tcW w:type="dxa" w:w="8200"/>
-          </w:tcPr>
-          <w:p>
-            <w:pPr>
-              <w:keepLines/>
-              <w:spacing w:after="20"/>
-            </w:pPr>
-            <w:r>
-              <w:rPr>
-                <w:rFonts w:ascii="Aptos" w:hAnsi="Aptos"/>
-                <w:color w:val="234C80"/>
-                <w:sz w:val="18"/>
-              </w:rPr>
-              <w:t>11. Localization Review During Final Processing</w:t>
             </w:r>
           </w:p>
         </w:tc>
@@ -625,7 +584,7 @@
                 <w:color w:val="234C80"/>
                 <w:sz w:val="18"/>
               </w:rPr>
-              <w:t>12. Step 8 - Process and Finish</w:t>
+              <w:t>11. Localization Review During Final Processing</w:t>
             </w:r>
           </w:p>
         </w:tc>
@@ -666,48 +625,7 @@
                 <w:color w:val="234C80"/>
                 <w:sz w:val="18"/>
               </w:rPr>
-              <w:t>13. Component Kit and dependencies Folder</w:t>
-            </w:r>
-          </w:p>
-        </w:tc>
-        <w:tc>
-          <w:tcPr>
-            <w:tcW w:type="dxa" w:w="1160"/>
-          </w:tcPr>
-          <w:p>
-            <w:pPr>
-              <w:spacing w:after="20"/>
-              <w:jc w:val="right"/>
-            </w:pPr>
-            <w:r>
-              <w:rPr>
-                <w:rFonts w:ascii="Aptos" w:hAnsi="Aptos"/>
-                <w:b/>
-                <w:color w:val="5D7693"/>
-                <w:sz w:val="18"/>
-              </w:rPr>
-              <w:t>18</w:t>
-            </w:r>
-          </w:p>
-        </w:tc>
-      </w:tr>
-      <w:tr>
-        <w:tc>
-          <w:tcPr>
-            <w:tcW w:type="dxa" w:w="8200"/>
-          </w:tcPr>
-          <w:p>
-            <w:pPr>
-              <w:keepLines/>
-              <w:spacing w:after="20"/>
-            </w:pPr>
-            <w:r>
-              <w:rPr>
-                <w:rFonts w:ascii="Aptos" w:hAnsi="Aptos"/>
-                <w:color w:val="234C80"/>
-                <w:sz w:val="18"/>
-              </w:rPr>
-              <w:t>14. Delphi Compiler Search Path</w:t>
+              <w:t>12. Step 8 - Process and Finish</w:t>
             </w:r>
           </w:p>
         </w:tc>
@@ -748,7 +666,7 @@
                 <w:color w:val="234C80"/>
                 <w:sz w:val="18"/>
               </w:rPr>
-              <w:t>15. Files and Folders Created or Used</w:t>
+              <w:t>13. Component Kit and dependencies Folder</w:t>
             </w:r>
           </w:p>
         </w:tc>
@@ -789,7 +707,7 @@
                 <w:color w:val="234C80"/>
                 <w:sz w:val="18"/>
               </w:rPr>
-              <w:t>16. Build and Deployment Procedure</w:t>
+              <w:t>14. Delphi Compiler Search Path</w:t>
             </w:r>
           </w:p>
         </w:tc>
@@ -830,7 +748,7 @@
                 <w:color w:val="234C80"/>
                 <w:sz w:val="18"/>
               </w:rPr>
-              <w:t>17. Complete Runtime Verification</w:t>
+              <w:t>15. Files and Folders Created or Used</w:t>
             </w:r>
           </w:p>
         </w:tc>
@@ -871,48 +789,7 @@
                 <w:color w:val="234C80"/>
                 <w:sz w:val="18"/>
               </w:rPr>
-              <w:t>18. Updating, Resuming, and Adding Languages</w:t>
-            </w:r>
-          </w:p>
-        </w:tc>
-        <w:tc>
-          <w:tcPr>
-            <w:tcW w:type="dxa" w:w="1160"/>
-          </w:tcPr>
-          <w:p>
-            <w:pPr>
-              <w:spacing w:after="20"/>
-              <w:jc w:val="right"/>
-            </w:pPr>
-            <w:r>
-              <w:rPr>
-                <w:rFonts w:ascii="Aptos" w:hAnsi="Aptos"/>
-                <w:b/>
-                <w:color w:val="5D7693"/>
-                <w:sz w:val="18"/>
-              </w:rPr>
-              <w:t>22</w:t>
-            </w:r>
-          </w:p>
-        </w:tc>
-      </w:tr>
-      <w:tr>
-        <w:tc>
-          <w:tcPr>
-            <w:tcW w:type="dxa" w:w="8200"/>
-          </w:tcPr>
-          <w:p>
-            <w:pPr>
-              <w:keepLines/>
-              <w:spacing w:after="20"/>
-            </w:pPr>
-            <w:r>
-              <w:rPr>
-                <w:rFonts w:ascii="Aptos" w:hAnsi="Aptos"/>
-                <w:color w:val="234C80"/>
-                <w:sz w:val="18"/>
-              </w:rPr>
-              <w:t>19. Failure Recovery and Troubleshooting</w:t>
+              <w:t>16. Build and Deployment Procedure</w:t>
             </w:r>
           </w:p>
         </w:tc>
@@ -953,7 +830,7 @@
                 <w:color w:val="234C80"/>
                 <w:sz w:val="18"/>
               </w:rPr>
-              <w:t>20. Security and Privacy</w:t>
+              <w:t>17. Complete Runtime Verification</w:t>
             </w:r>
           </w:p>
         </w:tc>
@@ -994,7 +871,48 @@
                 <w:color w:val="234C80"/>
                 <w:sz w:val="18"/>
               </w:rPr>
-              <w:t>21. Printable Completion Checklist</w:t>
+              <w:t>18. Updating, Resuming, and Adding Languages</w:t>
+            </w:r>
+          </w:p>
+        </w:tc>
+        <w:tc>
+          <w:tcPr>
+            <w:tcW w:type="dxa" w:w="1160"/>
+          </w:tcPr>
+          <w:p>
+            <w:pPr>
+              <w:spacing w:after="20"/>
+              <w:jc w:val="right"/>
+            </w:pPr>
+            <w:r>
+              <w:rPr>
+                <w:rFonts w:ascii="Aptos" w:hAnsi="Aptos"/>
+                <w:b/>
+                <w:color w:val="5D7693"/>
+                <w:sz w:val="18"/>
+              </w:rPr>
+              <w:t>24</w:t>
+            </w:r>
+          </w:p>
+        </w:tc>
+      </w:tr>
+      <w:tr>
+        <w:tc>
+          <w:tcPr>
+            <w:tcW w:type="dxa" w:w="8200"/>
+          </w:tcPr>
+          <w:p>
+            <w:pPr>
+              <w:keepLines/>
+              <w:spacing w:after="20"/>
+            </w:pPr>
+            <w:r>
+              <w:rPr>
+                <w:rFonts w:ascii="Aptos" w:hAnsi="Aptos"/>
+                <w:color w:val="234C80"/>
+                <w:sz w:val="18"/>
+              </w:rPr>
+              <w:t>19. Failure Recovery and Troubleshooting</w:t>
             </w:r>
           </w:p>
         </w:tc>
@@ -1035,7 +953,7 @@
                 <w:color w:val="234C80"/>
                 <w:sz w:val="18"/>
               </w:rPr>
-              <w:t>22. Quick Reference</w:t>
+              <w:t>20. Security and Privacy</w:t>
             </w:r>
           </w:p>
         </w:tc>
@@ -1056,6 +974,88 @@
                 <w:sz w:val="18"/>
               </w:rPr>
               <w:t>26</w:t>
+            </w:r>
+          </w:p>
+        </w:tc>
+      </w:tr>
+      <w:tr>
+        <w:tc>
+          <w:tcPr>
+            <w:tcW w:type="dxa" w:w="8200"/>
+          </w:tcPr>
+          <w:p>
+            <w:pPr>
+              <w:keepLines/>
+              <w:spacing w:after="20"/>
+            </w:pPr>
+            <w:r>
+              <w:rPr>
+                <w:rFonts w:ascii="Aptos" w:hAnsi="Aptos"/>
+                <w:color w:val="234C80"/>
+                <w:sz w:val="18"/>
+              </w:rPr>
+              <w:t>21. Printable Completion Checklist</w:t>
+            </w:r>
+          </w:p>
+        </w:tc>
+        <w:tc>
+          <w:tcPr>
+            <w:tcW w:type="dxa" w:w="1160"/>
+          </w:tcPr>
+          <w:p>
+            <w:pPr>
+              <w:spacing w:after="20"/>
+              <w:jc w:val="right"/>
+            </w:pPr>
+            <w:r>
+              <w:rPr>
+                <w:rFonts w:ascii="Aptos" w:hAnsi="Aptos"/>
+                <w:b/>
+                <w:color w:val="5D7693"/>
+                <w:sz w:val="18"/>
+              </w:rPr>
+              <w:t>27</w:t>
+            </w:r>
+          </w:p>
+        </w:tc>
+      </w:tr>
+      <w:tr>
+        <w:tc>
+          <w:tcPr>
+            <w:tcW w:type="dxa" w:w="8200"/>
+          </w:tcPr>
+          <w:p>
+            <w:pPr>
+              <w:keepLines/>
+              <w:spacing w:after="20"/>
+            </w:pPr>
+            <w:r>
+              <w:rPr>
+                <w:rFonts w:ascii="Aptos" w:hAnsi="Aptos"/>
+                <w:color w:val="234C80"/>
+                <w:sz w:val="18"/>
+              </w:rPr>
+              <w:t>22. Quick Reference</w:t>
+            </w:r>
+          </w:p>
+        </w:tc>
+        <w:tc>
+          <w:tcPr>
+            <w:tcW w:type="dxa" w:w="1160"/>
+          </w:tcPr>
+          <w:p>
+            <w:pPr>
+              <w:spacing w:after="20"/>
+              <w:jc w:val="right"/>
+            </w:pPr>
+            <w:r>
+              <w:rPr>
+                <w:rFonts w:ascii="Aptos" w:hAnsi="Aptos"/>
+                <w:b/>
+                <w:color w:val="5D7693"/>
+                <w:sz w:val="18"/>
+              </w:rPr>
+              <w:t>28</w:t>
             </w:r>
           </w:p>
         </w:tc>
@@ -1084,17 +1084,22 @@
     </w:p>
     <w:p>
       <w:r>
-        <w:t>This guide is the complete operating procedure for the eight-step Translation Setup Wizard. It is intended for a Delphi developer who is localizing a VCL or FireMonkey application for the first time, repeating a translation after source changes, or adding another language to an existing application.</w:t>
+        <w:t>Welcome to the Translation Setup Wizard. This guide walks beside you through all eight steps, explains what each choice means, and tells you what to look for before you move on. Use it for a first VCL or FireMonkey translation, for a later update after source changes, or when you want to add another language.</w:t>
       </w:r>
     </w:p>
     <w:p>
       <w:r>
-        <w:t>The Wizard reads the selected Delphi project, creates or merges a development catalog, translates only eligible unresolved material, opens Localization Review, validates the result, exports a canonical English source pack and translated pack, generates a component integration kit, and deploys packs to detected and authorized application folders. The target Pascal, DFM, FMX, DPR, and DPROJ files remain unchanged.</w:t>
+        <w:t>You do not need to memorize the whole process. Follow the screens in order on your first run, and return to the individual step sections whenever you need a reminder. Each section includes the complete screen, a closer view of the important controls, and a plain-language explanation of what happens next.</w:t>
       </w:r>
     </w:p>
     <w:p>
       <w:r>
-        <w:t>The deployed application remains offline. DeepL or Google is contacted only by the Studio on the developer computer. The target application reads validated local JSON packs and never receives the provider API key.</w:t>
+        <w:t>During a normal run, the Wizard reads your selected Delphi project, creates or merges its development catalog, translates only eligible unresolved material, opens Localization Review, validates the result, exports the canonical source and translated packs, prepares the component integration kit, and deploys packs to the folders you approved. It leaves the target Pascal, DFM, FMX, DPR, and DPROJ files unchanged.</w:t>
+      </w:r>
+    </w:p>
+    <w:p>
+      <w:r>
+        <w:t>Your finished application remains offline. Only the Studio contacts DeepL or Google, and it does so from the developer computer while translation work is under way. The application you ship reads validated local JSON packs and never receives the provider API key.</w:t>
       </w:r>
     </w:p>
     <w:tbl>
@@ -1134,10 +1139,10 @@
                 <w:b/>
                 <w:color w:val="234C80"/>
               </w:rPr>
-              <w:t xml:space="preserve">Recommended safety boundary. </w:t>
-            </w:r>
-            <w:r>
-              <w:t>Use a pristine backup and a separate test copy of the target project. A successful Wizard run is reversible because it writes Studio workspace/export artifacts and deployed packs, not application source or project files.</w:t>
+              <w:t xml:space="preserve">Start with a safe copy. </w:t>
+            </w:r>
+            <w:r>
+              <w:t>Keep a pristine backup and perform the first localization run on a separate test copy of the target project. This gives you an easy way back while you learn the workflow. The Wizard also creates its own timestamped safety ZIP before final processing.</w:t>
             </w:r>
           </w:p>
         </w:tc>
@@ -1448,6 +1453,11 @@
       </w:pPr>
       <w:r>
         <w:t>2. Before Opening the Wizard</w:t>
+      </w:r>
+    </w:p>
+    <w:p>
+      <w:r>
+        <w:t>A few minutes of preparation makes the Wizard much easier to use. Complete the checks below once, then keep this section nearby as your setup checklist.</w:t>
       </w:r>
     </w:p>
     <w:p>
@@ -1635,10 +1645,10 @@
                 <w:b/>
                 <w:color w:val="234C80"/>
               </w:rPr>
-              <w:t xml:space="preserve">Designer-first rule. </w:t>
-            </w:r>
-            <w:r>
-              <w:t>The supplied manager and selector are normal designer components. Configure them in Object Inspector. The Wizard does not inject runtime UI construction or silently rewrite the form.</w:t>
+              <w:t xml:space="preserve">Keep the setup visible in Delphi. </w:t>
+            </w:r>
+            <w:r>
+              <w:t>The supplied manager and selector are normal designer components. Place and configure them in the Form Designer and Object Inspector so another developer can see and maintain the setup later. The Wizard does not inject hidden runtime UI construction or silently rewrite the form.</w:t>
             </w:r>
           </w:p>
         </w:tc>
@@ -1700,7 +1710,7 @@
       <w:r>
         <w:drawing>
           <wp:inline xmlns:a="http://schemas.openxmlformats.org/drawingml/2006/main" xmlns:pic="http://schemas.openxmlformats.org/drawingml/2006/picture">
-            <wp:extent cx="5897880" cy="3888353"/>
+            <wp:extent cx="5897880" cy="3864317"/>
             <wp:docPr id="2" name="Picture 2" descr="Translation Setup Wizard Welcome screen with step rail, content panel, Back, Next, and Cancel controls" title="Translation Setup Wizard Welcome screen with step rail, content panel, Back, Next, and Cancel controls"/>
             <wp:cNvGraphicFramePr>
               <a:graphicFrameLocks noChangeAspect="1"/>
@@ -1721,7 +1731,7 @@
                   <pic:spPr>
                     <a:xfrm>
                       <a:off x="0" y="0"/>
-                      <a:ext cx="5897880" cy="3888353"/>
+                      <a:ext cx="5897880" cy="3864317"/>
                     </a:xfrm>
                     <a:prstGeom prst="rect"/>
                   </pic:spPr>
@@ -2121,10 +2131,10 @@
                 <w:b/>
                 <w:color w:val="234C80"/>
               </w:rPr>
-              <w:t xml:space="preserve">Final-processing boundary. </w:t>
-            </w:r>
-            <w:r>
-              <w:t>Before Begin Final Processing, Cancel leaves the target unchanged. During processing, closing is blocked while an active operation must finish or stop safely. On success Back and Cancel disappear because Finish is the only meaningful close action.</w:t>
+              <w:t xml:space="preserve">You stay in control until processing begins. </w:t>
+            </w:r>
+            <w:r>
+              <w:t>Before you select Begin Final Processing, Cancel leaves the target unchanged. Once processing starts, the Wizard briefly blocks unsafe navigation while the active operation finishes or stops safely. After a successful run, Back and Cancel disappear because Finish is the only action you need.</w:t>
             </w:r>
           </w:p>
         </w:tc>
@@ -2146,7 +2156,7 @@
       <w:r>
         <w:drawing>
           <wp:inline xmlns:a="http://schemas.openxmlformats.org/drawingml/2006/main" xmlns:pic="http://schemas.openxmlformats.org/drawingml/2006/picture">
-            <wp:extent cx="5897880" cy="3888353"/>
+            <wp:extent cx="5897880" cy="3864317"/>
             <wp:docPr id="3" name="Picture 3" descr="Welcome page explaining the Wizard and safety boundary" title="Welcome page explaining the Wizard and safety boundary"/>
             <wp:cNvGraphicFramePr>
               <a:graphicFrameLocks noChangeAspect="1"/>
@@ -2167,7 +2177,7 @@
                   <pic:spPr>
                     <a:xfrm>
                       <a:off x="0" y="0"/>
-                      <a:ext cx="5897880" cy="3888353"/>
+                      <a:ext cx="5897880" cy="3864317"/>
                     </a:xfrm>
                     <a:prstGeom prst="rect"/>
                   </pic:spPr>
@@ -2215,7 +2225,7 @@
                   </pic:nvPicPr>
                   <pic:blipFill>
                     <a:blip r:embed="rId16"/>
-                    <a:srcRect l="56000" t="76000" r="0" b="0"/>
+                    <a:srcRect l="55700" t="75700" r="0" b="0"/>
                     <a:stretch>
                       <a:fillRect/>
                     </a:stretch>
@@ -2251,12 +2261,12 @@
     </w:p>
     <w:p>
       <w:r>
-        <w:t>The Welcome page establishes what the Wizard will identify and produce. At this point no project is selected and no provider request, scan, backup, export, or deployment has started.</w:t>
+        <w:t>The Welcome page is a quiet starting point. Nothing has been scanned, translated, backed up, exported, or deployed yet, so you can read the overview without affecting a project.</w:t>
       </w:r>
     </w:p>
     <w:p>
       <w:r>
-        <w:t>Read the safety notice. It explains that final processing creates a backup and Studio-owned artifacts while target Pascal, form, DPR, and DPROJ files remain read-only. Press Enter or select Next.</w:t>
+        <w:t>Read the safety notice, then press Enter or select Next. The notice explains that final processing creates a backup and Studio-owned artifacts while your target Pascal, form, DPR, and DPROJ files remain read-only.</w:t>
       </w:r>
     </w:p>
     <w:tbl>
@@ -2460,7 +2470,7 @@
       <w:r>
         <w:drawing>
           <wp:inline xmlns:a="http://schemas.openxmlformats.org/drawingml/2006/main" xmlns:pic="http://schemas.openxmlformats.org/drawingml/2006/picture">
-            <wp:extent cx="5897880" cy="3317558"/>
+            <wp:extent cx="5897880" cy="3889262"/>
             <wp:docPr id="5" name="Picture 5" descr="Delphi Project page with project path, Browse, detected framework, application ID, targets, forms, and source units" title="Delphi Project page with project path, Browse, detected framework, application ID, targets, forms, and source units"/>
             <wp:cNvGraphicFramePr>
               <a:graphicFrameLocks noChangeAspect="1"/>
@@ -2481,7 +2491,7 @@
                   <pic:spPr>
                     <a:xfrm>
                       <a:off x="0" y="0"/>
-                      <a:ext cx="5897880" cy="3317558"/>
+                      <a:ext cx="5897880" cy="3889262"/>
                     </a:xfrm>
                     <a:prstGeom prst="rect"/>
                   </pic:spPr>
@@ -2515,7 +2525,7 @@
       <w:r>
         <w:drawing>
           <wp:inline xmlns:a="http://schemas.openxmlformats.org/drawingml/2006/main" xmlns:pic="http://schemas.openxmlformats.org/drawingml/2006/picture">
-            <wp:extent cx="5394960" cy="2074984"/>
+            <wp:extent cx="5394960" cy="2035833"/>
             <wp:docPr id="6" name="Picture 6" descr="Project path, Browse button, and detected project metadata" title="Project path, Browse button, and detected project metadata"/>
             <wp:cNvGraphicFramePr>
               <a:graphicFrameLocks noChangeAspect="1"/>
@@ -2529,7 +2539,7 @@
                   </pic:nvPicPr>
                   <pic:blipFill>
                     <a:blip r:embed="rId17"/>
-                    <a:srcRect l="21000" t="17000" r="18000" b="42000"/>
+                    <a:srcRect l="6200" t="10900" r="1700" b="36300"/>
                     <a:stretch>
                       <a:fillRect/>
                     </a:stretch>
@@ -2537,7 +2547,7 @@
                   <pic:spPr>
                     <a:xfrm>
                       <a:off x="0" y="0"/>
-                      <a:ext cx="5394960" cy="2074984"/>
+                      <a:ext cx="5394960" cy="2035833"/>
                     </a:xfrm>
                     <a:prstGeom prst="rect"/>
                   </pic:spPr>
@@ -2565,12 +2575,12 @@
     </w:p>
     <w:p>
       <w:r>
-        <w:t>Browse selects a DPR or DPROJ; DPROJ is preferred because it provides framework, platform, configuration, source, form, and output metadata. Detection is read-only and does not compile or execute the target.</w:t>
+        <w:t>This is where the Wizard learns which application you want to translate. Select Browse and choose the project's DPROJ file when one is available. A DPROJ gives the Wizard the clearest framework, platform, configuration, source, form, and output information. Detection is read-only; it does not compile or run the target.</w:t>
       </w:r>
     </w:p>
     <w:p>
       <w:r>
-        <w:t>ApplicationId is the stable identity that links catalog, pack, manager, workspace, and preference. It must match the manager's published ApplicationId exactly. A folder name, product caption, or executable display name is not a substitute.</w:t>
+        <w:t>Pause for a moment after detection and check the project name, framework, targets, forms, and source-unit count. ApplicationId is especially important: it is the stable identity shared by the catalog, runtime packs, manager, workspace, and saved language preference. It must match the manager's ApplicationId property exactly.</w:t>
       </w:r>
     </w:p>
     <w:tbl>
@@ -2926,7 +2936,7 @@
       <w:r>
         <w:drawing>
           <wp:inline xmlns:a="http://schemas.openxmlformats.org/drawingml/2006/main" xmlns:pic="http://schemas.openxmlformats.org/drawingml/2006/picture">
-            <wp:extent cx="5897880" cy="3317558"/>
+            <wp:extent cx="5897880" cy="3889262"/>
             <wp:docPr id="7" name="Picture 7" descr="Deployment page listing detected build outputs and optional application folders" title="Deployment page listing detected build outputs and optional application folders"/>
             <wp:cNvGraphicFramePr>
               <a:graphicFrameLocks noChangeAspect="1"/>
@@ -2947,7 +2957,7 @@
                   <pic:spPr>
                     <a:xfrm>
                       <a:off x="0" y="0"/>
-                      <a:ext cx="5897880" cy="3317558"/>
+                      <a:ext cx="5897880" cy="3889262"/>
                     </a:xfrm>
                     <a:prstGeom prst="rect"/>
                   </pic:spPr>
@@ -2981,7 +2991,7 @@
       <w:r>
         <w:drawing>
           <wp:inline xmlns:a="http://schemas.openxmlformats.org/drawingml/2006/main" xmlns:pic="http://schemas.openxmlformats.org/drawingml/2006/picture">
-            <wp:extent cx="5394960" cy="1926771"/>
+            <wp:extent cx="5394960" cy="2631687"/>
             <wp:docPr id="8" name="Picture 8" descr="Deployment destination list with Add and Remove controls" title="Deployment destination list with Add and Remove controls"/>
             <wp:cNvGraphicFramePr>
               <a:graphicFrameLocks noChangeAspect="1"/>
@@ -2995,7 +3005,7 @@
                   </pic:nvPicPr>
                   <pic:blipFill>
                     <a:blip r:embed="rId18"/>
-                    <a:srcRect l="16000" t="20000" r="21000" b="26000"/>
+                    <a:srcRect l="0" t="14700" r="6200" b="15700"/>
                     <a:stretch>
                       <a:fillRect/>
                     </a:stretch>
@@ -3003,7 +3013,7 @@
                   <pic:spPr>
                     <a:xfrm>
                       <a:off x="0" y="0"/>
-                      <a:ext cx="5394960" cy="1926771"/>
+                      <a:ext cx="5394960" cy="2631687"/>
                     </a:xfrm>
                     <a:prstGeom prst="rect"/>
                   </pic:spPr>
@@ -3031,12 +3041,12 @@
     </w:p>
     <w:p>
       <w:r>
-        <w:t>Detected Delphi output folders require no manual entry. Add only separate installed, portable, network, USB, or test-run folders that should receive the current language packs.</w:t>
+        <w:t>Most developers can leave this page alone. The Wizard already detects normal Delphi build-output folders, so you only need to add a destination for a separate installed, portable, network, USB, or test-run copy of the application.</w:t>
       </w:r>
     </w:p>
     <w:p>
       <w:r>
-        <w:t>Choose the application folder containing the executable, not its Localization or Languages child folder. An unavailable removable or network destination is reported and skipped; it does not invalidate the pack.</w:t>
+        <w:t>When you do add one, choose the folder that contains the executable - not its Localization or Languages child folder. If a removable or network destination is unavailable later, the Wizard reports and skips it without invalidating the language pack.</w:t>
       </w:r>
     </w:p>
     <w:tbl>
@@ -3316,7 +3326,7 @@
       <w:r>
         <w:drawing>
           <wp:inline xmlns:a="http://schemas.openxmlformats.org/drawingml/2006/main" xmlns:pic="http://schemas.openxmlformats.org/drawingml/2006/picture">
-            <wp:extent cx="5897880" cy="3317558"/>
+            <wp:extent cx="5897880" cy="3889262"/>
             <wp:docPr id="9" name="Picture 9" descr="Languages page with source and target locale selectors and locale facts" title="Languages page with source and target locale selectors and locale facts"/>
             <wp:cNvGraphicFramePr>
               <a:graphicFrameLocks noChangeAspect="1"/>
@@ -3337,7 +3347,7 @@
                   <pic:spPr>
                     <a:xfrm>
                       <a:off x="0" y="0"/>
-                      <a:ext cx="5897880" cy="3317558"/>
+                      <a:ext cx="5897880" cy="3889262"/>
                     </a:xfrm>
                     <a:prstGeom prst="rect"/>
                   </pic:spPr>
@@ -3371,7 +3381,7 @@
       <w:r>
         <w:drawing>
           <wp:inline xmlns:a="http://schemas.openxmlformats.org/drawingml/2006/main" xmlns:pic="http://schemas.openxmlformats.org/drawingml/2006/picture">
-            <wp:extent cx="5394960" cy="1998133"/>
+            <wp:extent cx="5394960" cy="1740309"/>
             <wp:docPr id="10" name="Picture 10" descr="Source-language and target-language selectors" title="Source-language and target-language selectors"/>
             <wp:cNvGraphicFramePr>
               <a:graphicFrameLocks noChangeAspect="1"/>
@@ -3385,7 +3395,7 @@
                   </pic:nvPicPr>
                   <pic:blipFill>
                     <a:blip r:embed="rId19"/>
-                    <a:srcRect l="15000" t="19000" r="16000" b="43000"/>
+                    <a:srcRect l="0" t="13400" r="0" b="37600"/>
                     <a:stretch>
                       <a:fillRect/>
                     </a:stretch>
@@ -3393,7 +3403,7 @@
                   <pic:spPr>
                     <a:xfrm>
                       <a:off x="0" y="0"/>
-                      <a:ext cx="5394960" cy="1998133"/>
+                      <a:ext cx="5394960" cy="1740309"/>
                     </a:xfrm>
                     <a:prstGeom prst="rect"/>
                   </pic:spPr>
@@ -3421,12 +3431,12 @@
     </w:p>
     <w:p>
       <w:r>
-        <w:t>Source language is the language already authored in the saved forms and source. Target language is the new runtime choice. The locale code controls pack naming, native display name, direction, and formatting facts.</w:t>
+        <w:t>Choose the language already written in the forms and source as the Source language, then choose the new language you want to create as the Target language. The locale code also controls the pack name, native display name, reading direction, and regional formatting facts shown on the page.</w:t>
       </w:r>
     </w:p>
     <w:p>
       <w:r>
-        <w:t>Changing source, target, or project invalidates downstream scan/catalog state in the current Wizard session. That reset prevents a catalog built for one identity or locale from being exported as another.</w:t>
+        <w:t>Check the native name and direction before continuing. If you change the project or either language later, the Wizard clears the downstream scan state for this session. That protective reset keeps a catalog built for one application or locale from being exported as another.</w:t>
       </w:r>
     </w:p>
     <w:tbl>
@@ -3706,7 +3716,7 @@
       <w:r>
         <w:drawing>
           <wp:inline xmlns:a="http://schemas.openxmlformats.org/drawingml/2006/main" xmlns:pic="http://schemas.openxmlformats.org/drawingml/2006/picture">
-            <wp:extent cx="5897880" cy="3317558"/>
+            <wp:extent cx="5897880" cy="3889262"/>
             <wp:docPr id="11" name="Picture 11" descr="Translation Service page showing DeepL provider, plan, masked key, remember option, save, and connection test" title="Translation Service page showing DeepL provider, plan, masked key, remember option, save, and connection test"/>
             <wp:cNvGraphicFramePr>
               <a:graphicFrameLocks noChangeAspect="1"/>
@@ -3727,7 +3737,7 @@
                   <pic:spPr>
                     <a:xfrm>
                       <a:off x="0" y="0"/>
-                      <a:ext cx="5897880" cy="3317558"/>
+                      <a:ext cx="5897880" cy="3889262"/>
                     </a:xfrm>
                     <a:prstGeom prst="rect"/>
                   </pic:spPr>
@@ -3761,7 +3771,7 @@
       <w:r>
         <w:drawing>
           <wp:inline xmlns:a="http://schemas.openxmlformats.org/drawingml/2006/main" xmlns:pic="http://schemas.openxmlformats.org/drawingml/2006/picture">
-            <wp:extent cx="5394960" cy="2157984"/>
+            <wp:extent cx="5394960" cy="2657615"/>
             <wp:docPr id="12" name="Picture 12" descr="DeepL provider and plan selectors, masked API key, save, and test buttons" title="DeepL provider and plan selectors, masked API key, save, and test buttons"/>
             <wp:cNvGraphicFramePr>
               <a:graphicFrameLocks noChangeAspect="1"/>
@@ -3775,7 +3785,7 @@
                   </pic:nvPicPr>
                   <pic:blipFill>
                     <a:blip r:embed="rId20"/>
-                    <a:srcRect l="13000" t="17000" r="13000" b="25000"/>
+                    <a:srcRect l="0" t="10900" r="0" b="14400"/>
                     <a:stretch>
                       <a:fillRect/>
                     </a:stretch>
@@ -3783,7 +3793,7 @@
                   <pic:spPr>
                     <a:xfrm>
                       <a:off x="0" y="0"/>
-                      <a:ext cx="5394960" cy="2157984"/>
+                      <a:ext cx="5394960" cy="2657615"/>
                     </a:xfrm>
                     <a:prstGeom prst="rect"/>
                   </pic:spPr>
@@ -3811,12 +3821,12 @@
     </w:p>
     <w:p>
       <w:r>
-        <w:t>DeepL is the first-run default and recommended provider. The Studio restores a previously saved provider/plan choice but never displays a stored secret back into the API-key edit. A blank field with a saved-key status is therefore correct.</w:t>
+        <w:t>DeepL is the recommended first choice and the first-run default. If you previously saved a provider and plan, the Studio restores those choices. For security, it never puts a stored secret back into the API-key box, so a blank box beside a saved-key message is normal.</w:t>
       </w:r>
     </w:p>
     <w:p>
       <w:r>
-        <w:t>Test Connection runs a bounded asynchronous request. The Wizard must remain responsive, cancellation-aware, and able to close after the test completes or times out. A successful test proves only authentication and endpoint access; it does not approve language quality or quota for a large catalog.</w:t>
+        <w:t>If this is a new or replacement key, paste it, choose whether to remember it securely, and select Save / Replace Key. Then select Test Connection. A successful test confirms that the key and endpoint work; it does not guarantee translation quality or enough remaining quota for a large catalog.</w:t>
       </w:r>
     </w:p>
     <w:tbl>
@@ -4193,10 +4203,10 @@
                 <w:b/>
                 <w:color w:val="234C80"/>
               </w:rPr>
-              <w:t xml:space="preserve">Secret locations. </w:t>
-            </w:r>
-            <w:r>
-              <w:t>Non-secret settings are in %LOCALAPPDATA%\DelphiAppTranslationStudio\provider-settings.json. Remembered secrets use Windows Generic Credential targets DelphiAppTranslationStudio/Providers/DeepL or DelphiAppTranslationStudio/Providers/Google Cloud Translation.</w:t>
+              <w:t xml:space="preserve">Your key is not stored in the project. </w:t>
+            </w:r>
+            <w:r>
+              <w:t>Non-secret settings are in %LOCALAPPDATA%\DelphiAppTranslationStudio\provider-settings.json. A remembered key is stored as a Windows Generic Credential named DelphiAppTranslationStudio/Providers/DeepL or DelphiAppTranslationStudio/Providers/Google Cloud Translation. It is never copied into the target source, catalog, pack, kit, or guide.</w:t>
             </w:r>
           </w:p>
         </w:tc>
@@ -4218,7 +4228,7 @@
       <w:r>
         <w:drawing>
           <wp:inline xmlns:a="http://schemas.openxmlformats.org/drawingml/2006/main" xmlns:pic="http://schemas.openxmlformats.org/drawingml/2006/picture">
-            <wp:extent cx="5897880" cy="3317558"/>
+            <wp:extent cx="5897880" cy="3889262"/>
             <wp:docPr id="13" name="Picture 13" descr="Scan Project page showing unique catalog entries, raw observations, recovered semantic contracts, duplicate occurrences, and scan items" title="Scan Project page showing unique catalog entries, raw observations, recovered semantic contracts, duplicate occurrences, and scan items"/>
             <wp:cNvGraphicFramePr>
               <a:graphicFrameLocks noChangeAspect="1"/>
@@ -4239,7 +4249,7 @@
                   <pic:spPr>
                     <a:xfrm>
                       <a:off x="0" y="0"/>
-                      <a:ext cx="5897880" cy="3317558"/>
+                      <a:ext cx="5897880" cy="3889262"/>
                     </a:xfrm>
                     <a:prstGeom prst="rect"/>
                   </pic:spPr>
@@ -4273,7 +4283,7 @@
       <w:r>
         <w:drawing>
           <wp:inline xmlns:a="http://schemas.openxmlformats.org/drawingml/2006/main" xmlns:pic="http://schemas.openxmlformats.org/drawingml/2006/picture">
-            <wp:extent cx="5394960" cy="2074984"/>
+            <wp:extent cx="5394960" cy="2387150"/>
             <wp:docPr id="14" name="Picture 14" descr="Scan totals and representative stable-key rows" title="Scan totals and representative stable-key rows"/>
             <wp:cNvGraphicFramePr>
               <a:graphicFrameLocks noChangeAspect="1"/>
@@ -4287,7 +4297,7 @@
                   </pic:nvPicPr>
                   <pic:blipFill>
                     <a:blip r:embed="rId21"/>
-                    <a:srcRect l="16000" t="22000" r="13000" b="26000"/>
+                    <a:srcRect l="0" t="17300" r="0" b="15700"/>
                     <a:stretch>
                       <a:fillRect/>
                     </a:stretch>
@@ -4295,7 +4305,7 @@
                   <pic:spPr>
                     <a:xfrm>
                       <a:off x="0" y="0"/>
-                      <a:ext cx="5394960" cy="2074984"/>
+                      <a:ext cx="5394960" cy="2387150"/>
                     </a:xfrm>
                     <a:prstGeom prst="rect"/>
                   </pic:spPr>
@@ -4323,12 +4333,12 @@
     </w:p>
     <w:p>
       <w:r>
-        <w:t>The Wizard and Maintenance Studio call the same canonical scanner. The headline is the unique catalog-entry count. Raw observations can be lower or higher after semantic contracts are recovered and equivalent duplicate occurrences are collapsed; those supporting counts are displayed separately so the total is auditable.</w:t>
+        <w:t>Select Scan Project and let the Wizard inventory the text that belongs in the translation catalog. The Wizard and Maintenance Studio use the same canonical scanner, so the unique catalog-entry total should agree when both are looking at the same saved project snapshot.</w:t>
       </w:r>
     </w:p>
     <w:p>
       <w:r>
-        <w:t>The scanner reads saved text DFM/FMX resources, Pascal resourcestrings, eligible runtime assignments, and explicitly authorized project resource manifests. It does not translate arbitrary identifiers, user data, database values, or every string literal in source code.</w:t>
+        <w:t>The supporting numbers explain how the total was formed. Raw observations are direct discoveries, recovered semantic contracts restore known dynamic application text, and equivalent duplicate occurrences are represented once. The scanner reads saved text DFM/FMX resources, Pascal resourcestrings, eligible runtime assignments, and explicitly authorized project resource manifests; it does not sweep up arbitrary identifiers, user data, database values, or every string literal in source code.</w:t>
       </w:r>
     </w:p>
     <w:tbl>
@@ -4695,12 +4705,12 @@
     </w:p>
     <w:p>
       <w:r>
-        <w:t>This is the final deliberate authorization point. The summary must describe the exact test project, framework, source/target locales, provider, scan state, unresolved work, backup, and component workflow that the developer intends.</w:t>
+        <w:t>This page gives you one last chance to confirm the whole job before anything time-consuming begins. Read the summary from top to bottom and make sure it names the exact test project, framework, source and target locales, provider, scan state, unresolved work, backup, and component workflow you intended.</w:t>
       </w:r>
     </w:p>
     <w:p>
       <w:r>
-        <w:t>The target project must be closed in RAD Studio. An open DPROJ or form may leave unsaved buffers and makes the selected source snapshot unreliable even though the Wizard itself does not rewrite those files.</w:t>
+        <w:t>Close the target project in RAD Studio before you authorize the run. An open DPROJ or form can leave unsaved work in memory and make the selected source snapshot unreliable, even though the Wizard itself does not rewrite those files.</w:t>
       </w:r>
     </w:p>
     <w:tbl>
@@ -4974,12 +4984,12 @@
     </w:p>
     <w:p>
       <w:r>
-        <w:t>After provider translation and before final validation/export, the Wizard opens Localization Review automatically. This modal window is where machine output, glossary candidates, application-owned strings, layout findings, and per-language proposals are reviewed while all necessary translated text is available.</w:t>
+        <w:t>After provider translation, the Wizard opens Localization Review automatically. Take your time here: this is where you review machine output, glossary candidates, application-owned strings, layout findings, and language-specific proposals while all translated text is available.</w:t>
       </w:r>
     </w:p>
     <w:p>
       <w:r>
-        <w:t>Closing Localization Review does not abandon the Wizard. It saves accepted decisions and returns control to the suspended final-processing continuation, which then validates, exports, generates the kit, deploys, and writes the completion report.</w:t>
+        <w:t>When your decisions are saved, close Localization Review normally. You are not abandoning the run. Control returns to the waiting Wizard, which continues with validation, export, kit generation, deployment, and the completion report.</w:t>
       </w:r>
     </w:p>
     <w:tbl>
@@ -5381,7 +5391,7 @@
       <w:r>
         <w:drawing>
           <wp:inline xmlns:a="http://schemas.openxmlformats.org/drawingml/2006/main" xmlns:pic="http://schemas.openxmlformats.org/drawingml/2006/picture">
-            <wp:extent cx="5897880" cy="2098889"/>
+            <wp:extent cx="5897880" cy="3905880"/>
             <wp:docPr id="16" name="Picture 16" descr="Processing and completion page with operation text and progress memo" title="Processing and completion page with operation text and progress memo"/>
             <wp:cNvGraphicFramePr>
               <a:graphicFrameLocks noChangeAspect="1"/>
@@ -5395,7 +5405,6 @@
                   </pic:nvPicPr>
                   <pic:blipFill>
                     <a:blip r:embed="rId23"/>
-                    <a:srcRect l="27400" t="18600" r="1800" b="43600"/>
                     <a:stretch>
                       <a:fillRect/>
                     </a:stretch>
@@ -5403,7 +5412,7 @@
                   <pic:spPr>
                     <a:xfrm>
                       <a:off x="0" y="0"/>
-                      <a:ext cx="5897880" cy="2098889"/>
+                      <a:ext cx="5897880" cy="3905880"/>
                     </a:xfrm>
                     <a:prstGeom prst="rect"/>
                   </pic:spPr>
@@ -5431,12 +5440,12 @@
     </w:p>
     <w:p>
       <w:r>
-        <w:t>The progress memo is the authoritative sequence record. It reports backup, catalog save, provider work, review return, glossary application, validation, source/target pack export, kit generation, output deployment, optional destination deployment, and completion-report creation.</w:t>
+        <w:t>You can follow the run in the progress memo. It records the safety backup, catalog save, provider work, return from review, glossary application, validation, source and target pack export, kit generation, deployment, and completion report in the order they occur.</w:t>
       </w:r>
     </w:p>
     <w:p>
       <w:r>
-        <w:t>A line prefixed STOPPED is a controlled failure, not permission to ignore the problem. Read the last successful line and the stopped reason, preserve the artifacts, correct the cause, and rerun. On success the page states that target Pascal, form, DPR, and DPROJ files were not modified.</w:t>
+        <w:t>When the final line reports success, select Finish. If you see STOPPED instead, the Wizard has ended the operation safely. Read the last successful line and the reason that follows, keep the log and generated artifacts, correct that specific cause, and run the Wizard again. Do not treat partial output as a finished release.</w:t>
       </w:r>
     </w:p>
     <w:tbl>
@@ -5786,12 +5795,12 @@
     </w:p>
     <w:p>
       <w:r>
-        <w:t>The generated kit is under &lt;Studio&gt;\export\component-integration\&lt;ApplicationId&gt;. ComponentSource contains the complete current framework-appropriate unit set. The Studio does not automatically create a dependencies folder inside the target project.</w:t>
+        <w:t>The Wizard places the generated kit under &lt;Studio&gt;\export\component-integration\&lt;ApplicationId&gt;. Inside it, ComponentSource contains the complete current unit set for the selected framework. The Studio deliberately does not create or fill a dependencies folder inside your target project without your direction.</w:t>
       </w:r>
     </w:p>
     <w:p>
       <w:r>
-        <w:t>A project-local dependencies folder is an optional vendoring strategy: &lt;Target Project&gt;\dependencies\DelphiAppTranslation\source. It makes the target build independent of the Studio repository path and lets Git record the exact runtime source shipped with that application.</w:t>
+        <w:t>For a portable, repeatable build, copy that complete source set into &lt;Target Project&gt;\dependencies\DelphiAppTranslation\source. This optional project-local folder keeps the target independent of the Studio repository path and lets Git record the exact runtime source that ships with the application.</w:t>
       </w:r>
     </w:p>
     <w:p>
@@ -6000,7 +6009,7 @@
     </w:p>
     <w:p>
       <w:r>
-        <w:t>The Wizard passes ComponentSource temporarily to Wizard-initiated build commands but does not edit DPROJ. A manual RAD Studio build therefore needs a permanent Search path entry that resolves the current ComponentSource or vendored dependency folder.</w:t>
+        <w:t>The Wizard can pass ComponentSource to a build it starts itself, but it does not edit your DPROJ. To make ordinary builds from RAD Studio work every time, add one permanent Search path entry for the current ComponentSource or, preferably, the project-local dependency folder.</w:t>
       </w:r>
     </w:p>
     <w:p>

</xml_diff>

<commit_message>
Improve guide layout and engineering clarity
</commit_message>
<xml_diff>
--- a/docs/guides/Delphi App Translation Studio Setup Wizard Guide.docx
+++ b/docs/guides/Delphi App Translation Studio Setup Wizard Guide.docx
@@ -850,7 +850,7 @@
                 <w:color w:val="5D7693"/>
                 <w:sz w:val="18"/>
               </w:rPr>
-              <w:t>24</w:t>
+              <w:t>23</w:t>
             </w:r>
           </w:p>
         </w:tc>
@@ -1073,8 +1073,7 @@
             <w:r>
               <w:rPr>
                 <w:rFonts w:ascii="Aptos" w:hAnsi="Aptos"/>
-                <w:b w:val="0"/>
-                <w:color w:val="1F4E79"/>
+                <w:color w:val="234C80"/>
                 <w:sz w:val="18"/>
               </w:rPr>
               <w:t>23. Appendix A - License Information</w:t>
@@ -1087,7 +1086,6 @@
           </w:tcPr>
           <w:p>
             <w:pPr>
-              <w:keepLines/>
               <w:spacing w:after="20"/>
               <w:jc w:val="right"/>
             </w:pPr>
@@ -1095,7 +1093,7 @@
               <w:rPr>
                 <w:rFonts w:ascii="Aptos" w:hAnsi="Aptos"/>
                 <w:b/>
-                <w:color w:val="5D6D7E"/>
+                <w:color w:val="5D7693"/>
                 <w:sz w:val="18"/>
               </w:rPr>
               <w:t>29</w:t>
@@ -1532,7 +1530,7 @@
         </w:numPr>
       </w:pPr>
       <w:r>
-        <w:t>Extract it to a short writable path, for example C:\New Delphi Projects\Delphi App Translation.</w:t>
+        <w:t>Extract it to a short writable path, for example C:\DelphiProjects\Delphi App Translation.</w:t>
       </w:r>
     </w:p>
     <w:p>
@@ -1748,12 +1746,13 @@
     <w:p>
       <w:pPr>
         <w:keepNext/>
+        <w:spacing w:before="120" w:after="60"/>
         <w:jc w:val="center"/>
       </w:pPr>
       <w:r>
         <w:drawing>
           <wp:inline xmlns:a="http://schemas.openxmlformats.org/drawingml/2006/main" xmlns:pic="http://schemas.openxmlformats.org/drawingml/2006/picture">
-            <wp:extent cx="5897880" cy="3864317"/>
+            <wp:extent cx="5349240" cy="3504846"/>
             <wp:docPr id="2" name="Picture 2" descr="Translation Setup Wizard Welcome screen with step rail, content panel, Back, Next, and Cancel controls" title="Translation Setup Wizard Welcome screen with step rail, content panel, Back, Next, and Cancel controls"/>
             <wp:cNvGraphicFramePr>
               <a:graphicFrameLocks noChangeAspect="1"/>
@@ -1774,7 +1773,7 @@
                   <pic:spPr>
                     <a:xfrm>
                       <a:off x="0" y="0"/>
-                      <a:ext cx="5897880" cy="3864317"/>
+                      <a:ext cx="5349240" cy="3504846"/>
                     </a:xfrm>
                     <a:prstGeom prst="rect"/>
                   </pic:spPr>
@@ -1787,6 +1786,7 @@
     </w:p>
     <w:p>
       <w:pPr>
+        <w:keepLines/>
         <w:spacing w:after="200"/>
         <w:jc w:val="center"/>
       </w:pPr>
@@ -2194,12 +2194,13 @@
     <w:p>
       <w:pPr>
         <w:keepNext/>
+        <w:spacing w:before="120" w:after="60"/>
         <w:jc w:val="center"/>
       </w:pPr>
       <w:r>
         <w:drawing>
           <wp:inline xmlns:a="http://schemas.openxmlformats.org/drawingml/2006/main" xmlns:pic="http://schemas.openxmlformats.org/drawingml/2006/picture">
-            <wp:extent cx="5897880" cy="3864317"/>
+            <wp:extent cx="5349240" cy="3504846"/>
             <wp:docPr id="3" name="Picture 3" descr="Welcome page explaining the Wizard and safety boundary" title="Welcome page explaining the Wizard and safety boundary"/>
             <wp:cNvGraphicFramePr>
               <a:graphicFrameLocks noChangeAspect="1"/>
@@ -2220,7 +2221,7 @@
                   <pic:spPr>
                     <a:xfrm>
                       <a:off x="0" y="0"/>
-                      <a:ext cx="5897880" cy="3864317"/>
+                      <a:ext cx="5349240" cy="3504846"/>
                     </a:xfrm>
                     <a:prstGeom prst="rect"/>
                   </pic:spPr>
@@ -2233,6 +2234,7 @@
     </w:p>
     <w:p>
       <w:pPr>
+        <w:keepLines/>
         <w:spacing w:after="200"/>
         <w:jc w:val="center"/>
       </w:pPr>
@@ -2249,12 +2251,13 @@
     <w:p>
       <w:pPr>
         <w:keepNext/>
+        <w:spacing w:before="120" w:after="60"/>
         <w:jc w:val="center"/>
       </w:pPr>
       <w:r>
         <w:drawing>
           <wp:inline xmlns:a="http://schemas.openxmlformats.org/drawingml/2006/main" xmlns:pic="http://schemas.openxmlformats.org/drawingml/2006/picture">
-            <wp:extent cx="5394960" cy="1037492"/>
+            <wp:extent cx="4937760" cy="1770140"/>
             <wp:docPr id="4" name="Picture 4" descr="Back, Next, and Cancel buttons on the Welcome page" title="Back, Next, and Cancel buttons on the Welcome page"/>
             <wp:cNvGraphicFramePr>
               <a:graphicFrameLocks noChangeAspect="1"/>
@@ -2263,12 +2266,11 @@
               <a:graphicData uri="http://schemas.openxmlformats.org/drawingml/2006/picture">
                 <pic:pic>
                   <pic:nvPicPr>
-                    <pic:cNvPr id="0" name="07-wizard-welcome.png"/>
+                    <pic:cNvPr id="0" name="tmpq6gg5lim.png"/>
                     <pic:cNvPicPr/>
                   </pic:nvPicPr>
                   <pic:blipFill>
-                    <a:blip r:embed="rId16"/>
-                    <a:srcRect l="55700" t="75700" r="0" b="0"/>
+                    <a:blip r:embed="rId17"/>
                     <a:stretch>
                       <a:fillRect/>
                     </a:stretch>
@@ -2276,7 +2278,7 @@
                   <pic:spPr>
                     <a:xfrm>
                       <a:off x="0" y="0"/>
-                      <a:ext cx="5394960" cy="1037492"/>
+                      <a:ext cx="4937760" cy="1770140"/>
                     </a:xfrm>
                     <a:prstGeom prst="rect"/>
                   </pic:spPr>
@@ -2289,6 +2291,7 @@
     </w:p>
     <w:p>
       <w:pPr>
+        <w:keepLines/>
         <w:spacing w:after="200"/>
         <w:jc w:val="center"/>
       </w:pPr>
@@ -2508,12 +2511,13 @@
     <w:p>
       <w:pPr>
         <w:keepNext/>
+        <w:spacing w:before="120" w:after="60"/>
         <w:jc w:val="center"/>
       </w:pPr>
       <w:r>
         <w:drawing>
           <wp:inline xmlns:a="http://schemas.openxmlformats.org/drawingml/2006/main" xmlns:pic="http://schemas.openxmlformats.org/drawingml/2006/picture">
-            <wp:extent cx="5897880" cy="3889262"/>
+            <wp:extent cx="5349240" cy="3527471"/>
             <wp:docPr id="5" name="Picture 5" descr="Delphi Project page with project path, Browse, detected framework, application ID, targets, forms, and source units" title="Delphi Project page with project path, Browse, detected framework, application ID, targets, forms, and source units"/>
             <wp:cNvGraphicFramePr>
               <a:graphicFrameLocks noChangeAspect="1"/>
@@ -2526,7 +2530,7 @@
                     <pic:cNvPicPr/>
                   </pic:nvPicPr>
                   <pic:blipFill>
-                    <a:blip r:embed="rId17"/>
+                    <a:blip r:embed="rId18"/>
                     <a:stretch>
                       <a:fillRect/>
                     </a:stretch>
@@ -2534,7 +2538,7 @@
                   <pic:spPr>
                     <a:xfrm>
                       <a:off x="0" y="0"/>
-                      <a:ext cx="5897880" cy="3889262"/>
+                      <a:ext cx="5349240" cy="3527471"/>
                     </a:xfrm>
                     <a:prstGeom prst="rect"/>
                   </pic:spPr>
@@ -2547,6 +2551,7 @@
     </w:p>
     <w:p>
       <w:pPr>
+        <w:keepLines/>
         <w:spacing w:after="200"/>
         <w:jc w:val="center"/>
       </w:pPr>
@@ -2563,12 +2568,13 @@
     <w:p>
       <w:pPr>
         <w:keepNext/>
+        <w:spacing w:before="120" w:after="60"/>
         <w:jc w:val="center"/>
       </w:pPr>
       <w:r>
         <w:drawing>
           <wp:inline xmlns:a="http://schemas.openxmlformats.org/drawingml/2006/main" xmlns:pic="http://schemas.openxmlformats.org/drawingml/2006/picture">
-            <wp:extent cx="5394960" cy="2035833"/>
+            <wp:extent cx="4937760" cy="1866838"/>
             <wp:docPr id="6" name="Picture 6" descr="Project path, Browse button, and detected project metadata" title="Project path, Browse button, and detected project metadata"/>
             <wp:cNvGraphicFramePr>
               <a:graphicFrameLocks noChangeAspect="1"/>
@@ -2577,12 +2583,11 @@
               <a:graphicData uri="http://schemas.openxmlformats.org/drawingml/2006/picture">
                 <pic:pic>
                   <pic:nvPicPr>
-                    <pic:cNvPr id="0" name="08-wizard-project.png"/>
+                    <pic:cNvPr id="0" name="tmp63181xk_.png"/>
                     <pic:cNvPicPr/>
                   </pic:nvPicPr>
                   <pic:blipFill>
-                    <a:blip r:embed="rId17"/>
-                    <a:srcRect l="6200" t="10900" r="1700" b="36300"/>
+                    <a:blip r:embed="rId19"/>
                     <a:stretch>
                       <a:fillRect/>
                     </a:stretch>
@@ -2590,7 +2595,7 @@
                   <pic:spPr>
                     <a:xfrm>
                       <a:off x="0" y="0"/>
-                      <a:ext cx="5394960" cy="2035833"/>
+                      <a:ext cx="4937760" cy="1866838"/>
                     </a:xfrm>
                     <a:prstGeom prst="rect"/>
                   </pic:spPr>
@@ -2603,6 +2608,7 @@
     </w:p>
     <w:p>
       <w:pPr>
+        <w:keepLines/>
         <w:spacing w:after="200"/>
         <w:jc w:val="center"/>
       </w:pPr>
@@ -2974,12 +2980,13 @@
     <w:p>
       <w:pPr>
         <w:keepNext/>
+        <w:spacing w:before="120" w:after="60"/>
         <w:jc w:val="center"/>
       </w:pPr>
       <w:r>
         <w:drawing>
           <wp:inline xmlns:a="http://schemas.openxmlformats.org/drawingml/2006/main" xmlns:pic="http://schemas.openxmlformats.org/drawingml/2006/picture">
-            <wp:extent cx="5897880" cy="3889262"/>
+            <wp:extent cx="5349240" cy="3527471"/>
             <wp:docPr id="7" name="Picture 7" descr="Deployment page listing detected build outputs and optional application folders" title="Deployment page listing detected build outputs and optional application folders"/>
             <wp:cNvGraphicFramePr>
               <a:graphicFrameLocks noChangeAspect="1"/>
@@ -2992,7 +2999,7 @@
                     <pic:cNvPicPr/>
                   </pic:nvPicPr>
                   <pic:blipFill>
-                    <a:blip r:embed="rId18"/>
+                    <a:blip r:embed="rId20"/>
                     <a:stretch>
                       <a:fillRect/>
                     </a:stretch>
@@ -3000,7 +3007,7 @@
                   <pic:spPr>
                     <a:xfrm>
                       <a:off x="0" y="0"/>
-                      <a:ext cx="5897880" cy="3889262"/>
+                      <a:ext cx="5349240" cy="3527471"/>
                     </a:xfrm>
                     <a:prstGeom prst="rect"/>
                   </pic:spPr>
@@ -3013,6 +3020,7 @@
     </w:p>
     <w:p>
       <w:pPr>
+        <w:keepLines/>
         <w:spacing w:after="200"/>
         <w:jc w:val="center"/>
       </w:pPr>
@@ -3029,12 +3037,13 @@
     <w:p>
       <w:pPr>
         <w:keepNext/>
+        <w:spacing w:before="120" w:after="60"/>
         <w:jc w:val="center"/>
       </w:pPr>
       <w:r>
         <w:drawing>
           <wp:inline xmlns:a="http://schemas.openxmlformats.org/drawingml/2006/main" xmlns:pic="http://schemas.openxmlformats.org/drawingml/2006/picture">
-            <wp:extent cx="5394960" cy="2631687"/>
+            <wp:extent cx="4937760" cy="2414237"/>
             <wp:docPr id="8" name="Picture 8" descr="Deployment destination list with Add and Remove controls" title="Deployment destination list with Add and Remove controls"/>
             <wp:cNvGraphicFramePr>
               <a:graphicFrameLocks noChangeAspect="1"/>
@@ -3043,12 +3052,11 @@
               <a:graphicData uri="http://schemas.openxmlformats.org/drawingml/2006/picture">
                 <pic:pic>
                   <pic:nvPicPr>
-                    <pic:cNvPr id="0" name="09-wizard-deployment.png"/>
+                    <pic:cNvPr id="0" name="tmpepjwm3y3.png"/>
                     <pic:cNvPicPr/>
                   </pic:nvPicPr>
                   <pic:blipFill>
-                    <a:blip r:embed="rId18"/>
-                    <a:srcRect l="0" t="14700" r="6200" b="15700"/>
+                    <a:blip r:embed="rId21"/>
                     <a:stretch>
                       <a:fillRect/>
                     </a:stretch>
@@ -3056,7 +3064,7 @@
                   <pic:spPr>
                     <a:xfrm>
                       <a:off x="0" y="0"/>
-                      <a:ext cx="5394960" cy="2631687"/>
+                      <a:ext cx="4937760" cy="2414237"/>
                     </a:xfrm>
                     <a:prstGeom prst="rect"/>
                   </pic:spPr>
@@ -3069,6 +3077,7 @@
     </w:p>
     <w:p>
       <w:pPr>
+        <w:keepLines/>
         <w:spacing w:after="200"/>
         <w:jc w:val="center"/>
       </w:pPr>
@@ -3364,12 +3373,13 @@
     <w:p>
       <w:pPr>
         <w:keepNext/>
+        <w:spacing w:before="120" w:after="60"/>
         <w:jc w:val="center"/>
       </w:pPr>
       <w:r>
         <w:drawing>
           <wp:inline xmlns:a="http://schemas.openxmlformats.org/drawingml/2006/main" xmlns:pic="http://schemas.openxmlformats.org/drawingml/2006/picture">
-            <wp:extent cx="5897880" cy="3889262"/>
+            <wp:extent cx="5349240" cy="3527471"/>
             <wp:docPr id="9" name="Picture 9" descr="Languages page with source and target locale selectors and locale facts" title="Languages page with source and target locale selectors and locale facts"/>
             <wp:cNvGraphicFramePr>
               <a:graphicFrameLocks noChangeAspect="1"/>
@@ -3382,7 +3392,7 @@
                     <pic:cNvPicPr/>
                   </pic:nvPicPr>
                   <pic:blipFill>
-                    <a:blip r:embed="rId19"/>
+                    <a:blip r:embed="rId22"/>
                     <a:stretch>
                       <a:fillRect/>
                     </a:stretch>
@@ -3390,7 +3400,7 @@
                   <pic:spPr>
                     <a:xfrm>
                       <a:off x="0" y="0"/>
-                      <a:ext cx="5897880" cy="3889262"/>
+                      <a:ext cx="5349240" cy="3527471"/>
                     </a:xfrm>
                     <a:prstGeom prst="rect"/>
                   </pic:spPr>
@@ -3403,6 +3413,7 @@
     </w:p>
     <w:p>
       <w:pPr>
+        <w:keepLines/>
         <w:spacing w:after="200"/>
         <w:jc w:val="center"/>
       </w:pPr>
@@ -3419,12 +3430,13 @@
     <w:p>
       <w:pPr>
         <w:keepNext/>
+        <w:spacing w:before="120" w:after="60"/>
         <w:jc w:val="center"/>
       </w:pPr>
       <w:r>
         <w:drawing>
           <wp:inline xmlns:a="http://schemas.openxmlformats.org/drawingml/2006/main" xmlns:pic="http://schemas.openxmlformats.org/drawingml/2006/picture">
-            <wp:extent cx="5394960" cy="1740309"/>
+            <wp:extent cx="4937760" cy="1593126"/>
             <wp:docPr id="10" name="Picture 10" descr="Source-language and target-language selectors" title="Source-language and target-language selectors"/>
             <wp:cNvGraphicFramePr>
               <a:graphicFrameLocks noChangeAspect="1"/>
@@ -3433,12 +3445,11 @@
               <a:graphicData uri="http://schemas.openxmlformats.org/drawingml/2006/picture">
                 <pic:pic>
                   <pic:nvPicPr>
-                    <pic:cNvPr id="0" name="10-wizard-languages.png"/>
+                    <pic:cNvPr id="0" name="tmpzghoq779.png"/>
                     <pic:cNvPicPr/>
                   </pic:nvPicPr>
                   <pic:blipFill>
-                    <a:blip r:embed="rId19"/>
-                    <a:srcRect l="0" t="13400" r="0" b="37600"/>
+                    <a:blip r:embed="rId23"/>
                     <a:stretch>
                       <a:fillRect/>
                     </a:stretch>
@@ -3446,7 +3457,7 @@
                   <pic:spPr>
                     <a:xfrm>
                       <a:off x="0" y="0"/>
-                      <a:ext cx="5394960" cy="1740309"/>
+                      <a:ext cx="4937760" cy="1593126"/>
                     </a:xfrm>
                     <a:prstGeom prst="rect"/>
                   </pic:spPr>
@@ -3459,6 +3470,7 @@
     </w:p>
     <w:p>
       <w:pPr>
+        <w:keepLines/>
         <w:spacing w:after="200"/>
         <w:jc w:val="center"/>
       </w:pPr>
@@ -3754,12 +3766,13 @@
     <w:p>
       <w:pPr>
         <w:keepNext/>
+        <w:spacing w:before="120" w:after="60"/>
         <w:jc w:val="center"/>
       </w:pPr>
       <w:r>
         <w:drawing>
           <wp:inline xmlns:a="http://schemas.openxmlformats.org/drawingml/2006/main" xmlns:pic="http://schemas.openxmlformats.org/drawingml/2006/picture">
-            <wp:extent cx="5897880" cy="3889262"/>
+            <wp:extent cx="5349240" cy="3527471"/>
             <wp:docPr id="11" name="Picture 11" descr="Translation Service page showing DeepL provider, plan, masked key, remember option, save, and connection test" title="Translation Service page showing DeepL provider, plan, masked key, remember option, save, and connection test"/>
             <wp:cNvGraphicFramePr>
               <a:graphicFrameLocks noChangeAspect="1"/>
@@ -3772,7 +3785,7 @@
                     <pic:cNvPicPr/>
                   </pic:nvPicPr>
                   <pic:blipFill>
-                    <a:blip r:embed="rId20"/>
+                    <a:blip r:embed="rId24"/>
                     <a:stretch>
                       <a:fillRect/>
                     </a:stretch>
@@ -3780,7 +3793,7 @@
                   <pic:spPr>
                     <a:xfrm>
                       <a:off x="0" y="0"/>
-                      <a:ext cx="5897880" cy="3889262"/>
+                      <a:ext cx="5349240" cy="3527471"/>
                     </a:xfrm>
                     <a:prstGeom prst="rect"/>
                   </pic:spPr>
@@ -3793,6 +3806,7 @@
     </w:p>
     <w:p>
       <w:pPr>
+        <w:keepLines/>
         <w:spacing w:after="200"/>
         <w:jc w:val="center"/>
       </w:pPr>
@@ -3809,12 +3823,13 @@
     <w:p>
       <w:pPr>
         <w:keepNext/>
+        <w:spacing w:before="120" w:after="60"/>
         <w:jc w:val="center"/>
       </w:pPr>
       <w:r>
         <w:drawing>
           <wp:inline xmlns:a="http://schemas.openxmlformats.org/drawingml/2006/main" xmlns:pic="http://schemas.openxmlformats.org/drawingml/2006/picture">
-            <wp:extent cx="5394960" cy="2657615"/>
+            <wp:extent cx="4937760" cy="2431614"/>
             <wp:docPr id="12" name="Picture 12" descr="DeepL provider and plan selectors, masked API key, save, and test buttons" title="DeepL provider and plan selectors, masked API key, save, and test buttons"/>
             <wp:cNvGraphicFramePr>
               <a:graphicFrameLocks noChangeAspect="1"/>
@@ -3823,12 +3838,11 @@
               <a:graphicData uri="http://schemas.openxmlformats.org/drawingml/2006/picture">
                 <pic:pic>
                   <pic:nvPicPr>
-                    <pic:cNvPr id="0" name="11-wizard-translation-service.png"/>
+                    <pic:cNvPr id="0" name="tmp827b5171.png"/>
                     <pic:cNvPicPr/>
                   </pic:nvPicPr>
                   <pic:blipFill>
-                    <a:blip r:embed="rId20"/>
-                    <a:srcRect l="0" t="10900" r="0" b="14400"/>
+                    <a:blip r:embed="rId25"/>
                     <a:stretch>
                       <a:fillRect/>
                     </a:stretch>
@@ -3836,7 +3850,7 @@
                   <pic:spPr>
                     <a:xfrm>
                       <a:off x="0" y="0"/>
-                      <a:ext cx="5394960" cy="2657615"/>
+                      <a:ext cx="4937760" cy="2431614"/>
                     </a:xfrm>
                     <a:prstGeom prst="rect"/>
                   </pic:spPr>
@@ -3849,6 +3863,7 @@
     </w:p>
     <w:p>
       <w:pPr>
+        <w:keepLines/>
         <w:spacing w:after="200"/>
         <w:jc w:val="center"/>
       </w:pPr>
@@ -4266,12 +4281,13 @@
     <w:p>
       <w:pPr>
         <w:keepNext/>
+        <w:spacing w:before="120" w:after="60"/>
         <w:jc w:val="center"/>
       </w:pPr>
       <w:r>
         <w:drawing>
           <wp:inline xmlns:a="http://schemas.openxmlformats.org/drawingml/2006/main" xmlns:pic="http://schemas.openxmlformats.org/drawingml/2006/picture">
-            <wp:extent cx="5897880" cy="3889262"/>
+            <wp:extent cx="5349240" cy="3527471"/>
             <wp:docPr id="13" name="Picture 13" descr="Scan Project page showing unique catalog entries, raw observations, recovered semantic contracts, duplicate occurrences, and scan items" title="Scan Project page showing unique catalog entries, raw observations, recovered semantic contracts, duplicate occurrences, and scan items"/>
             <wp:cNvGraphicFramePr>
               <a:graphicFrameLocks noChangeAspect="1"/>
@@ -4284,7 +4300,7 @@
                     <pic:cNvPicPr/>
                   </pic:nvPicPr>
                   <pic:blipFill>
-                    <a:blip r:embed="rId21"/>
+                    <a:blip r:embed="rId26"/>
                     <a:stretch>
                       <a:fillRect/>
                     </a:stretch>
@@ -4292,7 +4308,7 @@
                   <pic:spPr>
                     <a:xfrm>
                       <a:off x="0" y="0"/>
-                      <a:ext cx="5897880" cy="3889262"/>
+                      <a:ext cx="5349240" cy="3527471"/>
                     </a:xfrm>
                     <a:prstGeom prst="rect"/>
                   </pic:spPr>
@@ -4305,6 +4321,7 @@
     </w:p>
     <w:p>
       <w:pPr>
+        <w:keepLines/>
         <w:spacing w:after="200"/>
         <w:jc w:val="center"/>
       </w:pPr>
@@ -4321,12 +4338,13 @@
     <w:p>
       <w:pPr>
         <w:keepNext/>
+        <w:spacing w:before="120" w:after="60"/>
         <w:jc w:val="center"/>
       </w:pPr>
       <w:r>
         <w:drawing>
           <wp:inline xmlns:a="http://schemas.openxmlformats.org/drawingml/2006/main" xmlns:pic="http://schemas.openxmlformats.org/drawingml/2006/picture">
-            <wp:extent cx="5394960" cy="2387150"/>
+            <wp:extent cx="4937760" cy="2180068"/>
             <wp:docPr id="14" name="Picture 14" descr="Scan totals and representative stable-key rows" title="Scan totals and representative stable-key rows"/>
             <wp:cNvGraphicFramePr>
               <a:graphicFrameLocks noChangeAspect="1"/>
@@ -4335,12 +4353,11 @@
               <a:graphicData uri="http://schemas.openxmlformats.org/drawingml/2006/picture">
                 <pic:pic>
                   <pic:nvPicPr>
-                    <pic:cNvPr id="0" name="12-wizard-scan.png"/>
+                    <pic:cNvPr id="0" name="tmpjl_p37ot.png"/>
                     <pic:cNvPicPr/>
                   </pic:nvPicPr>
                   <pic:blipFill>
-                    <a:blip r:embed="rId21"/>
-                    <a:srcRect l="0" t="17300" r="0" b="15700"/>
+                    <a:blip r:embed="rId27"/>
                     <a:stretch>
                       <a:fillRect/>
                     </a:stretch>
@@ -4348,7 +4365,7 @@
                   <pic:spPr>
                     <a:xfrm>
                       <a:off x="0" y="0"/>
-                      <a:ext cx="5394960" cy="2387150"/>
+                      <a:ext cx="4937760" cy="2180068"/>
                     </a:xfrm>
                     <a:prstGeom prst="rect"/>
                   </pic:spPr>
@@ -4361,6 +4378,7 @@
     </w:p>
     <w:p>
       <w:pPr>
+        <w:keepLines/>
         <w:spacing w:after="200"/>
         <w:jc w:val="center"/>
       </w:pPr>
@@ -4694,12 +4712,13 @@
     <w:p>
       <w:pPr>
         <w:keepNext/>
+        <w:spacing w:before="120" w:after="60"/>
         <w:jc w:val="center"/>
       </w:pPr>
       <w:r>
         <w:drawing>
           <wp:inline xmlns:a="http://schemas.openxmlformats.org/drawingml/2006/main" xmlns:pic="http://schemas.openxmlformats.org/drawingml/2006/picture">
-            <wp:extent cx="5897880" cy="3979960"/>
+            <wp:extent cx="5349240" cy="3609732"/>
             <wp:docPr id="15" name="Picture 15" descr="Review and Authorize page summarizing project, language, provider, scan, translation, backup, and authorization" title="Review and Authorize page summarizing project, language, provider, scan, translation, backup, and authorization"/>
             <wp:cNvGraphicFramePr>
               <a:graphicFrameLocks noChangeAspect="1"/>
@@ -4712,7 +4731,7 @@
                     <pic:cNvPicPr/>
                   </pic:nvPicPr>
                   <pic:blipFill>
-                    <a:blip r:embed="rId22"/>
+                    <a:blip r:embed="rId28"/>
                     <a:stretch>
                       <a:fillRect/>
                     </a:stretch>
@@ -4720,7 +4739,7 @@
                   <pic:spPr>
                     <a:xfrm>
                       <a:off x="0" y="0"/>
-                      <a:ext cx="5897880" cy="3979960"/>
+                      <a:ext cx="5349240" cy="3609732"/>
                     </a:xfrm>
                     <a:prstGeom prst="rect"/>
                   </pic:spPr>
@@ -4733,6 +4752,7 @@
     </w:p>
     <w:p>
       <w:pPr>
+        <w:keepLines/>
         <w:spacing w:after="200"/>
         <w:jc w:val="center"/>
       </w:pPr>
@@ -5429,12 +5449,13 @@
     <w:p>
       <w:pPr>
         <w:keepNext/>
+        <w:spacing w:before="120" w:after="60"/>
         <w:jc w:val="center"/>
       </w:pPr>
       <w:r>
         <w:drawing>
           <wp:inline xmlns:a="http://schemas.openxmlformats.org/drawingml/2006/main" xmlns:pic="http://schemas.openxmlformats.org/drawingml/2006/picture">
-            <wp:extent cx="5897880" cy="3905880"/>
+            <wp:extent cx="5349240" cy="3542676"/>
             <wp:docPr id="16" name="Picture 16" descr="Processing and completion page with operation text and progress memo" title="Processing and completion page with operation text and progress memo"/>
             <wp:cNvGraphicFramePr>
               <a:graphicFrameLocks noChangeAspect="1"/>
@@ -5447,7 +5468,7 @@
                     <pic:cNvPicPr/>
                   </pic:nvPicPr>
                   <pic:blipFill>
-                    <a:blip r:embed="rId23"/>
+                    <a:blip r:embed="rId29"/>
                     <a:stretch>
                       <a:fillRect/>
                     </a:stretch>
@@ -5455,7 +5476,7 @@
                   <pic:spPr>
                     <a:xfrm>
                       <a:off x="0" y="0"/>
-                      <a:ext cx="5897880" cy="3905880"/>
+                      <a:ext cx="5349240" cy="3542676"/>
                     </a:xfrm>
                     <a:prstGeom prst="rect"/>
                   </pic:spPr>
@@ -5468,6 +5489,7 @@
     </w:p>
     <w:p>
       <w:pPr>
+        <w:keepLines/>
         <w:spacing w:after="200"/>
         <w:jc w:val="center"/>
       </w:pPr>
@@ -6100,7 +6122,7 @@
         </w:numPr>
       </w:pPr>
       <w:r>
-        <w:t>Append .\dependencies\DelphiAppTranslation\source when using the recommended project-local folder. An absolute example is C:\New Delphi Projects\MyApplication\dependencies\DelphiAppTranslation\source.</w:t>
+        <w:t>Append .\dependencies\DelphiAppTranslation\source when using the recommended project-local folder. An absolute example is C:\DelphiProjects\MyApplication\dependencies\DelphiAppTranslation\source.</w:t>
       </w:r>
     </w:p>
     <w:p>
@@ -7929,7 +7951,7 @@
           </w:tcPr>
           <w:p>
             <w:r>
-              <w:t>C:\New Delphi Projects\Delphi App Translation (example)</w:t>
+              <w:t>C:\DelphiProjects\Delphi App Translation (example)</w:t>
             </w:r>
           </w:p>
         </w:tc>
@@ -8186,191 +8208,115 @@
     <w:p>
       <w:pPr>
         <w:pStyle w:val="Heading1"/>
-        <w:keepNext/>
-        <w:spacing w:before="0" w:after="140"/>
       </w:pPr>
       <w:r>
         <w:t>23. Appendix A - License Information</w:t>
       </w:r>
     </w:p>
     <w:p>
-      <w:pPr>
-        <w:spacing w:before="0" w:after="40" w:line="240" w:lineRule="auto"/>
-      </w:pPr>
       <w:r>
-        <w:rPr>
-          <w:sz w:val="17"/>
-        </w:rPr>
         <w:t>Unless a particular file or third-party component states otherwise, Delphi App Translation Studio and its project documentation are licensed under the Apache License, Version 2.0. The license permits broad use while preserving attribution, notices, and the stated warranty limitations.</w:t>
       </w:r>
     </w:p>
     <w:p>
       <w:pPr>
         <w:pStyle w:val="Heading2"/>
-        <w:keepNext/>
-        <w:spacing w:before="100" w:after="40"/>
       </w:pPr>
       <w:r>
-        <w:rPr>
-          <w:sz w:val="21"/>
-        </w:rPr>
         <w:t>License grant</w:t>
       </w:r>
     </w:p>
     <w:p>
-      <w:pPr>
-        <w:spacing w:before="0" w:after="40" w:line="240" w:lineRule="auto"/>
-      </w:pPr>
       <w:r>
-        <w:rPr>
-          <w:sz w:val="17"/>
-        </w:rPr>
         <w:t>Subject to the complete license terms, you may use, reproduce, modify, prepare derivative works from, publicly display, publicly perform, sublicense, and distribute the licensed material. The Apache License 2.0 also includes an express patent license from contributors for their applicable contributions.</w:t>
       </w:r>
     </w:p>
     <w:p>
       <w:pPr>
         <w:pStyle w:val="Heading2"/>
-        <w:keepNext/>
-        <w:spacing w:before="100" w:after="40"/>
       </w:pPr>
       <w:r>
-        <w:rPr>
-          <w:sz w:val="21"/>
-        </w:rPr>
         <w:t>Important conditions</w:t>
       </w:r>
     </w:p>
     <w:p>
       <w:pPr>
         <w:pStyle w:val="ListBullet"/>
-        <w:spacing w:before="0" w:after="40" w:line="240" w:lineRule="auto"/>
       </w:pPr>
       <w:r>
-        <w:rPr>
-          <w:sz w:val="17"/>
-        </w:rPr>
         <w:t>Give recipients a copy of the Apache License 2.0 when distributing covered material.</w:t>
       </w:r>
     </w:p>
     <w:p>
       <w:pPr>
         <w:pStyle w:val="ListBullet"/>
-        <w:spacing w:before="0" w:after="40" w:line="240" w:lineRule="auto"/>
       </w:pPr>
       <w:r>
-        <w:rPr>
-          <w:sz w:val="17"/>
-        </w:rPr>
         <w:t>State significant changes made to modified files.</w:t>
       </w:r>
     </w:p>
     <w:p>
       <w:pPr>
         <w:pStyle w:val="ListBullet"/>
-        <w:spacing w:before="0" w:after="40" w:line="240" w:lineRule="auto"/>
       </w:pPr>
       <w:r>
-        <w:rPr>
-          <w:sz w:val="17"/>
-        </w:rPr>
         <w:t>Retain applicable copyright, patent, trademark, attribution, and NOTICE information.</w:t>
       </w:r>
     </w:p>
     <w:p>
       <w:pPr>
         <w:pStyle w:val="ListBullet"/>
-        <w:spacing w:before="0" w:after="40" w:line="240" w:lineRule="auto"/>
       </w:pPr>
       <w:r>
-        <w:rPr>
-          <w:sz w:val="17"/>
-        </w:rPr>
         <w:t>Do not use project or contributor names and trademarks as an endorsement except as the license permits.</w:t>
       </w:r>
     </w:p>
     <w:p>
       <w:pPr>
         <w:pStyle w:val="Heading2"/>
-        <w:keepNext/>
-        <w:spacing w:before="100" w:after="40"/>
       </w:pPr>
       <w:r>
-        <w:rPr>
-          <w:sz w:val="21"/>
-        </w:rPr>
         <w:t>Warranty and liability</w:t>
       </w:r>
     </w:p>
     <w:p>
-      <w:pPr>
-        <w:spacing w:before="0" w:after="40" w:line="240" w:lineRule="auto"/>
-      </w:pPr>
       <w:r>
-        <w:rPr>
-          <w:sz w:val="17"/>
-        </w:rPr>
         <w:t>The licensed material is provided on an AS IS basis, without warranties or conditions of any kind. The complete Apache License 2.0 controls the warranty, liability, contribution, redistribution, and patent provisions.</w:t>
       </w:r>
     </w:p>
     <w:p>
       <w:pPr>
         <w:pStyle w:val="Heading2"/>
-        <w:keepNext/>
-        <w:spacing w:before="100" w:after="40"/>
       </w:pPr>
       <w:r>
-        <w:rPr>
-          <w:sz w:val="21"/>
-        </w:rPr>
         <w:t>Your applications and generated output</w:t>
       </w:r>
     </w:p>
     <w:p>
-      <w:pPr>
-        <w:spacing w:before="0" w:after="40" w:line="240" w:lineRule="auto"/>
-      </w:pPr>
       <w:r>
-        <w:rPr>
-          <w:sz w:val="17"/>
-        </w:rPr>
-        <w:t>Using the Studio does not transfer ownership of the Delphi application being translated. The application developer remains responsible for the license and distribution terms of the target application, translated content, generated language packs, and any third-party components. Studio runtime or component source included with a project remains subject to the Apache License 2.0 unless its file states different terms. Third-party software retains its own license.</w:t>
+        <w:t>Using the Studio does not transfer ownership of the Delphi application being translated. The application developer remains responsible for the license and distribution terms of the target application, translated content, generated language packs, and any third-party components.</w:t>
+      </w:r>
+    </w:p>
+    <w:p>
+      <w:r>
+        <w:t>Studio runtime or component source included with a project remains subject to the Apache License 2.0 unless its file states different terms. Third-party software retains its own license.</w:t>
       </w:r>
     </w:p>
     <w:p>
       <w:pPr>
         <w:pStyle w:val="Heading2"/>
-        <w:keepNext/>
-        <w:spacing w:before="100" w:after="40"/>
       </w:pPr>
       <w:r>
-        <w:rPr>
-          <w:sz w:val="21"/>
-        </w:rPr>
         <w:t>Full legal text</w:t>
       </w:r>
     </w:p>
     <w:p>
-      <w:pPr>
-        <w:spacing w:before="0" w:after="40" w:line="240" w:lineRule="auto"/>
-      </w:pPr>
       <w:r>
-        <w:rPr>
-          <w:sz w:val="17"/>
-        </w:rPr>
         <w:t>The complete controlling license is the LICENSE file in the repository and source distribution root. An official reference copy is available at https://www.apache.org/licenses/LICENSE-2.0. If this summary and the complete license differ, the complete Apache License 2.0 text controls.</w:t>
       </w:r>
     </w:p>
     <w:p>
-      <w:pPr>
-        <w:spacing w:before="0" w:after="40" w:line="240" w:lineRule="auto"/>
-        <w:ind w:left="360" w:right="360"/>
-      </w:pPr>
       <w:r>
-        <w:rPr>
-          <w:i/>
-          <w:sz w:val="17"/>
-        </w:rPr>
         <w:t>Licensed under the Apache License, Version 2.0 (the "License"); you may not use this work except in compliance with the License. Unless required by applicable law or agreed to in writing, software distributed under the License is distributed on an AS IS BASIS, WITHOUT WARRANTIES OR CONDITIONS OF ANY KIND, either express or implied.</w:t>
       </w:r>
     </w:p>

</xml_diff>

<commit_message>
Use approved App Translate branding in Wizard
</commit_message>
<xml_diff>
--- a/docs/guides/Delphi App Translation Studio Setup Wizard Guide.docx
+++ b/docs/guides/Delphi App Translation Studio Setup Wizard Guide.docx
@@ -2266,7 +2266,7 @@
               <a:graphicData uri="http://schemas.openxmlformats.org/drawingml/2006/picture">
                 <pic:pic>
                   <pic:nvPicPr>
-                    <pic:cNvPr id="0" name="tmpguwhrx5y.png"/>
+                    <pic:cNvPr id="0" name="tmp632ww961.png"/>
                     <pic:cNvPicPr/>
                   </pic:nvPicPr>
                   <pic:blipFill>
@@ -2312,7 +2312,7 @@
     </w:p>
     <w:p>
       <w:r>
-        <w:t>The header carries the DAT product mark, Delphi App Translation Studio name, and Vanguard Software family identity. These designer-owned brand controls identify the product consistently while remaining editable in the FMX Form Designer.</w:t>
+        <w:t>The header carries the genuine App Translate product icon from the project Images folder, the Delphi App Translation Studio name, and the Vanguard Software family identity. The icon is embedded in a designer-owned TImage so the same approved branding appears on every Wizard page without depending on an external file at runtime.</w:t>
       </w:r>
     </w:p>
     <w:p>
@@ -2588,7 +2588,7 @@
               <a:graphicData uri="http://schemas.openxmlformats.org/drawingml/2006/picture">
                 <pic:pic>
                   <pic:nvPicPr>
-                    <pic:cNvPr id="0" name="tmpvn3g0tq6.png"/>
+                    <pic:cNvPr id="0" name="tmpxe1a714m.png"/>
                     <pic:cNvPicPr/>
                   </pic:nvPicPr>
                   <pic:blipFill>
@@ -3057,7 +3057,7 @@
               <a:graphicData uri="http://schemas.openxmlformats.org/drawingml/2006/picture">
                 <pic:pic>
                   <pic:nvPicPr>
-                    <pic:cNvPr id="0" name="tmpzjdc_moe.png"/>
+                    <pic:cNvPr id="0" name="tmpixp5ilaw.png"/>
                     <pic:cNvPicPr/>
                   </pic:nvPicPr>
                   <pic:blipFill>
@@ -3450,7 +3450,7 @@
               <a:graphicData uri="http://schemas.openxmlformats.org/drawingml/2006/picture">
                 <pic:pic>
                   <pic:nvPicPr>
-                    <pic:cNvPr id="0" name="tmp4ccuuza4.png"/>
+                    <pic:cNvPr id="0" name="tmpneocoqo8.png"/>
                     <pic:cNvPicPr/>
                   </pic:nvPicPr>
                   <pic:blipFill>
@@ -3843,7 +3843,7 @@
               <a:graphicData uri="http://schemas.openxmlformats.org/drawingml/2006/picture">
                 <pic:pic>
                   <pic:nvPicPr>
-                    <pic:cNvPr id="0" name="tmprzvjp35m.png"/>
+                    <pic:cNvPr id="0" name="tmpvmvb3ijw.png"/>
                     <pic:cNvPicPr/>
                   </pic:nvPicPr>
                   <pic:blipFill>
@@ -4358,7 +4358,7 @@
               <a:graphicData uri="http://schemas.openxmlformats.org/drawingml/2006/picture">
                 <pic:pic>
                   <pic:nvPicPr>
-                    <pic:cNvPr id="0" name="tmpipatycio.png"/>
+                    <pic:cNvPr id="0" name="tmpqh59ud1t.png"/>
                     <pic:cNvPicPr/>
                   </pic:nvPicPr>
                   <pic:blipFill>

</xml_diff>

<commit_message>
Prepare delphitranslate GitHub Pages publication
</commit_message>
<xml_diff>
--- a/docs/guides/Delphi App Translation Studio Setup Wizard Guide.docx
+++ b/docs/guides/Delphi App Translation Studio Setup Wizard Guide.docx
@@ -112,7 +112,7 @@
         </w:rPr>
         <w:t>Version 1.0</w:t>
         <w:br/>
-        <w:t>Last changed: September 1, 2026</w:t>
+        <w:t>Last changed: September 3, 2026</w:t>
         <w:br/>
         <w:t>Windows • Delphi VCL and FireMonkey • Win32 and Win64</w:t>
       </w:r>
@@ -1498,7 +1498,7 @@
     </w:p>
     <w:p>
       <w:r>
-        <w:t>A few minutes of preparation makes the Wizard much easier to use. Complete the checks below once, then keep this section nearby as your setup checklist.</w:t>
+        <w:t>A few minutes of preparation makes the Wizard much easier to use. Complete the checks below once, then keep this section nearby as your setup checklist. The current Beta source ZIP and matching guides are published together at https://delphitranslate.github.io/downloads.html.</w:t>
       </w:r>
     </w:p>
     <w:p>
@@ -1518,7 +1518,7 @@
         </w:numPr>
       </w:pPr>
       <w:r>
-        <w:t>Download or clone the complete repository from https://github.com/tmartindub/DelphiAppTranslationStudio. Do not download isolated PAS, DPK, BPL, or JSON files.</w:t>
+        <w:t>Download or clone the complete repository from https://github.com/delphitranslate/delphitranslate.github.io. Do not download isolated PAS, DPK, BPL, or JSON files.</w:t>
       </w:r>
     </w:p>
     <w:p>

</xml_diff>